<commit_message>
kubernetes - intro updated
</commit_message>
<xml_diff>
--- a/Kubernetes/1-intro.docx
+++ b/Kubernetes/1-intro.docx
@@ -1,6 +1,6 @@
 
 <file path=word/document.xml><?xml version="1.0" encoding="utf-8"?>
-<w:document xmlns:wpc="http://schemas.microsoft.com/office/word/2010/wordprocessingCanvas" xmlns:cx="http://schemas.microsoft.com/office/drawing/2014/chartex" xmlns:cx1="http://schemas.microsoft.com/office/drawing/2015/9/8/chartex" xmlns:cx2="http://schemas.microsoft.com/office/drawing/2015/10/21/chartex" xmlns:cx3="http://schemas.microsoft.com/office/drawing/2016/5/9/chartex" xmlns:cx4="http://schemas.microsoft.com/office/drawing/2016/5/10/chartex" xmlns:cx5="http://schemas.microsoft.com/office/drawing/2016/5/11/chartex" xmlns:cx6="http://schemas.microsoft.com/office/drawing/2016/5/12/chartex" xmlns:cx7="http://schemas.microsoft.com/office/drawing/2016/5/13/chartex" xmlns:cx8="http://schemas.microsoft.com/office/drawing/2016/5/14/chartex" xmlns:mc="http://schemas.openxmlformats.org/markup-compatibility/2006" xmlns:aink="http://schemas.microsoft.com/office/drawing/2016/ink" xmlns:am3d="http://schemas.microsoft.com/office/drawing/2017/model3d" xmlns:o="urn:schemas-microsoft-com:office:office" xmlns:oel="http://schemas.microsoft.com/office/2019/extlst" xmlns:r="http://schemas.openxmlformats.org/officeDocument/2006/relationships" xmlns:m="http://schemas.openxmlformats.org/officeDocument/2006/math" xmlns:v="urn:schemas-microsoft-com:vml" xmlns:wp14="http://schemas.microsoft.com/office/word/2010/wordprocessingDrawing" xmlns:wp="http://schemas.openxmlformats.org/drawingml/2006/wordprocessingDrawing" xmlns:w10="urn:schemas-microsoft-com:office:word" xmlns:w="http://schemas.openxmlformats.org/wordprocessingml/2006/main" xmlns:w14="http://schemas.microsoft.com/office/word/2010/wordml" xmlns:w15="http://schemas.microsoft.com/office/word/2012/wordml" xmlns:w16cex="http://schemas.microsoft.com/office/word/2018/wordml/cex" xmlns:w16cid="http://schemas.microsoft.com/office/word/2016/wordml/cid" xmlns:w16="http://schemas.microsoft.com/office/word/2018/wordml" xmlns:w16du="http://schemas.microsoft.com/office/word/2023/wordml/word16du" xmlns:w16sdtdh="http://schemas.microsoft.com/office/word/2020/wordml/sdtdatahash" xmlns:w16sdtfl="http://schemas.microsoft.com/office/word/2024/wordml/sdtformatlock" xmlns:w16se="http://schemas.microsoft.com/office/word/2015/wordml/symex" xmlns:wpg="http://schemas.microsoft.com/office/word/2010/wordprocessingGroup" xmlns:wpi="http://schemas.microsoft.com/office/word/2010/wordprocessingInk" xmlns:wne="http://schemas.microsoft.com/office/word/2006/wordml" xmlns:wps="http://schemas.microsoft.com/office/word/2010/wordprocessingShape" mc:Ignorable="w14 w15 w16se w16cid w16 w16cex w16sdtdh w16sdtfl w16du wp14">
+<w:document xmlns:wpc="http://schemas.microsoft.com/office/word/2010/wordprocessingCanvas" xmlns:cx="http://schemas.microsoft.com/office/drawing/2014/chartex" xmlns:cx1="http://schemas.microsoft.com/office/drawing/2015/9/8/chartex" xmlns:cx2="http://schemas.microsoft.com/office/drawing/2015/10/21/chartex" xmlns:cx3="http://schemas.microsoft.com/office/drawing/2016/5/9/chartex" xmlns:cx4="http://schemas.microsoft.com/office/drawing/2016/5/10/chartex" xmlns:cx5="http://schemas.microsoft.com/office/drawing/2016/5/11/chartex" xmlns:cx6="http://schemas.microsoft.com/office/drawing/2016/5/12/chartex" xmlns:cx7="http://schemas.microsoft.com/office/drawing/2016/5/13/chartex" xmlns:cx8="http://schemas.microsoft.com/office/drawing/2016/5/14/chartex" xmlns:mc="http://schemas.openxmlformats.org/markup-compatibility/2006" xmlns:aink="http://schemas.microsoft.com/office/drawing/2016/ink" xmlns:am3d="http://schemas.microsoft.com/office/drawing/2017/model3d" xmlns:o="urn:schemas-microsoft-com:office:office" xmlns:oel="http://schemas.microsoft.com/office/2019/extlst" xmlns:r="http://schemas.openxmlformats.org/officeDocument/2006/relationships" xmlns:m="http://schemas.openxmlformats.org/officeDocument/2006/math" xmlns:v="urn:schemas-microsoft-com:vml" xmlns:wp14="http://schemas.microsoft.com/office/word/2010/wordprocessingDrawing" xmlns:wp="http://schemas.openxmlformats.org/drawingml/2006/wordprocessingDrawing" xmlns:w10="urn:schemas-microsoft-com:office:word" xmlns:w="http://schemas.openxmlformats.org/wordprocessingml/2006/main" xmlns:w14="http://schemas.microsoft.com/office/word/2010/wordml" xmlns:w15="http://schemas.microsoft.com/office/word/2012/wordml" xmlns:w16cex="http://schemas.microsoft.com/office/word/2018/wordml/cex" xmlns:w16cid="http://schemas.microsoft.com/office/word/2016/wordml/cid" xmlns:w16="http://schemas.microsoft.com/office/word/2018/wordml" xmlns:w16sdtdh="http://schemas.microsoft.com/office/word/2020/wordml/sdtdatahash" xmlns:w16se="http://schemas.microsoft.com/office/word/2015/wordml/symex" xmlns:wpg="http://schemas.microsoft.com/office/word/2010/wordprocessingGroup" xmlns:wpi="http://schemas.microsoft.com/office/word/2010/wordprocessingInk" xmlns:wne="http://schemas.microsoft.com/office/word/2006/wordml" xmlns:wps="http://schemas.microsoft.com/office/word/2010/wordprocessingShape" mc:Ignorable="w14 w15 w16se w16cid w16 w16cex w16sdtdh wp14">
   <w:body>
     <w:p>
       <w:pPr>
@@ -27,7 +27,7 @@
     </w:p>
     <w:p>
       <w:pPr>
-        <w:spacing w:after="120"/>
+        <w:spacing w:after="60"/>
         <w:jc w:val="both"/>
         <w:rPr>
           <w:rFonts w:asciiTheme="majorBidi" w:hAnsiTheme="majorBidi" w:cstheme="majorBidi"/>
@@ -170,6 +170,7 @@
     </w:p>
     <w:p>
       <w:pPr>
+        <w:spacing w:after="60"/>
         <w:jc w:val="both"/>
         <w:rPr>
           <w:rFonts w:asciiTheme="majorBidi" w:hAnsiTheme="majorBidi" w:cstheme="majorBidi"/>
@@ -202,7 +203,7 @@
     </w:p>
     <w:p>
       <w:pPr>
-        <w:spacing w:after="120"/>
+        <w:spacing w:after="60"/>
         <w:jc w:val="both"/>
         <w:rPr>
           <w:rFonts w:asciiTheme="majorBidi" w:hAnsiTheme="majorBidi" w:cstheme="majorBidi"/>
@@ -522,7 +523,7 @@
           <w:ilvl w:val="0"/>
           <w:numId w:val="1"/>
         </w:numPr>
-        <w:spacing w:after="120"/>
+        <w:spacing w:after="60"/>
         <w:ind w:left="360"/>
         <w:jc w:val="both"/>
         <w:rPr>
@@ -629,6 +630,7 @@
     </w:p>
     <w:p>
       <w:pPr>
+        <w:spacing w:after="120"/>
         <w:jc w:val="both"/>
         <w:rPr>
           <w:rFonts w:asciiTheme="majorBidi" w:hAnsiTheme="majorBidi" w:cstheme="majorBidi"/>
@@ -665,7 +667,7 @@
     </w:p>
     <w:p>
       <w:pPr>
-        <w:spacing w:after="120"/>
+        <w:spacing w:after="60"/>
         <w:jc w:val="both"/>
         <w:rPr>
           <w:rFonts w:asciiTheme="majorBidi" w:hAnsiTheme="majorBidi" w:cstheme="majorBidi"/>
@@ -698,7 +700,7 @@
     </w:p>
     <w:p>
       <w:pPr>
-        <w:spacing w:after="120"/>
+        <w:spacing w:after="60"/>
         <w:jc w:val="both"/>
         <w:rPr>
           <w:rFonts w:asciiTheme="majorBidi" w:hAnsiTheme="majorBidi" w:cstheme="majorBidi"/>
@@ -807,24 +809,6 @@
       <w:r>
         <w:rPr>
           <w:rFonts w:asciiTheme="majorBidi" w:hAnsiTheme="majorBidi" w:cstheme="majorBidi"/>
-          <w:sz w:val="28"/>
-          <w:szCs w:val="28"/>
-        </w:rPr>
-        <w:t>horizontal scaling of workloads</w:t>
-      </w:r>
-    </w:p>
-    <w:p>
-      <w:pPr>
-        <w:jc w:val="both"/>
-        <w:rPr>
-          <w:rFonts w:asciiTheme="majorBidi" w:hAnsiTheme="majorBidi" w:cstheme="majorBidi"/>
-          <w:sz w:val="28"/>
-          <w:szCs w:val="28"/>
-        </w:rPr>
-      </w:pPr>
-      <w:r>
-        <w:rPr>
-          <w:rFonts w:asciiTheme="majorBidi" w:hAnsiTheme="majorBidi" w:cstheme="majorBidi"/>
           <w:noProof/>
           <w:sz w:val="28"/>
           <w:szCs w:val="28"/>
@@ -832,16 +816,16 @@
         <mc:AlternateContent>
           <mc:Choice Requires="wps">
             <w:drawing>
-              <wp:anchor distT="0" distB="0" distL="114300" distR="114300" simplePos="0" relativeHeight="251659264" behindDoc="0" locked="0" layoutInCell="1" allowOverlap="1" wp14:anchorId="25B81E62" wp14:editId="0258F9B5">
+              <wp:anchor distT="0" distB="0" distL="114300" distR="114300" simplePos="0" relativeHeight="251659264" behindDoc="0" locked="0" layoutInCell="1" allowOverlap="1" wp14:anchorId="25B81E62" wp14:editId="5714B1E0">
                 <wp:simplePos x="0" y="0"/>
                 <wp:positionH relativeFrom="margin">
                   <wp:align>right</wp:align>
                 </wp:positionH>
                 <wp:positionV relativeFrom="paragraph">
-                  <wp:posOffset>8890</wp:posOffset>
+                  <wp:posOffset>289561</wp:posOffset>
                 </wp:positionV>
-                <wp:extent cx="6835140" cy="739140"/>
-                <wp:effectExtent l="0" t="0" r="22860" b="22860"/>
+                <wp:extent cx="6835140" cy="1076325"/>
+                <wp:effectExtent l="0" t="0" r="22860" b="28575"/>
                 <wp:wrapNone/>
                 <wp:docPr id="1912442330" name="Rectangle 1"/>
                 <wp:cNvGraphicFramePr/>
@@ -852,7 +836,7 @@
                       <wps:spPr>
                         <a:xfrm>
                           <a:off x="0" y="0"/>
-                          <a:ext cx="6835140" cy="739140"/>
+                          <a:ext cx="6835140" cy="1076325"/>
                         </a:xfrm>
                         <a:prstGeom prst="rect">
                           <a:avLst/>
@@ -876,6 +860,7 @@
                         <w:txbxContent>
                           <w:p>
                             <w:pPr>
+                              <w:spacing w:after="120"/>
                               <w:rPr>
                                 <w:rFonts w:asciiTheme="majorBidi" w:hAnsiTheme="majorBidi" w:cstheme="majorBidi"/>
                                 <w:b/>
@@ -897,6 +882,7 @@
                           </w:p>
                           <w:p>
                             <w:pPr>
+                              <w:spacing w:after="120"/>
                               <w:rPr>
                                 <w:rFonts w:asciiTheme="majorBidi" w:hAnsiTheme="majorBidi" w:cstheme="majorBidi"/>
                                 <w:sz w:val="28"/>
@@ -911,6 +897,44 @@
                               </w:rPr>
                               <w:t>We have 2 types of scaling:</w:t>
                             </w:r>
+                          </w:p>
+                          <w:p>
+                            <w:pPr>
+                              <w:pStyle w:val="ListParagraph"/>
+                              <w:numPr>
+                                <w:ilvl w:val="0"/>
+                                <w:numId w:val="3"/>
+                              </w:numPr>
+                              <w:spacing w:after="120"/>
+                              <w:ind w:left="360"/>
+                              <w:jc w:val="both"/>
+                              <w:rPr>
+                                <w:rFonts w:asciiTheme="majorBidi" w:hAnsiTheme="majorBidi" w:cstheme="majorBidi"/>
+                                <w:b/>
+                                <w:bCs/>
+                                <w:sz w:val="32"/>
+                                <w:szCs w:val="32"/>
+                              </w:rPr>
+                            </w:pPr>
+                            <w:r>
+                              <w:rPr>
+                                <w:rFonts w:asciiTheme="majorBidi" w:hAnsiTheme="majorBidi" w:cstheme="majorBidi"/>
+                                <w:b/>
+                                <w:bCs/>
+                                <w:sz w:val="32"/>
+                                <w:szCs w:val="32"/>
+                              </w:rPr>
+                              <w:t>Horizontal Scaling (Scaling Out / In)</w:t>
+                            </w:r>
+                          </w:p>
+                          <w:p>
+                            <w:pPr>
+                              <w:rPr>
+                                <w:rFonts w:asciiTheme="majorBidi" w:hAnsiTheme="majorBidi" w:cstheme="majorBidi"/>
+                                <w:sz w:val="28"/>
+                                <w:szCs w:val="28"/>
+                              </w:rPr>
+                            </w:pPr>
                           </w:p>
                         </w:txbxContent>
                       </wps:txbx>
@@ -934,7 +958,7 @@
           </mc:Choice>
           <mc:Fallback>
             <w:pict>
-              <v:rect w14:anchorId="25B81E62" id="Rectangle 1" o:spid="_x0000_s1026" style="position:absolute;left:0;text-align:left;margin-left:487pt;margin-top:.7pt;width:538.2pt;height:58.2pt;z-index:251659264;visibility:visible;mso-wrap-style:square;mso-width-percent:0;mso-height-percent:0;mso-wrap-distance-left:9pt;mso-wrap-distance-top:0;mso-wrap-distance-right:9pt;mso-wrap-distance-bottom:0;mso-position-horizontal:right;mso-position-horizontal-relative:margin;mso-position-vertical:absolute;mso-position-vertical-relative:text;mso-width-percent:0;mso-height-percent:0;mso-width-relative:margin;mso-height-relative:margin;v-text-anchor:middle" o:gfxdata="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" fillcolor="#555 [2160]" strokecolor="black [3200]" strokeweight=".5pt">
+              <v:rect w14:anchorId="25B81E62" id="Rectangle 1" o:spid="_x0000_s1026" style="position:absolute;left:0;text-align:left;margin-left:487pt;margin-top:22.8pt;width:538.2pt;height:84.75pt;z-index:251659264;visibility:visible;mso-wrap-style:square;mso-width-percent:0;mso-height-percent:0;mso-wrap-distance-left:9pt;mso-wrap-distance-top:0;mso-wrap-distance-right:9pt;mso-wrap-distance-bottom:0;mso-position-horizontal:right;mso-position-horizontal-relative:margin;mso-position-vertical:absolute;mso-position-vertical-relative:text;mso-width-percent:0;mso-height-percent:0;mso-width-relative:margin;mso-height-relative:margin;v-text-anchor:middle" o:gfxdata="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" fillcolor="#555 [2160]" strokecolor="black [3200]" strokeweight=".5pt">
                 <v:fill color2="#313131 [2608]" rotate="t" colors="0 #9b9b9b;.5 #8e8e8e;1 #797979" focus="100%" type="gradient">
                   <o:fill v:ext="view" type="gradientUnscaled"/>
                 </v:fill>
@@ -942,6 +966,7 @@
                   <w:txbxContent>
                     <w:p>
                       <w:pPr>
+                        <w:spacing w:after="120"/>
                         <w:rPr>
                           <w:rFonts w:asciiTheme="majorBidi" w:hAnsiTheme="majorBidi" w:cstheme="majorBidi"/>
                           <w:b/>
@@ -963,6 +988,7 @@
                     </w:p>
                     <w:p>
                       <w:pPr>
+                        <w:spacing w:after="120"/>
                         <w:rPr>
                           <w:rFonts w:asciiTheme="majorBidi" w:hAnsiTheme="majorBidi" w:cstheme="majorBidi"/>
                           <w:sz w:val="28"/>
@@ -977,6 +1003,44 @@
                         </w:rPr>
                         <w:t>We have 2 types of scaling:</w:t>
                       </w:r>
+                    </w:p>
+                    <w:p>
+                      <w:pPr>
+                        <w:pStyle w:val="ListParagraph"/>
+                        <w:numPr>
+                          <w:ilvl w:val="0"/>
+                          <w:numId w:val="3"/>
+                        </w:numPr>
+                        <w:spacing w:after="120"/>
+                        <w:ind w:left="360"/>
+                        <w:jc w:val="both"/>
+                        <w:rPr>
+                          <w:rFonts w:asciiTheme="majorBidi" w:hAnsiTheme="majorBidi" w:cstheme="majorBidi"/>
+                          <w:b/>
+                          <w:bCs/>
+                          <w:sz w:val="32"/>
+                          <w:szCs w:val="32"/>
+                        </w:rPr>
+                      </w:pPr>
+                      <w:r>
+                        <w:rPr>
+                          <w:rFonts w:asciiTheme="majorBidi" w:hAnsiTheme="majorBidi" w:cstheme="majorBidi"/>
+                          <w:b/>
+                          <w:bCs/>
+                          <w:sz w:val="32"/>
+                          <w:szCs w:val="32"/>
+                        </w:rPr>
+                        <w:t>Horizontal Scaling (Scaling Out / In)</w:t>
+                      </w:r>
+                    </w:p>
+                    <w:p>
+                      <w:pPr>
+                        <w:rPr>
+                          <w:rFonts w:asciiTheme="majorBidi" w:hAnsiTheme="majorBidi" w:cstheme="majorBidi"/>
+                          <w:sz w:val="28"/>
+                          <w:szCs w:val="28"/>
+                        </w:rPr>
+                      </w:pPr>
                     </w:p>
                   </w:txbxContent>
                 </v:textbox>
@@ -986,6 +1050,34 @@
           </mc:Fallback>
         </mc:AlternateContent>
       </w:r>
+      <w:r>
+        <w:rPr>
+          <w:rFonts w:asciiTheme="majorBidi" w:hAnsiTheme="majorBidi" w:cstheme="majorBidi"/>
+          <w:sz w:val="28"/>
+          <w:szCs w:val="28"/>
+        </w:rPr>
+        <w:t>horizontal scaling of workloads</w:t>
+      </w:r>
+    </w:p>
+    <w:p>
+      <w:pPr>
+        <w:jc w:val="both"/>
+        <w:rPr>
+          <w:rFonts w:asciiTheme="majorBidi" w:hAnsiTheme="majorBidi" w:cstheme="majorBidi"/>
+          <w:sz w:val="28"/>
+          <w:szCs w:val="28"/>
+        </w:rPr>
+      </w:pPr>
+    </w:p>
+    <w:p>
+      <w:pPr>
+        <w:jc w:val="both"/>
+        <w:rPr>
+          <w:rFonts w:asciiTheme="majorBidi" w:hAnsiTheme="majorBidi" w:cstheme="majorBidi"/>
+          <w:sz w:val="28"/>
+          <w:szCs w:val="28"/>
+        </w:rPr>
+      </w:pPr>
     </w:p>
     <w:p>
       <w:pPr>
@@ -1017,16 +1109,16 @@
         <mc:AlternateContent>
           <mc:Choice Requires="wps">
             <w:drawing>
-              <wp:anchor distT="0" distB="0" distL="114300" distR="114300" simplePos="0" relativeHeight="251661312" behindDoc="0" locked="0" layoutInCell="1" allowOverlap="1" wp14:anchorId="53433B31" wp14:editId="0C3BA250">
+              <wp:anchor distT="0" distB="0" distL="114300" distR="114300" simplePos="0" relativeHeight="251661312" behindDoc="0" locked="0" layoutInCell="1" allowOverlap="1" wp14:anchorId="53433B31" wp14:editId="61D1D4E1">
                 <wp:simplePos x="0" y="0"/>
                 <wp:positionH relativeFrom="margin">
                   <wp:align>right</wp:align>
                 </wp:positionH>
                 <wp:positionV relativeFrom="paragraph">
-                  <wp:posOffset>3175</wp:posOffset>
+                  <wp:posOffset>-4445</wp:posOffset>
                 </wp:positionV>
-                <wp:extent cx="6835140" cy="7597140"/>
-                <wp:effectExtent l="0" t="0" r="22860" b="22860"/>
+                <wp:extent cx="6835140" cy="7096125"/>
+                <wp:effectExtent l="0" t="0" r="22860" b="28575"/>
                 <wp:wrapNone/>
                 <wp:docPr id="1618488809" name="Rectangle 1"/>
                 <wp:cNvGraphicFramePr/>
@@ -1037,7 +1129,7 @@
                       <wps:spPr>
                         <a:xfrm>
                           <a:off x="0" y="0"/>
-                          <a:ext cx="6835140" cy="7597140"/>
+                          <a:ext cx="6835140" cy="7096125"/>
                         </a:xfrm>
                         <a:prstGeom prst="rect">
                           <a:avLst/>
@@ -1061,35 +1153,6 @@
                         <w:txbxContent>
                           <w:p>
                             <w:pPr>
-                              <w:pStyle w:val="ListParagraph"/>
-                              <w:numPr>
-                                <w:ilvl w:val="0"/>
-                                <w:numId w:val="3"/>
-                              </w:numPr>
-                              <w:spacing w:after="120"/>
-                              <w:ind w:left="360"/>
-                              <w:jc w:val="both"/>
-                              <w:rPr>
-                                <w:rFonts w:asciiTheme="majorBidi" w:hAnsiTheme="majorBidi" w:cstheme="majorBidi"/>
-                                <w:b/>
-                                <w:bCs/>
-                                <w:sz w:val="32"/>
-                                <w:szCs w:val="32"/>
-                              </w:rPr>
-                            </w:pPr>
-                            <w:r>
-                              <w:rPr>
-                                <w:rFonts w:asciiTheme="majorBidi" w:hAnsiTheme="majorBidi" w:cstheme="majorBidi"/>
-                                <w:b/>
-                                <w:bCs/>
-                                <w:sz w:val="32"/>
-                                <w:szCs w:val="32"/>
-                              </w:rPr>
-                              <w:t>Horizontal Scaling (Scaling Out / In)</w:t>
-                            </w:r>
-                          </w:p>
-                          <w:p>
-                            <w:pPr>
                               <w:spacing w:after="60"/>
                               <w:ind w:left="360"/>
                               <w:jc w:val="both"/>
@@ -1195,7 +1258,7 @@
                           </w:p>
                           <w:p>
                             <w:pPr>
-                              <w:spacing w:after="60"/>
+                              <w:spacing w:after="0"/>
                               <w:ind w:left="360"/>
                               <w:jc w:val="both"/>
                               <w:rPr>
@@ -1343,8 +1406,8 @@
                               <w:jc w:val="both"/>
                               <w:rPr>
                                 <w:rFonts w:asciiTheme="majorBidi" w:hAnsiTheme="majorBidi" w:cstheme="majorBidi"/>
-                                <w:sz w:val="12"/>
-                                <w:szCs w:val="12"/>
+                                <w:sz w:val="8"/>
+                                <w:szCs w:val="8"/>
                               </w:rPr>
                             </w:pPr>
                           </w:p>
@@ -1355,7 +1418,7 @@
                                 <w:ilvl w:val="0"/>
                                 <w:numId w:val="3"/>
                               </w:numPr>
-                              <w:spacing w:after="120"/>
+                              <w:spacing w:after="60"/>
                               <w:ind w:left="360"/>
                               <w:jc w:val="both"/>
                               <w:rPr>
@@ -1481,7 +1544,7 @@
                           </w:p>
                           <w:p>
                             <w:pPr>
-                              <w:spacing w:after="120"/>
+                              <w:spacing w:after="80"/>
                               <w:ind w:left="360"/>
                               <w:jc w:val="both"/>
                               <w:rPr>
@@ -1640,7 +1703,7 @@
                                 <w:ilvl w:val="0"/>
                                 <w:numId w:val="6"/>
                               </w:numPr>
-                              <w:spacing w:after="120"/>
+                              <w:spacing w:after="80"/>
                               <w:ind w:left="720"/>
                               <w:jc w:val="both"/>
                               <w:rPr>
@@ -1824,41 +1887,12 @@
           </mc:Choice>
           <mc:Fallback>
             <w:pict>
-              <v:rect w14:anchorId="53433B31" id="_x0000_s1027" style="position:absolute;left:0;text-align:left;margin-left:487pt;margin-top:.25pt;width:538.2pt;height:598.2pt;z-index:251661312;visibility:visible;mso-wrap-style:square;mso-width-percent:0;mso-height-percent:0;mso-wrap-distance-left:9pt;mso-wrap-distance-top:0;mso-wrap-distance-right:9pt;mso-wrap-distance-bottom:0;mso-position-horizontal:right;mso-position-horizontal-relative:margin;mso-position-vertical:absolute;mso-position-vertical-relative:text;mso-width-percent:0;mso-height-percent:0;mso-width-relative:margin;mso-height-relative:margin;v-text-anchor:middle" o:gfxdata="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" fillcolor="#555 [2160]" strokecolor="black [3200]" strokeweight=".5pt">
+              <v:rect w14:anchorId="53433B31" id="_x0000_s1027" style="position:absolute;left:0;text-align:left;margin-left:487pt;margin-top:-.35pt;width:538.2pt;height:558.75pt;z-index:251661312;visibility:visible;mso-wrap-style:square;mso-width-percent:0;mso-height-percent:0;mso-wrap-distance-left:9pt;mso-wrap-distance-top:0;mso-wrap-distance-right:9pt;mso-wrap-distance-bottom:0;mso-position-horizontal:right;mso-position-horizontal-relative:margin;mso-position-vertical:absolute;mso-position-vertical-relative:text;mso-width-percent:0;mso-height-percent:0;mso-width-relative:margin;mso-height-relative:margin;v-text-anchor:middle" o:gfxdata="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" fillcolor="#555 [2160]" strokecolor="black [3200]" strokeweight=".5pt">
                 <v:fill color2="#313131 [2608]" rotate="t" colors="0 #9b9b9b;.5 #8e8e8e;1 #797979" focus="100%" type="gradient">
                   <o:fill v:ext="view" type="gradientUnscaled"/>
                 </v:fill>
                 <v:textbox>
                   <w:txbxContent>
-                    <w:p>
-                      <w:pPr>
-                        <w:pStyle w:val="ListParagraph"/>
-                        <w:numPr>
-                          <w:ilvl w:val="0"/>
-                          <w:numId w:val="3"/>
-                        </w:numPr>
-                        <w:spacing w:after="120"/>
-                        <w:ind w:left="360"/>
-                        <w:jc w:val="both"/>
-                        <w:rPr>
-                          <w:rFonts w:asciiTheme="majorBidi" w:hAnsiTheme="majorBidi" w:cstheme="majorBidi"/>
-                          <w:b/>
-                          <w:bCs/>
-                          <w:sz w:val="32"/>
-                          <w:szCs w:val="32"/>
-                        </w:rPr>
-                      </w:pPr>
-                      <w:r>
-                        <w:rPr>
-                          <w:rFonts w:asciiTheme="majorBidi" w:hAnsiTheme="majorBidi" w:cstheme="majorBidi"/>
-                          <w:b/>
-                          <w:bCs/>
-                          <w:sz w:val="32"/>
-                          <w:szCs w:val="32"/>
-                        </w:rPr>
-                        <w:t>Horizontal Scaling (Scaling Out / In)</w:t>
-                      </w:r>
-                    </w:p>
                     <w:p>
                       <w:pPr>
                         <w:spacing w:after="60"/>
@@ -1966,7 +2000,7 @@
                     </w:p>
                     <w:p>
                       <w:pPr>
-                        <w:spacing w:after="60"/>
+                        <w:spacing w:after="0"/>
                         <w:ind w:left="360"/>
                         <w:jc w:val="both"/>
                         <w:rPr>
@@ -2114,8 +2148,8 @@
                         <w:jc w:val="both"/>
                         <w:rPr>
                           <w:rFonts w:asciiTheme="majorBidi" w:hAnsiTheme="majorBidi" w:cstheme="majorBidi"/>
-                          <w:sz w:val="12"/>
-                          <w:szCs w:val="12"/>
+                          <w:sz w:val="8"/>
+                          <w:szCs w:val="8"/>
                         </w:rPr>
                       </w:pPr>
                     </w:p>
@@ -2126,7 +2160,7 @@
                           <w:ilvl w:val="0"/>
                           <w:numId w:val="3"/>
                         </w:numPr>
-                        <w:spacing w:after="120"/>
+                        <w:spacing w:after="60"/>
                         <w:ind w:left="360"/>
                         <w:jc w:val="both"/>
                         <w:rPr>
@@ -2252,7 +2286,7 @@
                     </w:p>
                     <w:p>
                       <w:pPr>
-                        <w:spacing w:after="120"/>
+                        <w:spacing w:after="80"/>
                         <w:ind w:left="360"/>
                         <w:jc w:val="both"/>
                         <w:rPr>
@@ -2411,7 +2445,7 @@
                           <w:ilvl w:val="0"/>
                           <w:numId w:val="6"/>
                         </w:numPr>
-                        <w:spacing w:after="120"/>
+                        <w:spacing w:after="80"/>
                         <w:ind w:left="720"/>
                         <w:jc w:val="both"/>
                         <w:rPr>
@@ -2777,28 +2811,8 @@
         <w:jc w:val="both"/>
         <w:rPr>
           <w:rFonts w:asciiTheme="majorBidi" w:hAnsiTheme="majorBidi" w:cstheme="majorBidi"/>
-          <w:sz w:val="28"/>
-          <w:szCs w:val="28"/>
-        </w:rPr>
-      </w:pPr>
-    </w:p>
-    <w:p>
-      <w:pPr>
-        <w:jc w:val="both"/>
-        <w:rPr>
-          <w:rFonts w:asciiTheme="majorBidi" w:hAnsiTheme="majorBidi" w:cstheme="majorBidi"/>
-          <w:sz w:val="28"/>
-          <w:szCs w:val="28"/>
-        </w:rPr>
-      </w:pPr>
-    </w:p>
-    <w:p>
-      <w:pPr>
-        <w:jc w:val="both"/>
-        <w:rPr>
-          <w:rFonts w:asciiTheme="majorBidi" w:hAnsiTheme="majorBidi" w:cstheme="majorBidi"/>
-          <w:sz w:val="28"/>
-          <w:szCs w:val="28"/>
+          <w:sz w:val="36"/>
+          <w:szCs w:val="36"/>
         </w:rPr>
       </w:pPr>
     </w:p>
@@ -2822,7 +2836,7 @@
           <w:sz w:val="32"/>
           <w:szCs w:val="32"/>
         </w:rPr>
-        <w:t>Desired State</w:t>
+        <w:t xml:space="preserve">Desired State - </w:t>
       </w:r>
       <w:r>
         <w:rPr>
@@ -2832,7 +2846,7 @@
           <w:sz w:val="32"/>
           <w:szCs w:val="32"/>
         </w:rPr>
-        <w:t xml:space="preserve"> - </w:t>
+        <w:t>Kubernetes Core Idea</w:t>
       </w:r>
       <w:r>
         <w:rPr>
@@ -2842,9 +2856,131 @@
           <w:sz w:val="32"/>
           <w:szCs w:val="32"/>
         </w:rPr>
-        <w:t>Kubernetes Core Idea</w:t>
-      </w:r>
-      <w:r>
+        <w:t>:</w:t>
+      </w:r>
+    </w:p>
+    <w:p>
+      <w:pPr>
+        <w:spacing w:after="60"/>
+        <w:jc w:val="both"/>
+        <w:rPr>
+          <w:rFonts w:asciiTheme="majorBidi" w:hAnsiTheme="majorBidi" w:cstheme="majorBidi"/>
+          <w:sz w:val="28"/>
+          <w:szCs w:val="28"/>
+        </w:rPr>
+      </w:pPr>
+      <w:r>
+        <w:rPr>
+          <w:rFonts w:asciiTheme="majorBidi" w:hAnsiTheme="majorBidi" w:cstheme="majorBidi"/>
+          <w:sz w:val="28"/>
+          <w:szCs w:val="28"/>
+        </w:rPr>
+        <w:t>In Kubernetes, you declare the desired state of your system, and Kubernetes continuously works to make the actual state match it.</w:t>
+      </w:r>
+      <w:r>
+        <w:rPr>
+          <w:rFonts w:asciiTheme="majorBidi" w:hAnsiTheme="majorBidi" w:cstheme="majorBidi"/>
+          <w:sz w:val="28"/>
+          <w:szCs w:val="28"/>
+        </w:rPr>
+        <w:t xml:space="preserve"> For e</w:t>
+      </w:r>
+      <w:r>
+        <w:rPr>
+          <w:rFonts w:asciiTheme="majorBidi" w:hAnsiTheme="majorBidi" w:cstheme="majorBidi"/>
+          <w:sz w:val="28"/>
+          <w:szCs w:val="28"/>
+        </w:rPr>
+        <w:t>xample</w:t>
+      </w:r>
+      <w:r>
+        <w:rPr>
+          <w:rFonts w:asciiTheme="majorBidi" w:hAnsiTheme="majorBidi" w:cstheme="majorBidi"/>
+          <w:sz w:val="28"/>
+          <w:szCs w:val="28"/>
+        </w:rPr>
+        <w:t>, y</w:t>
+      </w:r>
+      <w:r>
+        <w:rPr>
+          <w:rFonts w:asciiTheme="majorBidi" w:hAnsiTheme="majorBidi" w:cstheme="majorBidi"/>
+          <w:sz w:val="28"/>
+          <w:szCs w:val="28"/>
+        </w:rPr>
+        <w:t>ou declare:</w:t>
+      </w:r>
+    </w:p>
+    <w:p>
+      <w:pPr>
+        <w:spacing w:after="120"/>
+        <w:jc w:val="both"/>
+        <w:rPr>
+          <w:rFonts w:asciiTheme="majorBidi" w:hAnsiTheme="majorBidi" w:cstheme="majorBidi"/>
+          <w:sz w:val="28"/>
+          <w:szCs w:val="28"/>
+        </w:rPr>
+      </w:pPr>
+      <w:r>
+        <w:rPr>
+          <w:rFonts w:asciiTheme="majorBidi" w:hAnsiTheme="majorBidi" w:cstheme="majorBidi"/>
+          <w:sz w:val="28"/>
+          <w:szCs w:val="28"/>
+        </w:rPr>
+        <w:t>run 3 replicas of an API container</w:t>
+      </w:r>
+      <w:r>
+        <w:rPr>
+          <w:rFonts w:asciiTheme="majorBidi" w:hAnsiTheme="majorBidi" w:cstheme="majorBidi"/>
+          <w:sz w:val="28"/>
+          <w:szCs w:val="28"/>
+        </w:rPr>
+        <w:t xml:space="preserve"> </w:t>
+      </w:r>
+      <w:r>
+        <w:rPr>
+          <w:rFonts w:asciiTheme="majorBidi" w:hAnsiTheme="majorBidi" w:cstheme="majorBidi"/>
+          <w:sz w:val="28"/>
+          <w:szCs w:val="28"/>
+        </w:rPr>
+        <w:t>→</w:t>
+      </w:r>
+      <w:r>
+        <w:rPr>
+          <w:rFonts w:asciiTheme="majorBidi" w:hAnsiTheme="majorBidi" w:cstheme="majorBidi"/>
+          <w:sz w:val="28"/>
+          <w:szCs w:val="28"/>
+        </w:rPr>
+        <w:t xml:space="preserve"> </w:t>
+      </w:r>
+      <w:r>
+        <w:rPr>
+          <w:rFonts w:asciiTheme="majorBidi" w:hAnsiTheme="majorBidi" w:cstheme="majorBidi"/>
+          <w:sz w:val="28"/>
+          <w:szCs w:val="28"/>
+        </w:rPr>
+        <w:t>If one crashes, Kubernetes automatically creates another one to maintain the desired state.</w:t>
+      </w:r>
+      <w:r>
+        <w:rPr>
+          <w:rFonts w:asciiTheme="majorBidi" w:hAnsiTheme="majorBidi" w:cstheme="majorBidi"/>
+          <w:sz w:val="28"/>
+          <w:szCs w:val="28"/>
+        </w:rPr>
+        <w:t xml:space="preserve"> </w:t>
+      </w:r>
+      <w:r>
+        <w:rPr>
+          <w:rFonts w:asciiTheme="majorBidi" w:hAnsiTheme="majorBidi" w:cstheme="majorBidi"/>
+          <w:sz w:val="28"/>
+          <w:szCs w:val="28"/>
+        </w:rPr>
+        <w:t>This model is called declarative infrastructure.</w:t>
+      </w:r>
+    </w:p>
+    <w:p>
+      <w:pPr>
+        <w:spacing w:after="60"/>
+        <w:jc w:val="both"/>
         <w:rPr>
           <w:rFonts w:asciiTheme="majorBidi" w:hAnsiTheme="majorBidi" w:cstheme="majorBidi"/>
           <w:b/>
@@ -2852,129 +2988,8 @@
           <w:sz w:val="32"/>
           <w:szCs w:val="32"/>
         </w:rPr>
-        <w:t>:</w:t>
-      </w:r>
-    </w:p>
-    <w:p>
-      <w:pPr>
-        <w:spacing w:after="60"/>
-        <w:jc w:val="both"/>
-        <w:rPr>
-          <w:rFonts w:asciiTheme="majorBidi" w:hAnsiTheme="majorBidi" w:cstheme="majorBidi"/>
-          <w:sz w:val="28"/>
-          <w:szCs w:val="28"/>
-        </w:rPr>
-      </w:pPr>
-      <w:r>
-        <w:rPr>
-          <w:rFonts w:asciiTheme="majorBidi" w:hAnsiTheme="majorBidi" w:cstheme="majorBidi"/>
-          <w:sz w:val="28"/>
-          <w:szCs w:val="28"/>
-        </w:rPr>
-        <w:t>In Kubernetes, you declare the desired state of your system, and Kubernetes continuously works to make the actual state match it.</w:t>
-      </w:r>
-      <w:r>
-        <w:rPr>
-          <w:rFonts w:asciiTheme="majorBidi" w:hAnsiTheme="majorBidi" w:cstheme="majorBidi"/>
-          <w:sz w:val="28"/>
-          <w:szCs w:val="28"/>
-        </w:rPr>
-        <w:t xml:space="preserve"> For e</w:t>
-      </w:r>
-      <w:r>
-        <w:rPr>
-          <w:rFonts w:asciiTheme="majorBidi" w:hAnsiTheme="majorBidi" w:cstheme="majorBidi"/>
-          <w:sz w:val="28"/>
-          <w:szCs w:val="28"/>
-        </w:rPr>
-        <w:t>xample</w:t>
-      </w:r>
-      <w:r>
-        <w:rPr>
-          <w:rFonts w:asciiTheme="majorBidi" w:hAnsiTheme="majorBidi" w:cstheme="majorBidi"/>
-          <w:sz w:val="28"/>
-          <w:szCs w:val="28"/>
-        </w:rPr>
-        <w:t>, y</w:t>
-      </w:r>
-      <w:r>
-        <w:rPr>
-          <w:rFonts w:asciiTheme="majorBidi" w:hAnsiTheme="majorBidi" w:cstheme="majorBidi"/>
-          <w:sz w:val="28"/>
-          <w:szCs w:val="28"/>
-        </w:rPr>
-        <w:t>ou declare:</w:t>
-      </w:r>
-    </w:p>
-    <w:p>
-      <w:pPr>
-        <w:jc w:val="both"/>
-        <w:rPr>
-          <w:rFonts w:asciiTheme="majorBidi" w:hAnsiTheme="majorBidi" w:cstheme="majorBidi"/>
-          <w:sz w:val="28"/>
-          <w:szCs w:val="28"/>
-        </w:rPr>
-      </w:pPr>
-      <w:r>
-        <w:rPr>
-          <w:rFonts w:asciiTheme="majorBidi" w:hAnsiTheme="majorBidi" w:cstheme="majorBidi"/>
-          <w:sz w:val="28"/>
-          <w:szCs w:val="28"/>
-        </w:rPr>
-        <w:t>run 3 replicas of an API container</w:t>
-      </w:r>
-      <w:r>
-        <w:rPr>
-          <w:rFonts w:asciiTheme="majorBidi" w:hAnsiTheme="majorBidi" w:cstheme="majorBidi"/>
-          <w:sz w:val="28"/>
-          <w:szCs w:val="28"/>
-        </w:rPr>
-        <w:t xml:space="preserve"> </w:t>
-      </w:r>
-      <w:r>
-        <w:rPr>
-          <w:rFonts w:asciiTheme="majorBidi" w:hAnsiTheme="majorBidi" w:cstheme="majorBidi"/>
-          <w:sz w:val="28"/>
-          <w:szCs w:val="28"/>
-        </w:rPr>
-        <w:t>→</w:t>
-      </w:r>
-      <w:r>
-        <w:rPr>
-          <w:rFonts w:asciiTheme="majorBidi" w:hAnsiTheme="majorBidi" w:cstheme="majorBidi"/>
-          <w:sz w:val="28"/>
-          <w:szCs w:val="28"/>
-        </w:rPr>
-        <w:t xml:space="preserve"> </w:t>
-      </w:r>
-      <w:r>
-        <w:rPr>
-          <w:rFonts w:asciiTheme="majorBidi" w:hAnsiTheme="majorBidi" w:cstheme="majorBidi"/>
-          <w:sz w:val="28"/>
-          <w:szCs w:val="28"/>
-        </w:rPr>
-        <w:t>If one crashes, Kubernetes automatically creates another one to maintain the desired state.</w:t>
-      </w:r>
-      <w:r>
-        <w:rPr>
-          <w:rFonts w:asciiTheme="majorBidi" w:hAnsiTheme="majorBidi" w:cstheme="majorBidi"/>
-          <w:sz w:val="28"/>
-          <w:szCs w:val="28"/>
-        </w:rPr>
-        <w:t xml:space="preserve"> </w:t>
-      </w:r>
-      <w:r>
-        <w:rPr>
-          <w:rFonts w:asciiTheme="majorBidi" w:hAnsiTheme="majorBidi" w:cstheme="majorBidi"/>
-          <w:sz w:val="28"/>
-          <w:szCs w:val="28"/>
-        </w:rPr>
-        <w:t>This model is called declarative infrastructure.</w:t>
-      </w:r>
-    </w:p>
-    <w:p>
-      <w:pPr>
-        <w:jc w:val="both"/>
+      </w:pPr>
+      <w:r>
         <w:rPr>
           <w:rFonts w:asciiTheme="majorBidi" w:hAnsiTheme="majorBidi" w:cstheme="majorBidi"/>
           <w:b/>
@@ -2982,7 +2997,8 @@
           <w:sz w:val="32"/>
           <w:szCs w:val="32"/>
         </w:rPr>
-      </w:pPr>
+        <w:t>Kubernetes Objects</w:t>
+      </w:r>
       <w:r>
         <w:rPr>
           <w:rFonts w:asciiTheme="majorBidi" w:hAnsiTheme="majorBidi" w:cstheme="majorBidi"/>
@@ -2991,22 +3007,12 @@
           <w:sz w:val="32"/>
           <w:szCs w:val="32"/>
         </w:rPr>
-        <w:lastRenderedPageBreak/>
-        <w:t>Kubernetes Objects</w:t>
-      </w:r>
-      <w:r>
-        <w:rPr>
-          <w:rFonts w:asciiTheme="majorBidi" w:hAnsiTheme="majorBidi" w:cstheme="majorBidi"/>
-          <w:b/>
-          <w:bCs/>
-          <w:sz w:val="32"/>
-          <w:szCs w:val="32"/>
-        </w:rPr>
         <w:t>:</w:t>
       </w:r>
     </w:p>
     <w:p>
       <w:pPr>
+        <w:spacing w:after="60"/>
         <w:jc w:val="both"/>
         <w:rPr>
           <w:rFonts w:asciiTheme="majorBidi" w:hAnsiTheme="majorBidi" w:cstheme="majorBidi"/>
@@ -3060,6 +3066,7 @@
           <w:sz w:val="28"/>
           <w:szCs w:val="28"/>
         </w:rPr>
+        <w:lastRenderedPageBreak/>
         <w:t>Pods</w:t>
       </w:r>
     </w:p>
@@ -3168,6 +3175,7 @@
           <w:ilvl w:val="0"/>
           <w:numId w:val="8"/>
         </w:numPr>
+        <w:spacing w:after="60"/>
         <w:ind w:left="360"/>
         <w:jc w:val="both"/>
         <w:rPr>
@@ -3214,7 +3222,7 @@
 </file>
 
 <file path=word/numbering.xml><?xml version="1.0" encoding="utf-8"?>
-<w:numbering xmlns:wpc="http://schemas.microsoft.com/office/word/2010/wordprocessingCanvas" xmlns:cx="http://schemas.microsoft.com/office/drawing/2014/chartex" xmlns:cx1="http://schemas.microsoft.com/office/drawing/2015/9/8/chartex" xmlns:cx2="http://schemas.microsoft.com/office/drawing/2015/10/21/chartex" xmlns:cx3="http://schemas.microsoft.com/office/drawing/2016/5/9/chartex" xmlns:cx4="http://schemas.microsoft.com/office/drawing/2016/5/10/chartex" xmlns:cx5="http://schemas.microsoft.com/office/drawing/2016/5/11/chartex" xmlns:cx6="http://schemas.microsoft.com/office/drawing/2016/5/12/chartex" xmlns:cx7="http://schemas.microsoft.com/office/drawing/2016/5/13/chartex" xmlns:cx8="http://schemas.microsoft.com/office/drawing/2016/5/14/chartex" xmlns:mc="http://schemas.openxmlformats.org/markup-compatibility/2006" xmlns:aink="http://schemas.microsoft.com/office/drawing/2016/ink" xmlns:am3d="http://schemas.microsoft.com/office/drawing/2017/model3d" xmlns:o="urn:schemas-microsoft-com:office:office" xmlns:oel="http://schemas.microsoft.com/office/2019/extlst" xmlns:r="http://schemas.openxmlformats.org/officeDocument/2006/relationships" xmlns:m="http://schemas.openxmlformats.org/officeDocument/2006/math" xmlns:v="urn:schemas-microsoft-com:vml" xmlns:wp14="http://schemas.microsoft.com/office/word/2010/wordprocessingDrawing" xmlns:wp="http://schemas.openxmlformats.org/drawingml/2006/wordprocessingDrawing" xmlns:w10="urn:schemas-microsoft-com:office:word" xmlns:w="http://schemas.openxmlformats.org/wordprocessingml/2006/main" xmlns:w14="http://schemas.microsoft.com/office/word/2010/wordml" xmlns:w15="http://schemas.microsoft.com/office/word/2012/wordml" xmlns:w16cex="http://schemas.microsoft.com/office/word/2018/wordml/cex" xmlns:w16cid="http://schemas.microsoft.com/office/word/2016/wordml/cid" xmlns:w16="http://schemas.microsoft.com/office/word/2018/wordml" xmlns:w16du="http://schemas.microsoft.com/office/word/2023/wordml/word16du" xmlns:w16sdtdh="http://schemas.microsoft.com/office/word/2020/wordml/sdtdatahash" xmlns:w16sdtfl="http://schemas.microsoft.com/office/word/2024/wordml/sdtformatlock" xmlns:w16se="http://schemas.microsoft.com/office/word/2015/wordml/symex" xmlns:wpg="http://schemas.microsoft.com/office/word/2010/wordprocessingGroup" xmlns:wpi="http://schemas.microsoft.com/office/word/2010/wordprocessingInk" xmlns:wne="http://schemas.microsoft.com/office/word/2006/wordml" xmlns:wps="http://schemas.microsoft.com/office/word/2010/wordprocessingShape" mc:Ignorable="w14 w15 w16se w16cid w16 w16cex w16sdtdh w16sdtfl w16du wp14">
+<w:numbering xmlns:wpc="http://schemas.microsoft.com/office/word/2010/wordprocessingCanvas" xmlns:cx="http://schemas.microsoft.com/office/drawing/2014/chartex" xmlns:cx1="http://schemas.microsoft.com/office/drawing/2015/9/8/chartex" xmlns:cx2="http://schemas.microsoft.com/office/drawing/2015/10/21/chartex" xmlns:cx3="http://schemas.microsoft.com/office/drawing/2016/5/9/chartex" xmlns:cx4="http://schemas.microsoft.com/office/drawing/2016/5/10/chartex" xmlns:cx5="http://schemas.microsoft.com/office/drawing/2016/5/11/chartex" xmlns:cx6="http://schemas.microsoft.com/office/drawing/2016/5/12/chartex" xmlns:cx7="http://schemas.microsoft.com/office/drawing/2016/5/13/chartex" xmlns:cx8="http://schemas.microsoft.com/office/drawing/2016/5/14/chartex" xmlns:mc="http://schemas.openxmlformats.org/markup-compatibility/2006" xmlns:aink="http://schemas.microsoft.com/office/drawing/2016/ink" xmlns:am3d="http://schemas.microsoft.com/office/drawing/2017/model3d" xmlns:o="urn:schemas-microsoft-com:office:office" xmlns:oel="http://schemas.microsoft.com/office/2019/extlst" xmlns:r="http://schemas.openxmlformats.org/officeDocument/2006/relationships" xmlns:m="http://schemas.openxmlformats.org/officeDocument/2006/math" xmlns:v="urn:schemas-microsoft-com:vml" xmlns:wp14="http://schemas.microsoft.com/office/word/2010/wordprocessingDrawing" xmlns:wp="http://schemas.openxmlformats.org/drawingml/2006/wordprocessingDrawing" xmlns:w10="urn:schemas-microsoft-com:office:word" xmlns:w="http://schemas.openxmlformats.org/wordprocessingml/2006/main" xmlns:w14="http://schemas.microsoft.com/office/word/2010/wordml" xmlns:w15="http://schemas.microsoft.com/office/word/2012/wordml" xmlns:w16cex="http://schemas.microsoft.com/office/word/2018/wordml/cex" xmlns:w16cid="http://schemas.microsoft.com/office/word/2016/wordml/cid" xmlns:w16="http://schemas.microsoft.com/office/word/2018/wordml" xmlns:w16sdtdh="http://schemas.microsoft.com/office/word/2020/wordml/sdtdatahash" xmlns:w16se="http://schemas.microsoft.com/office/word/2015/wordml/symex" xmlns:wpg="http://schemas.microsoft.com/office/word/2010/wordprocessingGroup" xmlns:wpi="http://schemas.microsoft.com/office/word/2010/wordprocessingInk" xmlns:wne="http://schemas.microsoft.com/office/word/2006/wordml" xmlns:wps="http://schemas.microsoft.com/office/word/2010/wordprocessingShape" mc:Ignorable="w14 w15 w16se w16cid w16 w16cex w16sdtdh wp14">
   <w:abstractNum w:abstractNumId="0" w15:restartNumberingAfterBreak="0">
     <w:nsid w:val="0D7E4292"/>
     <w:multiLevelType w:val="hybridMultilevel"/>
@@ -4093,7 +4101,7 @@
 </file>
 
 <file path=word/styles.xml><?xml version="1.0" encoding="utf-8"?>
-<w:styles xmlns:mc="http://schemas.openxmlformats.org/markup-compatibility/2006" xmlns:r="http://schemas.openxmlformats.org/officeDocument/2006/relationships" xmlns:w="http://schemas.openxmlformats.org/wordprocessingml/2006/main" xmlns:w14="http://schemas.microsoft.com/office/word/2010/wordml" xmlns:w15="http://schemas.microsoft.com/office/word/2012/wordml" xmlns:w16cex="http://schemas.microsoft.com/office/word/2018/wordml/cex" xmlns:w16cid="http://schemas.microsoft.com/office/word/2016/wordml/cid" xmlns:w16="http://schemas.microsoft.com/office/word/2018/wordml" xmlns:w16du="http://schemas.microsoft.com/office/word/2023/wordml/word16du" xmlns:w16sdtdh="http://schemas.microsoft.com/office/word/2020/wordml/sdtdatahash" xmlns:w16sdtfl="http://schemas.microsoft.com/office/word/2024/wordml/sdtformatlock" xmlns:w16se="http://schemas.microsoft.com/office/word/2015/wordml/symex" mc:Ignorable="w14 w15 w16se w16cid w16 w16cex w16sdtdh w16sdtfl w16du">
+<w:styles xmlns:mc="http://schemas.openxmlformats.org/markup-compatibility/2006" xmlns:r="http://schemas.openxmlformats.org/officeDocument/2006/relationships" xmlns:w="http://schemas.openxmlformats.org/wordprocessingml/2006/main" xmlns:w14="http://schemas.microsoft.com/office/word/2010/wordml" xmlns:w15="http://schemas.microsoft.com/office/word/2012/wordml" xmlns:w16cex="http://schemas.microsoft.com/office/word/2018/wordml/cex" xmlns:w16cid="http://schemas.microsoft.com/office/word/2016/wordml/cid" xmlns:w16="http://schemas.microsoft.com/office/word/2018/wordml" xmlns:w16sdtdh="http://schemas.microsoft.com/office/word/2020/wordml/sdtdatahash" xmlns:w16se="http://schemas.microsoft.com/office/word/2015/wordml/symex" mc:Ignorable="w14 w15 w16se w16cid w16 w16cex w16sdtdh">
   <w:docDefaults>
     <w:rPrDefault>
       <w:rPr>

</xml_diff>

<commit_message>
Kubernetes - intro updated
</commit_message>
<xml_diff>
--- a/Kubernetes/1-intro.docx
+++ b/Kubernetes/1-intro.docx
@@ -1,10 +1,10 @@
 
 <file path=word/document.xml><?xml version="1.0" encoding="utf-8"?>
-<w:document xmlns:wpc="http://schemas.microsoft.com/office/word/2010/wordprocessingCanvas" xmlns:cx="http://schemas.microsoft.com/office/drawing/2014/chartex" xmlns:cx1="http://schemas.microsoft.com/office/drawing/2015/9/8/chartex" xmlns:cx2="http://schemas.microsoft.com/office/drawing/2015/10/21/chartex" xmlns:cx3="http://schemas.microsoft.com/office/drawing/2016/5/9/chartex" xmlns:cx4="http://schemas.microsoft.com/office/drawing/2016/5/10/chartex" xmlns:cx5="http://schemas.microsoft.com/office/drawing/2016/5/11/chartex" xmlns:cx6="http://schemas.microsoft.com/office/drawing/2016/5/12/chartex" xmlns:cx7="http://schemas.microsoft.com/office/drawing/2016/5/13/chartex" xmlns:cx8="http://schemas.microsoft.com/office/drawing/2016/5/14/chartex" xmlns:mc="http://schemas.openxmlformats.org/markup-compatibility/2006" xmlns:aink="http://schemas.microsoft.com/office/drawing/2016/ink" xmlns:am3d="http://schemas.microsoft.com/office/drawing/2017/model3d" xmlns:o="urn:schemas-microsoft-com:office:office" xmlns:oel="http://schemas.microsoft.com/office/2019/extlst" xmlns:r="http://schemas.openxmlformats.org/officeDocument/2006/relationships" xmlns:m="http://schemas.openxmlformats.org/officeDocument/2006/math" xmlns:v="urn:schemas-microsoft-com:vml" xmlns:wp14="http://schemas.microsoft.com/office/word/2010/wordprocessingDrawing" xmlns:wp="http://schemas.openxmlformats.org/drawingml/2006/wordprocessingDrawing" xmlns:w10="urn:schemas-microsoft-com:office:word" xmlns:w="http://schemas.openxmlformats.org/wordprocessingml/2006/main" xmlns:w14="http://schemas.microsoft.com/office/word/2010/wordml" xmlns:w15="http://schemas.microsoft.com/office/word/2012/wordml" xmlns:w16cex="http://schemas.microsoft.com/office/word/2018/wordml/cex" xmlns:w16cid="http://schemas.microsoft.com/office/word/2016/wordml/cid" xmlns:w16="http://schemas.microsoft.com/office/word/2018/wordml" xmlns:w16sdtdh="http://schemas.microsoft.com/office/word/2020/wordml/sdtdatahash" xmlns:w16se="http://schemas.microsoft.com/office/word/2015/wordml/symex" xmlns:wpg="http://schemas.microsoft.com/office/word/2010/wordprocessingGroup" xmlns:wpi="http://schemas.microsoft.com/office/word/2010/wordprocessingInk" xmlns:wne="http://schemas.microsoft.com/office/word/2006/wordml" xmlns:wps="http://schemas.microsoft.com/office/word/2010/wordprocessingShape" mc:Ignorable="w14 w15 w16se w16cid w16 w16cex w16sdtdh wp14">
+<w:document xmlns:wpc="http://schemas.microsoft.com/office/word/2010/wordprocessingCanvas" xmlns:cx="http://schemas.microsoft.com/office/drawing/2014/chartex" xmlns:cx1="http://schemas.microsoft.com/office/drawing/2015/9/8/chartex" xmlns:cx2="http://schemas.microsoft.com/office/drawing/2015/10/21/chartex" xmlns:cx3="http://schemas.microsoft.com/office/drawing/2016/5/9/chartex" xmlns:cx4="http://schemas.microsoft.com/office/drawing/2016/5/10/chartex" xmlns:cx5="http://schemas.microsoft.com/office/drawing/2016/5/11/chartex" xmlns:cx6="http://schemas.microsoft.com/office/drawing/2016/5/12/chartex" xmlns:cx7="http://schemas.microsoft.com/office/drawing/2016/5/13/chartex" xmlns:cx8="http://schemas.microsoft.com/office/drawing/2016/5/14/chartex" xmlns:mc="http://schemas.openxmlformats.org/markup-compatibility/2006" xmlns:aink="http://schemas.microsoft.com/office/drawing/2016/ink" xmlns:am3d="http://schemas.microsoft.com/office/drawing/2017/model3d" xmlns:o="urn:schemas-microsoft-com:office:office" xmlns:oel="http://schemas.microsoft.com/office/2019/extlst" xmlns:r="http://schemas.openxmlformats.org/officeDocument/2006/relationships" xmlns:m="http://schemas.openxmlformats.org/officeDocument/2006/math" xmlns:v="urn:schemas-microsoft-com:vml" xmlns:wp14="http://schemas.microsoft.com/office/word/2010/wordprocessingDrawing" xmlns:wp="http://schemas.openxmlformats.org/drawingml/2006/wordprocessingDrawing" xmlns:w10="urn:schemas-microsoft-com:office:word" xmlns:w="http://schemas.openxmlformats.org/wordprocessingml/2006/main" xmlns:w14="http://schemas.microsoft.com/office/word/2010/wordml" xmlns:w15="http://schemas.microsoft.com/office/word/2012/wordml" xmlns:w16cex="http://schemas.microsoft.com/office/word/2018/wordml/cex" xmlns:w16cid="http://schemas.microsoft.com/office/word/2016/wordml/cid" xmlns:w16="http://schemas.microsoft.com/office/word/2018/wordml" xmlns:w16du="http://schemas.microsoft.com/office/word/2023/wordml/word16du" xmlns:w16sdtdh="http://schemas.microsoft.com/office/word/2020/wordml/sdtdatahash" xmlns:w16sdtfl="http://schemas.microsoft.com/office/word/2024/wordml/sdtformatlock" xmlns:w16se="http://schemas.microsoft.com/office/word/2015/wordml/symex" xmlns:wpg="http://schemas.microsoft.com/office/word/2010/wordprocessingGroup" xmlns:wpi="http://schemas.microsoft.com/office/word/2010/wordprocessingInk" xmlns:wne="http://schemas.microsoft.com/office/word/2006/wordml" xmlns:wps="http://schemas.microsoft.com/office/word/2010/wordprocessingShape" mc:Ignorable="w14 w15 w16se w16cid w16 w16cex w16sdtdh w16sdtfl w16du wp14">
   <w:body>
     <w:p>
       <w:pPr>
-        <w:spacing w:after="120"/>
+        <w:spacing w:after="80"/>
         <w:jc w:val="both"/>
         <w:rPr>
           <w:rFonts w:asciiTheme="majorBidi" w:hAnsiTheme="majorBidi" w:cstheme="majorBidi"/>
@@ -882,7 +882,7 @@
                           </w:p>
                           <w:p>
                             <w:pPr>
-                              <w:spacing w:after="120"/>
+                              <w:spacing w:after="80"/>
                               <w:rPr>
                                 <w:rFonts w:asciiTheme="majorBidi" w:hAnsiTheme="majorBidi" w:cstheme="majorBidi"/>
                                 <w:sz w:val="28"/>
@@ -988,7 +988,7 @@
                     </w:p>
                     <w:p>
                       <w:pPr>
-                        <w:spacing w:after="120"/>
+                        <w:spacing w:after="80"/>
                         <w:rPr>
                           <w:rFonts w:asciiTheme="majorBidi" w:hAnsiTheme="majorBidi" w:cstheme="majorBidi"/>
                           <w:sz w:val="28"/>
@@ -1109,7 +1109,7 @@
         <mc:AlternateContent>
           <mc:Choice Requires="wps">
             <w:drawing>
-              <wp:anchor distT="0" distB="0" distL="114300" distR="114300" simplePos="0" relativeHeight="251661312" behindDoc="0" locked="0" layoutInCell="1" allowOverlap="1" wp14:anchorId="53433B31" wp14:editId="61D1D4E1">
+              <wp:anchor distT="0" distB="0" distL="114300" distR="114300" simplePos="0" relativeHeight="251661312" behindDoc="0" locked="0" layoutInCell="1" allowOverlap="1" wp14:anchorId="53433B31" wp14:editId="28C5EC12">
                 <wp:simplePos x="0" y="0"/>
                 <wp:positionH relativeFrom="margin">
                   <wp:align>right</wp:align>
@@ -1117,8 +1117,8 @@
                 <wp:positionV relativeFrom="paragraph">
                   <wp:posOffset>-4445</wp:posOffset>
                 </wp:positionV>
-                <wp:extent cx="6835140" cy="7096125"/>
-                <wp:effectExtent l="0" t="0" r="22860" b="28575"/>
+                <wp:extent cx="6835140" cy="7033260"/>
+                <wp:effectExtent l="0" t="0" r="22860" b="15240"/>
                 <wp:wrapNone/>
                 <wp:docPr id="1618488809" name="Rectangle 1"/>
                 <wp:cNvGraphicFramePr/>
@@ -1129,7 +1129,7 @@
                       <wps:spPr>
                         <a:xfrm>
                           <a:off x="0" y="0"/>
-                          <a:ext cx="6835140" cy="7096125"/>
+                          <a:ext cx="6835140" cy="7033260"/>
                         </a:xfrm>
                         <a:prstGeom prst="rect">
                           <a:avLst/>
@@ -1153,7 +1153,7 @@
                         <w:txbxContent>
                           <w:p>
                             <w:pPr>
-                              <w:spacing w:after="60"/>
+                              <w:spacing w:after="0"/>
                               <w:ind w:left="360"/>
                               <w:jc w:val="both"/>
                               <w:rPr>
@@ -1406,8 +1406,8 @@
                               <w:jc w:val="both"/>
                               <w:rPr>
                                 <w:rFonts w:asciiTheme="majorBidi" w:hAnsiTheme="majorBidi" w:cstheme="majorBidi"/>
-                                <w:sz w:val="8"/>
-                                <w:szCs w:val="8"/>
+                                <w:sz w:val="6"/>
+                                <w:szCs w:val="6"/>
                               </w:rPr>
                             </w:pPr>
                           </w:p>
@@ -1418,7 +1418,7 @@
                                 <w:ilvl w:val="0"/>
                                 <w:numId w:val="3"/>
                               </w:numPr>
-                              <w:spacing w:after="60"/>
+                              <w:spacing w:after="40"/>
                               <w:ind w:left="360"/>
                               <w:jc w:val="both"/>
                               <w:rPr>
@@ -1544,7 +1544,7 @@
                           </w:p>
                           <w:p>
                             <w:pPr>
-                              <w:spacing w:after="80"/>
+                              <w:spacing w:after="60"/>
                               <w:ind w:left="360"/>
                               <w:jc w:val="both"/>
                               <w:rPr>
@@ -1887,7 +1887,7 @@
           </mc:Choice>
           <mc:Fallback>
             <w:pict>
-              <v:rect w14:anchorId="53433B31" id="_x0000_s1027" style="position:absolute;left:0;text-align:left;margin-left:487pt;margin-top:-.35pt;width:538.2pt;height:558.75pt;z-index:251661312;visibility:visible;mso-wrap-style:square;mso-width-percent:0;mso-height-percent:0;mso-wrap-distance-left:9pt;mso-wrap-distance-top:0;mso-wrap-distance-right:9pt;mso-wrap-distance-bottom:0;mso-position-horizontal:right;mso-position-horizontal-relative:margin;mso-position-vertical:absolute;mso-position-vertical-relative:text;mso-width-percent:0;mso-height-percent:0;mso-width-relative:margin;mso-height-relative:margin;v-text-anchor:middle" o:gfxdata="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" fillcolor="#555 [2160]" strokecolor="black [3200]" strokeweight=".5pt">
+              <v:rect w14:anchorId="53433B31" id="_x0000_s1027" style="position:absolute;left:0;text-align:left;margin-left:487pt;margin-top:-.35pt;width:538.2pt;height:553.8pt;z-index:251661312;visibility:visible;mso-wrap-style:square;mso-width-percent:0;mso-height-percent:0;mso-wrap-distance-left:9pt;mso-wrap-distance-top:0;mso-wrap-distance-right:9pt;mso-wrap-distance-bottom:0;mso-position-horizontal:right;mso-position-horizontal-relative:margin;mso-position-vertical:absolute;mso-position-vertical-relative:text;mso-width-percent:0;mso-height-percent:0;mso-width-relative:margin;mso-height-relative:margin;v-text-anchor:middle" o:gfxdata="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" fillcolor="#555 [2160]" strokecolor="black [3200]" strokeweight=".5pt">
                 <v:fill color2="#313131 [2608]" rotate="t" colors="0 #9b9b9b;.5 #8e8e8e;1 #797979" focus="100%" type="gradient">
                   <o:fill v:ext="view" type="gradientUnscaled"/>
                 </v:fill>
@@ -1895,7 +1895,7 @@
                   <w:txbxContent>
                     <w:p>
                       <w:pPr>
-                        <w:spacing w:after="60"/>
+                        <w:spacing w:after="0"/>
                         <w:ind w:left="360"/>
                         <w:jc w:val="both"/>
                         <w:rPr>
@@ -2148,8 +2148,8 @@
                         <w:jc w:val="both"/>
                         <w:rPr>
                           <w:rFonts w:asciiTheme="majorBidi" w:hAnsiTheme="majorBidi" w:cstheme="majorBidi"/>
-                          <w:sz w:val="8"/>
-                          <w:szCs w:val="8"/>
+                          <w:sz w:val="6"/>
+                          <w:szCs w:val="6"/>
                         </w:rPr>
                       </w:pPr>
                     </w:p>
@@ -2160,7 +2160,7 @@
                           <w:ilvl w:val="0"/>
                           <w:numId w:val="3"/>
                         </w:numPr>
-                        <w:spacing w:after="60"/>
+                        <w:spacing w:after="40"/>
                         <w:ind w:left="360"/>
                         <w:jc w:val="both"/>
                         <w:rPr>
@@ -2286,7 +2286,7 @@
                     </w:p>
                     <w:p>
                       <w:pPr>
-                        <w:spacing w:after="80"/>
+                        <w:spacing w:after="60"/>
                         <w:ind w:left="360"/>
                         <w:jc w:val="both"/>
                         <w:rPr>
@@ -2815,6 +2815,326 @@
           <w:szCs w:val="36"/>
         </w:rPr>
       </w:pPr>
+      <w:r>
+        <w:rPr>
+          <w:rFonts w:asciiTheme="majorBidi" w:hAnsiTheme="majorBidi" w:cstheme="majorBidi"/>
+          <w:noProof/>
+          <w:sz w:val="36"/>
+          <w:szCs w:val="36"/>
+        </w:rPr>
+        <mc:AlternateContent>
+          <mc:Choice Requires="wps">
+            <w:drawing>
+              <wp:anchor distT="0" distB="0" distL="114300" distR="114300" simplePos="0" relativeHeight="251662336" behindDoc="0" locked="0" layoutInCell="1" allowOverlap="1" wp14:anchorId="0C52758F" wp14:editId="7024ED3A">
+                <wp:simplePos x="0" y="0"/>
+                <wp:positionH relativeFrom="margin">
+                  <wp:align>right</wp:align>
+                </wp:positionH>
+                <wp:positionV relativeFrom="paragraph">
+                  <wp:posOffset>310515</wp:posOffset>
+                </wp:positionV>
+                <wp:extent cx="6842760" cy="2042160"/>
+                <wp:effectExtent l="0" t="0" r="15240" b="15240"/>
+                <wp:wrapNone/>
+                <wp:docPr id="527112170" name="Rectangle 3"/>
+                <wp:cNvGraphicFramePr/>
+                <a:graphic xmlns:a="http://schemas.openxmlformats.org/drawingml/2006/main">
+                  <a:graphicData uri="http://schemas.microsoft.com/office/word/2010/wordprocessingShape">
+                    <wps:wsp>
+                      <wps:cNvSpPr/>
+                      <wps:spPr>
+                        <a:xfrm>
+                          <a:off x="0" y="0"/>
+                          <a:ext cx="6842760" cy="2042160"/>
+                        </a:xfrm>
+                        <a:prstGeom prst="rect">
+                          <a:avLst/>
+                        </a:prstGeom>
+                      </wps:spPr>
+                      <wps:style>
+                        <a:lnRef idx="1">
+                          <a:schemeClr val="dk1"/>
+                        </a:lnRef>
+                        <a:fillRef idx="2">
+                          <a:schemeClr val="dk1"/>
+                        </a:fillRef>
+                        <a:effectRef idx="1">
+                          <a:schemeClr val="dk1"/>
+                        </a:effectRef>
+                        <a:fontRef idx="minor">
+                          <a:schemeClr val="dk1"/>
+                        </a:fontRef>
+                      </wps:style>
+                      <wps:txbx>
+                        <w:txbxContent>
+                          <w:p>
+                            <w:pPr>
+                              <w:spacing w:after="40"/>
+                              <w:jc w:val="both"/>
+                              <w:rPr>
+                                <w:rFonts w:asciiTheme="majorBidi" w:hAnsiTheme="majorBidi" w:cstheme="majorBidi"/>
+                                <w:b/>
+                                <w:bCs/>
+                                <w:sz w:val="28"/>
+                                <w:szCs w:val="28"/>
+                              </w:rPr>
+                            </w:pPr>
+                            <w:r>
+                              <w:rPr>
+                                <w:rFonts w:asciiTheme="majorBidi" w:hAnsiTheme="majorBidi" w:cstheme="majorBidi"/>
+                                <w:b/>
+                                <w:bCs/>
+                                <w:sz w:val="28"/>
+                                <w:szCs w:val="28"/>
+                              </w:rPr>
+                              <w:t>What is the purpose of horizontal scaling if the underlying hardware resources do not increase? If a server can handle only a fixed number of requests, why would running more application instances improve performance?</w:t>
+                            </w:r>
+                          </w:p>
+                          <w:p>
+                            <w:pPr>
+                              <w:spacing w:after="60"/>
+                              <w:jc w:val="both"/>
+                              <w:rPr>
+                                <w:rFonts w:asciiTheme="majorBidi" w:hAnsiTheme="majorBidi" w:cstheme="majorBidi"/>
+                                <w:sz w:val="28"/>
+                                <w:szCs w:val="28"/>
+                              </w:rPr>
+                            </w:pPr>
+                            <w:r>
+                              <w:rPr>
+                                <w:rFonts w:asciiTheme="majorBidi" w:hAnsiTheme="majorBidi" w:cstheme="majorBidi"/>
+                                <w:sz w:val="28"/>
+                                <w:szCs w:val="28"/>
+                              </w:rPr>
+                              <w:t>Your question is correct if all instances run on the same machine and the machine is already fully utilized. In that case, adding more instances usually gives little or no benefit.</w:t>
+                            </w:r>
+                          </w:p>
+                          <w:p>
+                            <w:pPr>
+                              <w:spacing w:after="0"/>
+                              <w:rPr>
+                                <w:rFonts w:asciiTheme="majorBidi" w:hAnsiTheme="majorBidi" w:cstheme="majorBidi"/>
+                                <w:sz w:val="28"/>
+                                <w:szCs w:val="28"/>
+                              </w:rPr>
+                            </w:pPr>
+                            <w:r>
+                              <w:rPr>
+                                <w:rFonts w:asciiTheme="majorBidi" w:hAnsiTheme="majorBidi" w:cstheme="majorBidi"/>
+                                <w:sz w:val="28"/>
+                                <w:szCs w:val="28"/>
+                              </w:rPr>
+                              <w:t>Suppose you have:</w:t>
+                            </w:r>
+                          </w:p>
+                          <w:p>
+                            <w:pPr>
+                              <w:pStyle w:val="ListParagraph"/>
+                              <w:numPr>
+                                <w:ilvl w:val="0"/>
+                                <w:numId w:val="9"/>
+                              </w:numPr>
+                              <w:ind w:left="360"/>
+                              <w:rPr>
+                                <w:rFonts w:asciiTheme="majorBidi" w:hAnsiTheme="majorBidi" w:cstheme="majorBidi"/>
+                                <w:sz w:val="28"/>
+                                <w:szCs w:val="28"/>
+                              </w:rPr>
+                            </w:pPr>
+                            <w:r>
+                              <w:rPr>
+                                <w:rFonts w:asciiTheme="majorBidi" w:hAnsiTheme="majorBidi" w:cstheme="majorBidi"/>
+                                <w:sz w:val="28"/>
+                                <w:szCs w:val="28"/>
+                              </w:rPr>
+                              <w:t>1 server</w:t>
+                            </w:r>
+                          </w:p>
+                          <w:p>
+                            <w:pPr>
+                              <w:pStyle w:val="ListParagraph"/>
+                              <w:numPr>
+                                <w:ilvl w:val="0"/>
+                                <w:numId w:val="9"/>
+                              </w:numPr>
+                              <w:ind w:left="360"/>
+                              <w:rPr>
+                                <w:rFonts w:asciiTheme="majorBidi" w:hAnsiTheme="majorBidi" w:cstheme="majorBidi"/>
+                                <w:sz w:val="28"/>
+                                <w:szCs w:val="28"/>
+                              </w:rPr>
+                            </w:pPr>
+                            <w:r>
+                              <w:rPr>
+                                <w:rFonts w:asciiTheme="majorBidi" w:hAnsiTheme="majorBidi" w:cstheme="majorBidi"/>
+                                <w:sz w:val="28"/>
+                                <w:szCs w:val="28"/>
+                              </w:rPr>
+                              <w:t>8 CPU cores</w:t>
+                            </w:r>
+                          </w:p>
+                          <w:p>
+                            <w:pPr>
+                              <w:jc w:val="both"/>
+                              <w:rPr>
+                                <w:rFonts w:asciiTheme="majorBidi" w:hAnsiTheme="majorBidi" w:cstheme="majorBidi"/>
+                                <w:sz w:val="28"/>
+                                <w:szCs w:val="28"/>
+                              </w:rPr>
+                            </w:pPr>
+                          </w:p>
+                        </w:txbxContent>
+                      </wps:txbx>
+                      <wps:bodyPr rot="0" spcFirstLastPara="0" vertOverflow="overflow" horzOverflow="overflow" vert="horz" wrap="square" lIns="91440" tIns="45720" rIns="91440" bIns="45720" numCol="1" spcCol="0" rtlCol="0" fromWordArt="0" anchor="ctr" anchorCtr="0" forceAA="0" compatLnSpc="1">
+                        <a:prstTxWarp prst="textNoShape">
+                          <a:avLst/>
+                        </a:prstTxWarp>
+                        <a:noAutofit/>
+                      </wps:bodyPr>
+                    </wps:wsp>
+                  </a:graphicData>
+                </a:graphic>
+                <wp14:sizeRelH relativeFrom="margin">
+                  <wp14:pctWidth>0</wp14:pctWidth>
+                </wp14:sizeRelH>
+                <wp14:sizeRelV relativeFrom="margin">
+                  <wp14:pctHeight>0</wp14:pctHeight>
+                </wp14:sizeRelV>
+              </wp:anchor>
+            </w:drawing>
+          </mc:Choice>
+          <mc:Fallback>
+            <w:pict>
+              <v:rect w14:anchorId="0C52758F" id="Rectangle 3" o:spid="_x0000_s1028" style="position:absolute;left:0;text-align:left;margin-left:487.6pt;margin-top:24.45pt;width:538.8pt;height:160.8pt;z-index:251662336;visibility:visible;mso-wrap-style:square;mso-width-percent:0;mso-height-percent:0;mso-wrap-distance-left:9pt;mso-wrap-distance-top:0;mso-wrap-distance-right:9pt;mso-wrap-distance-bottom:0;mso-position-horizontal:right;mso-position-horizontal-relative:margin;mso-position-vertical:absolute;mso-position-vertical-relative:text;mso-width-percent:0;mso-height-percent:0;mso-width-relative:margin;mso-height-relative:margin;v-text-anchor:middle" o:gfxdata="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" fillcolor="#555 [2160]" strokecolor="black [3200]" strokeweight=".5pt">
+                <v:fill color2="#313131 [2608]" rotate="t" colors="0 #9b9b9b;.5 #8e8e8e;1 #797979" focus="100%" type="gradient">
+                  <o:fill v:ext="view" type="gradientUnscaled"/>
+                </v:fill>
+                <v:textbox>
+                  <w:txbxContent>
+                    <w:p>
+                      <w:pPr>
+                        <w:spacing w:after="40"/>
+                        <w:jc w:val="both"/>
+                        <w:rPr>
+                          <w:rFonts w:asciiTheme="majorBidi" w:hAnsiTheme="majorBidi" w:cstheme="majorBidi"/>
+                          <w:b/>
+                          <w:bCs/>
+                          <w:sz w:val="28"/>
+                          <w:szCs w:val="28"/>
+                        </w:rPr>
+                      </w:pPr>
+                      <w:r>
+                        <w:rPr>
+                          <w:rFonts w:asciiTheme="majorBidi" w:hAnsiTheme="majorBidi" w:cstheme="majorBidi"/>
+                          <w:b/>
+                          <w:bCs/>
+                          <w:sz w:val="28"/>
+                          <w:szCs w:val="28"/>
+                        </w:rPr>
+                        <w:t>What is the purpose of horizontal scaling if the underlying hardware resources do not increase? If a server can handle only a fixed number of requests, why would running more application instances improve performance?</w:t>
+                      </w:r>
+                    </w:p>
+                    <w:p>
+                      <w:pPr>
+                        <w:spacing w:after="60"/>
+                        <w:jc w:val="both"/>
+                        <w:rPr>
+                          <w:rFonts w:asciiTheme="majorBidi" w:hAnsiTheme="majorBidi" w:cstheme="majorBidi"/>
+                          <w:sz w:val="28"/>
+                          <w:szCs w:val="28"/>
+                        </w:rPr>
+                      </w:pPr>
+                      <w:r>
+                        <w:rPr>
+                          <w:rFonts w:asciiTheme="majorBidi" w:hAnsiTheme="majorBidi" w:cstheme="majorBidi"/>
+                          <w:sz w:val="28"/>
+                          <w:szCs w:val="28"/>
+                        </w:rPr>
+                        <w:t>Your question is correct if all instances run on the same machine and the machine is already fully utilized. In that case, adding more instances usually gives little or no benefit.</w:t>
+                      </w:r>
+                    </w:p>
+                    <w:p>
+                      <w:pPr>
+                        <w:spacing w:after="0"/>
+                        <w:rPr>
+                          <w:rFonts w:asciiTheme="majorBidi" w:hAnsiTheme="majorBidi" w:cstheme="majorBidi"/>
+                          <w:sz w:val="28"/>
+                          <w:szCs w:val="28"/>
+                        </w:rPr>
+                      </w:pPr>
+                      <w:r>
+                        <w:rPr>
+                          <w:rFonts w:asciiTheme="majorBidi" w:hAnsiTheme="majorBidi" w:cstheme="majorBidi"/>
+                          <w:sz w:val="28"/>
+                          <w:szCs w:val="28"/>
+                        </w:rPr>
+                        <w:t>Suppose you have:</w:t>
+                      </w:r>
+                    </w:p>
+                    <w:p>
+                      <w:pPr>
+                        <w:pStyle w:val="ListParagraph"/>
+                        <w:numPr>
+                          <w:ilvl w:val="0"/>
+                          <w:numId w:val="9"/>
+                        </w:numPr>
+                        <w:ind w:left="360"/>
+                        <w:rPr>
+                          <w:rFonts w:asciiTheme="majorBidi" w:hAnsiTheme="majorBidi" w:cstheme="majorBidi"/>
+                          <w:sz w:val="28"/>
+                          <w:szCs w:val="28"/>
+                        </w:rPr>
+                      </w:pPr>
+                      <w:r>
+                        <w:rPr>
+                          <w:rFonts w:asciiTheme="majorBidi" w:hAnsiTheme="majorBidi" w:cstheme="majorBidi"/>
+                          <w:sz w:val="28"/>
+                          <w:szCs w:val="28"/>
+                        </w:rPr>
+                        <w:t>1 server</w:t>
+                      </w:r>
+                    </w:p>
+                    <w:p>
+                      <w:pPr>
+                        <w:pStyle w:val="ListParagraph"/>
+                        <w:numPr>
+                          <w:ilvl w:val="0"/>
+                          <w:numId w:val="9"/>
+                        </w:numPr>
+                        <w:ind w:left="360"/>
+                        <w:rPr>
+                          <w:rFonts w:asciiTheme="majorBidi" w:hAnsiTheme="majorBidi" w:cstheme="majorBidi"/>
+                          <w:sz w:val="28"/>
+                          <w:szCs w:val="28"/>
+                        </w:rPr>
+                      </w:pPr>
+                      <w:r>
+                        <w:rPr>
+                          <w:rFonts w:asciiTheme="majorBidi" w:hAnsiTheme="majorBidi" w:cstheme="majorBidi"/>
+                          <w:sz w:val="28"/>
+                          <w:szCs w:val="28"/>
+                        </w:rPr>
+                        <w:t>8 CPU cores</w:t>
+                      </w:r>
+                    </w:p>
+                    <w:p>
+                      <w:pPr>
+                        <w:jc w:val="both"/>
+                        <w:rPr>
+                          <w:rFonts w:asciiTheme="majorBidi" w:hAnsiTheme="majorBidi" w:cstheme="majorBidi"/>
+                          <w:sz w:val="28"/>
+                          <w:szCs w:val="28"/>
+                        </w:rPr>
+                      </w:pPr>
+                    </w:p>
+                  </w:txbxContent>
+                </v:textbox>
+                <w10:wrap anchorx="margin"/>
+              </v:rect>
+            </w:pict>
+          </mc:Fallback>
+        </mc:AlternateContent>
+      </w:r>
     </w:p>
     <w:p>
       <w:pPr>
@@ -2828,7 +3148,11 @@
           <w:szCs w:val="32"/>
         </w:rPr>
       </w:pPr>
-      <w:r>
+    </w:p>
+    <w:p>
+      <w:pPr>
+        <w:spacing w:after="60"/>
+        <w:jc w:val="both"/>
         <w:rPr>
           <w:rFonts w:asciiTheme="majorBidi" w:hAnsiTheme="majorBidi" w:cstheme="majorBidi"/>
           <w:b/>
@@ -2836,9 +3160,12 @@
           <w:sz w:val="32"/>
           <w:szCs w:val="32"/>
         </w:rPr>
-        <w:t xml:space="preserve">Desired State - </w:t>
-      </w:r>
-      <w:r>
+      </w:pPr>
+    </w:p>
+    <w:p>
+      <w:pPr>
+        <w:spacing w:after="60"/>
+        <w:jc w:val="both"/>
         <w:rPr>
           <w:rFonts w:asciiTheme="majorBidi" w:hAnsiTheme="majorBidi" w:cstheme="majorBidi"/>
           <w:b/>
@@ -2846,9 +3173,12 @@
           <w:sz w:val="32"/>
           <w:szCs w:val="32"/>
         </w:rPr>
-        <w:t>Kubernetes Core Idea</w:t>
-      </w:r>
-      <w:r>
+      </w:pPr>
+    </w:p>
+    <w:p>
+      <w:pPr>
+        <w:spacing w:after="60"/>
+        <w:jc w:val="both"/>
         <w:rPr>
           <w:rFonts w:asciiTheme="majorBidi" w:hAnsiTheme="majorBidi" w:cstheme="majorBidi"/>
           <w:b/>
@@ -2856,6 +3186,1947 @@
           <w:sz w:val="32"/>
           <w:szCs w:val="32"/>
         </w:rPr>
+      </w:pPr>
+    </w:p>
+    <w:p>
+      <w:pPr>
+        <w:spacing w:after="60"/>
+        <w:jc w:val="both"/>
+        <w:rPr>
+          <w:rFonts w:asciiTheme="majorBidi" w:hAnsiTheme="majorBidi" w:cstheme="majorBidi"/>
+          <w:b/>
+          <w:bCs/>
+          <w:sz w:val="32"/>
+          <w:szCs w:val="32"/>
+        </w:rPr>
+      </w:pPr>
+    </w:p>
+    <w:p>
+      <w:pPr>
+        <w:spacing w:after="60"/>
+        <w:jc w:val="both"/>
+        <w:rPr>
+          <w:rFonts w:asciiTheme="majorBidi" w:hAnsiTheme="majorBidi" w:cstheme="majorBidi"/>
+          <w:b/>
+          <w:bCs/>
+          <w:sz w:val="32"/>
+          <w:szCs w:val="32"/>
+        </w:rPr>
+      </w:pPr>
+    </w:p>
+    <w:p>
+      <w:pPr>
+        <w:spacing w:after="60"/>
+        <w:jc w:val="both"/>
+        <w:rPr>
+          <w:rFonts w:asciiTheme="majorBidi" w:hAnsiTheme="majorBidi" w:cstheme="majorBidi"/>
+          <w:sz w:val="28"/>
+          <w:szCs w:val="28"/>
+        </w:rPr>
+      </w:pPr>
+      <w:r>
+        <w:rPr>
+          <w:rFonts w:asciiTheme="majorBidi" w:hAnsiTheme="majorBidi" w:cstheme="majorBidi"/>
+          <w:noProof/>
+          <w:sz w:val="28"/>
+          <w:szCs w:val="28"/>
+        </w:rPr>
+        <w:lastRenderedPageBreak/>
+        <mc:AlternateContent>
+          <mc:Choice Requires="wps">
+            <w:drawing>
+              <wp:anchor distT="0" distB="0" distL="114300" distR="114300" simplePos="0" relativeHeight="251663360" behindDoc="0" locked="0" layoutInCell="1" allowOverlap="1" wp14:anchorId="054CA31D" wp14:editId="6BC34060">
+                <wp:simplePos x="0" y="0"/>
+                <wp:positionH relativeFrom="margin">
+                  <wp:align>right</wp:align>
+                </wp:positionH>
+                <wp:positionV relativeFrom="paragraph">
+                  <wp:posOffset>0</wp:posOffset>
+                </wp:positionV>
+                <wp:extent cx="6842760" cy="8206740"/>
+                <wp:effectExtent l="0" t="0" r="15240" b="22860"/>
+                <wp:wrapNone/>
+                <wp:docPr id="1232437961" name="Rectangle 4"/>
+                <wp:cNvGraphicFramePr/>
+                <a:graphic xmlns:a="http://schemas.openxmlformats.org/drawingml/2006/main">
+                  <a:graphicData uri="http://schemas.microsoft.com/office/word/2010/wordprocessingShape">
+                    <wps:wsp>
+                      <wps:cNvSpPr/>
+                      <wps:spPr>
+                        <a:xfrm>
+                          <a:off x="0" y="0"/>
+                          <a:ext cx="6842760" cy="8206740"/>
+                        </a:xfrm>
+                        <a:prstGeom prst="rect">
+                          <a:avLst/>
+                        </a:prstGeom>
+                      </wps:spPr>
+                      <wps:style>
+                        <a:lnRef idx="1">
+                          <a:schemeClr val="dk1"/>
+                        </a:lnRef>
+                        <a:fillRef idx="2">
+                          <a:schemeClr val="dk1"/>
+                        </a:fillRef>
+                        <a:effectRef idx="1">
+                          <a:schemeClr val="dk1"/>
+                        </a:effectRef>
+                        <a:fontRef idx="minor">
+                          <a:schemeClr val="dk1"/>
+                        </a:fontRef>
+                      </wps:style>
+                      <wps:txbx>
+                        <w:txbxContent>
+                          <w:p>
+                            <w:pPr>
+                              <w:pStyle w:val="ListParagraph"/>
+                              <w:numPr>
+                                <w:ilvl w:val="0"/>
+                                <w:numId w:val="10"/>
+                              </w:numPr>
+                              <w:spacing w:after="40"/>
+                              <w:ind w:left="360"/>
+                              <w:jc w:val="both"/>
+                              <w:rPr>
+                                <w:rFonts w:asciiTheme="majorBidi" w:hAnsiTheme="majorBidi" w:cstheme="majorBidi"/>
+                                <w:sz w:val="28"/>
+                                <w:szCs w:val="28"/>
+                              </w:rPr>
+                            </w:pPr>
+                            <w:r>
+                              <w:rPr>
+                                <w:rFonts w:asciiTheme="majorBidi" w:hAnsiTheme="majorBidi" w:cstheme="majorBidi"/>
+                                <w:sz w:val="28"/>
+                                <w:szCs w:val="28"/>
+                              </w:rPr>
+                              <w:t>16 GB RAM</w:t>
+                            </w:r>
+                          </w:p>
+                          <w:p>
+                            <w:pPr>
+                              <w:spacing w:after="60"/>
+                              <w:jc w:val="both"/>
+                              <w:rPr>
+                                <w:rFonts w:asciiTheme="majorBidi" w:hAnsiTheme="majorBidi" w:cstheme="majorBidi"/>
+                                <w:sz w:val="28"/>
+                                <w:szCs w:val="28"/>
+                              </w:rPr>
+                            </w:pPr>
+                            <w:r>
+                              <w:rPr>
+                                <w:rFonts w:asciiTheme="majorBidi" w:hAnsiTheme="majorBidi" w:cstheme="majorBidi"/>
+                                <w:sz w:val="28"/>
+                                <w:szCs w:val="28"/>
+                              </w:rPr>
+                              <w:t>One application instance can handle 1000 requests/second.</w:t>
+                            </w:r>
+                            <w:r>
+                              <w:rPr>
+                                <w:rFonts w:asciiTheme="majorBidi" w:hAnsiTheme="majorBidi" w:cstheme="majorBidi"/>
+                                <w:sz w:val="28"/>
+                                <w:szCs w:val="28"/>
+                              </w:rPr>
+                              <w:t xml:space="preserve"> </w:t>
+                            </w:r>
+                            <w:r>
+                              <w:rPr>
+                                <w:rFonts w:asciiTheme="majorBidi" w:hAnsiTheme="majorBidi" w:cstheme="majorBidi"/>
+                                <w:sz w:val="28"/>
+                                <w:szCs w:val="28"/>
+                              </w:rPr>
+                              <w:t>If that instance is already using all 8 cores, then</w:t>
+                            </w:r>
+                            <w:r>
+                              <w:rPr>
+                                <w:rFonts w:asciiTheme="majorBidi" w:hAnsiTheme="majorBidi" w:cstheme="majorBidi"/>
+                                <w:sz w:val="28"/>
+                                <w:szCs w:val="28"/>
+                              </w:rPr>
+                              <w:t xml:space="preserve"> </w:t>
+                            </w:r>
+                            <w:r>
+                              <w:rPr>
+                                <w:rFonts w:asciiTheme="majorBidi" w:hAnsiTheme="majorBidi" w:cstheme="majorBidi"/>
+                                <w:sz w:val="28"/>
+                                <w:szCs w:val="28"/>
+                              </w:rPr>
+                              <w:t>2 instances still around 1000 req/s</w:t>
+                            </w:r>
+                            <w:r>
+                              <w:rPr>
+                                <w:rFonts w:asciiTheme="majorBidi" w:hAnsiTheme="majorBidi" w:cstheme="majorBidi"/>
+                                <w:sz w:val="28"/>
+                                <w:szCs w:val="28"/>
+                              </w:rPr>
+                              <w:t xml:space="preserve"> </w:t>
+                            </w:r>
+                            <w:r>
+                              <w:rPr>
+                                <w:rFonts w:asciiTheme="majorBidi" w:hAnsiTheme="majorBidi" w:cstheme="majorBidi"/>
+                                <w:sz w:val="28"/>
+                                <w:szCs w:val="28"/>
+                              </w:rPr>
+                              <w:t>because the hardware is the bottleneck.</w:t>
+                            </w:r>
+                          </w:p>
+                          <w:p>
+                            <w:pPr>
+                              <w:spacing w:after="60"/>
+                              <w:jc w:val="both"/>
+                              <w:rPr>
+                                <w:rFonts w:asciiTheme="majorBidi" w:hAnsiTheme="majorBidi" w:cstheme="majorBidi"/>
+                                <w:sz w:val="28"/>
+                                <w:szCs w:val="28"/>
+                              </w:rPr>
+                            </w:pPr>
+                            <w:r>
+                              <w:rPr>
+                                <w:rFonts w:asciiTheme="majorBidi" w:hAnsiTheme="majorBidi" w:cstheme="majorBidi"/>
+                                <w:sz w:val="28"/>
+                                <w:szCs w:val="28"/>
+                              </w:rPr>
+                              <w:t>Now suppose Kubernetes runs your application on 4 nodes:</w:t>
+                            </w:r>
+                          </w:p>
+                          <w:p>
+                            <w:pPr>
+                              <w:pStyle w:val="ListParagraph"/>
+                              <w:numPr>
+                                <w:ilvl w:val="0"/>
+                                <w:numId w:val="10"/>
+                              </w:numPr>
+                              <w:ind w:left="360"/>
+                              <w:jc w:val="both"/>
+                              <w:rPr>
+                                <w:rFonts w:asciiTheme="majorBidi" w:hAnsiTheme="majorBidi" w:cstheme="majorBidi"/>
+                                <w:sz w:val="28"/>
+                                <w:szCs w:val="28"/>
+                              </w:rPr>
+                            </w:pPr>
+                            <w:r>
+                              <w:rPr>
+                                <w:rFonts w:asciiTheme="majorBidi" w:hAnsiTheme="majorBidi" w:cstheme="majorBidi"/>
+                                <w:sz w:val="28"/>
+                                <w:szCs w:val="28"/>
+                              </w:rPr>
+                              <w:t>Node 1 →</w:t>
+                            </w:r>
+                            <w:r>
+                              <w:rPr>
+                                <w:rFonts w:asciiTheme="majorBidi" w:hAnsiTheme="majorBidi" w:cstheme="majorBidi"/>
+                                <w:sz w:val="28"/>
+                                <w:szCs w:val="28"/>
+                              </w:rPr>
+                              <w:t xml:space="preserve"> </w:t>
+                            </w:r>
+                            <w:r>
+                              <w:rPr>
+                                <w:rFonts w:asciiTheme="majorBidi" w:hAnsiTheme="majorBidi" w:cstheme="majorBidi"/>
+                                <w:sz w:val="28"/>
+                                <w:szCs w:val="28"/>
+                              </w:rPr>
+                              <w:t>Instance A</w:t>
+                            </w:r>
+                          </w:p>
+                          <w:p>
+                            <w:pPr>
+                              <w:pStyle w:val="ListParagraph"/>
+                              <w:numPr>
+                                <w:ilvl w:val="0"/>
+                                <w:numId w:val="10"/>
+                              </w:numPr>
+                              <w:ind w:left="360"/>
+                              <w:jc w:val="both"/>
+                              <w:rPr>
+                                <w:rFonts w:asciiTheme="majorBidi" w:hAnsiTheme="majorBidi" w:cstheme="majorBidi"/>
+                                <w:sz w:val="28"/>
+                                <w:szCs w:val="28"/>
+                              </w:rPr>
+                            </w:pPr>
+                            <w:r>
+                              <w:rPr>
+                                <w:rFonts w:asciiTheme="majorBidi" w:hAnsiTheme="majorBidi" w:cstheme="majorBidi"/>
+                                <w:sz w:val="28"/>
+                                <w:szCs w:val="28"/>
+                              </w:rPr>
+                              <w:t>Node 2 → Instance B</w:t>
+                            </w:r>
+                          </w:p>
+                          <w:p>
+                            <w:pPr>
+                              <w:pStyle w:val="ListParagraph"/>
+                              <w:numPr>
+                                <w:ilvl w:val="0"/>
+                                <w:numId w:val="10"/>
+                              </w:numPr>
+                              <w:ind w:left="360"/>
+                              <w:jc w:val="both"/>
+                              <w:rPr>
+                                <w:rFonts w:asciiTheme="majorBidi" w:hAnsiTheme="majorBidi" w:cstheme="majorBidi"/>
+                                <w:sz w:val="28"/>
+                                <w:szCs w:val="28"/>
+                              </w:rPr>
+                            </w:pPr>
+                            <w:r>
+                              <w:rPr>
+                                <w:rFonts w:asciiTheme="majorBidi" w:hAnsiTheme="majorBidi" w:cstheme="majorBidi"/>
+                                <w:sz w:val="28"/>
+                                <w:szCs w:val="28"/>
+                              </w:rPr>
+                              <w:t>Node 3 → Instance C</w:t>
+                            </w:r>
+                          </w:p>
+                          <w:p>
+                            <w:pPr>
+                              <w:pStyle w:val="ListParagraph"/>
+                              <w:numPr>
+                                <w:ilvl w:val="0"/>
+                                <w:numId w:val="10"/>
+                              </w:numPr>
+                              <w:spacing w:after="60"/>
+                              <w:ind w:left="360"/>
+                              <w:jc w:val="both"/>
+                              <w:rPr>
+                                <w:rFonts w:asciiTheme="majorBidi" w:hAnsiTheme="majorBidi" w:cstheme="majorBidi"/>
+                                <w:sz w:val="28"/>
+                                <w:szCs w:val="28"/>
+                              </w:rPr>
+                            </w:pPr>
+                            <w:r>
+                              <w:rPr>
+                                <w:rFonts w:asciiTheme="majorBidi" w:hAnsiTheme="majorBidi" w:cstheme="majorBidi"/>
+                                <w:sz w:val="28"/>
+                                <w:szCs w:val="28"/>
+                              </w:rPr>
+                              <w:t>Node 4 → Instance D</w:t>
+                            </w:r>
+                          </w:p>
+                          <w:p>
+                            <w:pPr>
+                              <w:spacing w:after="0"/>
+                              <w:jc w:val="both"/>
+                              <w:rPr>
+                                <w:rFonts w:asciiTheme="majorBidi" w:hAnsiTheme="majorBidi" w:cstheme="majorBidi"/>
+                                <w:sz w:val="28"/>
+                                <w:szCs w:val="28"/>
+                              </w:rPr>
+                            </w:pPr>
+                            <w:r>
+                              <w:rPr>
+                                <w:rFonts w:asciiTheme="majorBidi" w:hAnsiTheme="majorBidi" w:cstheme="majorBidi"/>
+                                <w:sz w:val="28"/>
+                                <w:szCs w:val="28"/>
+                              </w:rPr>
+                              <w:t>Each node can handle 1000 requests/second.</w:t>
+                            </w:r>
+                            <w:r>
+                              <w:rPr>
+                                <w:rFonts w:asciiTheme="majorBidi" w:hAnsiTheme="majorBidi" w:cstheme="majorBidi"/>
+                                <w:sz w:val="28"/>
+                                <w:szCs w:val="28"/>
+                              </w:rPr>
+                              <w:t xml:space="preserve"> </w:t>
+                            </w:r>
+                            <w:r>
+                              <w:rPr>
+                                <w:rFonts w:asciiTheme="majorBidi" w:hAnsiTheme="majorBidi" w:cstheme="majorBidi"/>
+                                <w:sz w:val="28"/>
+                                <w:szCs w:val="28"/>
+                              </w:rPr>
+                              <w:t>No</w:t>
+                            </w:r>
+                            <w:r>
+                              <w:rPr>
+                                <w:rFonts w:asciiTheme="majorBidi" w:hAnsiTheme="majorBidi" w:cstheme="majorBidi"/>
+                                <w:sz w:val="28"/>
+                                <w:szCs w:val="28"/>
+                              </w:rPr>
+                              <w:t xml:space="preserve">w </w:t>
+                            </w:r>
+                            <w:r>
+                              <w:rPr>
+                                <w:rFonts w:asciiTheme="majorBidi" w:hAnsiTheme="majorBidi" w:cstheme="majorBidi"/>
+                                <w:sz w:val="28"/>
+                                <w:szCs w:val="28"/>
+                              </w:rPr>
+                              <w:t xml:space="preserve">4 instances </w:t>
+                            </w:r>
+                            <w:r>
+                              <w:rPr>
+                                <w:rFonts w:asciiTheme="majorBidi" w:hAnsiTheme="majorBidi" w:cstheme="majorBidi"/>
+                                <w:sz w:val="28"/>
+                                <w:szCs w:val="28"/>
+                              </w:rPr>
+                              <w:t xml:space="preserve">can handle </w:t>
+                            </w:r>
+                            <w:r>
+                              <w:rPr>
+                                <w:rFonts w:asciiTheme="majorBidi" w:hAnsiTheme="majorBidi" w:cstheme="majorBidi"/>
+                                <w:sz w:val="28"/>
+                                <w:szCs w:val="28"/>
+                              </w:rPr>
+                              <w:t>4000 req/s</w:t>
+                            </w:r>
+                            <w:r>
+                              <w:rPr>
+                                <w:rFonts w:asciiTheme="majorBidi" w:hAnsiTheme="majorBidi" w:cstheme="majorBidi"/>
+                                <w:sz w:val="28"/>
+                                <w:szCs w:val="28"/>
+                              </w:rPr>
+                              <w:t xml:space="preserve"> </w:t>
+                            </w:r>
+                            <w:r>
+                              <w:rPr>
+                                <w:rFonts w:asciiTheme="majorBidi" w:hAnsiTheme="majorBidi" w:cstheme="majorBidi"/>
+                                <w:sz w:val="28"/>
+                                <w:szCs w:val="28"/>
+                              </w:rPr>
+                              <w:t>because the workload is distributed across multiple machines.</w:t>
+                            </w:r>
+                          </w:p>
+                          <w:p>
+                            <w:pPr>
+                              <w:spacing w:after="60"/>
+                              <w:jc w:val="both"/>
+                              <w:rPr>
+                                <w:rFonts w:asciiTheme="majorBidi" w:hAnsiTheme="majorBidi" w:cstheme="majorBidi"/>
+                                <w:sz w:val="28"/>
+                                <w:szCs w:val="28"/>
+                              </w:rPr>
+                            </w:pPr>
+                            <w:r>
+                              <w:rPr>
+                                <w:rFonts w:asciiTheme="majorBidi" w:hAnsiTheme="majorBidi" w:cstheme="majorBidi"/>
+                                <w:sz w:val="28"/>
+                                <w:szCs w:val="28"/>
+                              </w:rPr>
+                              <w:t>This is the main purpose of horizontal scaling.</w:t>
+                            </w:r>
+                          </w:p>
+                          <w:p>
+                            <w:pPr>
+                              <w:spacing w:after="40"/>
+                              <w:jc w:val="both"/>
+                              <w:rPr>
+                                <w:rFonts w:asciiTheme="majorBidi" w:hAnsiTheme="majorBidi" w:cstheme="majorBidi"/>
+                                <w:b/>
+                                <w:bCs/>
+                                <w:sz w:val="28"/>
+                                <w:szCs w:val="28"/>
+                              </w:rPr>
+                            </w:pPr>
+                            <w:r>
+                              <w:rPr>
+                                <w:rFonts w:asciiTheme="majorBidi" w:hAnsiTheme="majorBidi" w:cstheme="majorBidi"/>
+                                <w:b/>
+                                <w:bCs/>
+                                <w:sz w:val="28"/>
+                                <w:szCs w:val="28"/>
+                              </w:rPr>
+                              <w:t>Another important reason: High Availability</w:t>
+                            </w:r>
+                          </w:p>
+                          <w:p>
+                            <w:pPr>
+                              <w:spacing w:after="0"/>
+                              <w:jc w:val="both"/>
+                              <w:rPr>
+                                <w:rFonts w:asciiTheme="majorBidi" w:hAnsiTheme="majorBidi" w:cstheme="majorBidi"/>
+                                <w:sz w:val="28"/>
+                                <w:szCs w:val="28"/>
+                              </w:rPr>
+                            </w:pPr>
+                            <w:r>
+                              <w:rPr>
+                                <w:rFonts w:asciiTheme="majorBidi" w:hAnsiTheme="majorBidi" w:cstheme="majorBidi"/>
+                                <w:sz w:val="28"/>
+                                <w:szCs w:val="28"/>
+                              </w:rPr>
+                              <w:t>Even if capacity does not increase much, multiple instances provide redundancy.</w:t>
+                            </w:r>
+                          </w:p>
+                          <w:p>
+                            <w:pPr>
+                              <w:spacing w:after="40"/>
+                              <w:jc w:val="both"/>
+                              <w:rPr>
+                                <w:rFonts w:asciiTheme="majorBidi" w:hAnsiTheme="majorBidi" w:cstheme="majorBidi"/>
+                                <w:sz w:val="28"/>
+                                <w:szCs w:val="28"/>
+                              </w:rPr>
+                            </w:pPr>
+                            <w:r>
+                              <w:rPr>
+                                <w:rFonts w:asciiTheme="majorBidi" w:hAnsiTheme="majorBidi" w:cstheme="majorBidi"/>
+                                <w:sz w:val="28"/>
+                                <w:szCs w:val="28"/>
+                              </w:rPr>
+                              <w:t xml:space="preserve">Suppose you have 3 instances, </w:t>
+                            </w:r>
+                            <w:r>
+                              <w:rPr>
+                                <w:rFonts w:asciiTheme="majorBidi" w:hAnsiTheme="majorBidi" w:cstheme="majorBidi"/>
+                                <w:sz w:val="28"/>
+                                <w:szCs w:val="28"/>
+                              </w:rPr>
+                              <w:t>Instance A</w:t>
+                            </w:r>
+                            <w:r>
+                              <w:rPr>
+                                <w:rFonts w:asciiTheme="majorBidi" w:hAnsiTheme="majorBidi" w:cstheme="majorBidi"/>
+                                <w:sz w:val="28"/>
+                                <w:szCs w:val="28"/>
+                              </w:rPr>
+                              <w:t xml:space="preserve">, </w:t>
+                            </w:r>
+                            <w:r>
+                              <w:rPr>
+                                <w:rFonts w:asciiTheme="majorBidi" w:hAnsiTheme="majorBidi" w:cstheme="majorBidi"/>
+                                <w:sz w:val="28"/>
+                                <w:szCs w:val="28"/>
+                              </w:rPr>
+                              <w:t>Instance B</w:t>
+                            </w:r>
+                            <w:r>
+                              <w:rPr>
+                                <w:rFonts w:asciiTheme="majorBidi" w:hAnsiTheme="majorBidi" w:cstheme="majorBidi"/>
+                                <w:sz w:val="28"/>
+                                <w:szCs w:val="28"/>
+                              </w:rPr>
+                              <w:t xml:space="preserve"> and </w:t>
+                            </w:r>
+                            <w:r>
+                              <w:rPr>
+                                <w:rFonts w:asciiTheme="majorBidi" w:hAnsiTheme="majorBidi" w:cstheme="majorBidi"/>
+                                <w:sz w:val="28"/>
+                                <w:szCs w:val="28"/>
+                              </w:rPr>
+                              <w:t>Instance C</w:t>
+                            </w:r>
+                            <w:r>
+                              <w:rPr>
+                                <w:rFonts w:asciiTheme="majorBidi" w:hAnsiTheme="majorBidi" w:cstheme="majorBidi"/>
+                                <w:sz w:val="28"/>
+                                <w:szCs w:val="28"/>
+                              </w:rPr>
+                              <w:t xml:space="preserve">. </w:t>
+                            </w:r>
+                            <w:r>
+                              <w:rPr>
+                                <w:rFonts w:asciiTheme="majorBidi" w:hAnsiTheme="majorBidi" w:cstheme="majorBidi"/>
+                                <w:sz w:val="28"/>
+                                <w:szCs w:val="28"/>
+                              </w:rPr>
+                              <w:t>If Instance B crashes</w:t>
+                            </w:r>
+                            <w:r>
+                              <w:rPr>
+                                <w:rFonts w:asciiTheme="majorBidi" w:hAnsiTheme="majorBidi" w:cstheme="majorBidi"/>
+                                <w:sz w:val="28"/>
+                                <w:szCs w:val="28"/>
+                              </w:rPr>
+                              <w:t xml:space="preserve">, </w:t>
+                            </w:r>
+                            <w:r>
+                              <w:rPr>
+                                <w:rFonts w:asciiTheme="majorBidi" w:hAnsiTheme="majorBidi" w:cstheme="majorBidi"/>
+                                <w:sz w:val="28"/>
+                                <w:szCs w:val="28"/>
+                              </w:rPr>
+                              <w:t>Instance A</w:t>
+                            </w:r>
+                            <w:r>
+                              <w:rPr>
+                                <w:rFonts w:asciiTheme="majorBidi" w:hAnsiTheme="majorBidi" w:cstheme="majorBidi"/>
+                                <w:sz w:val="28"/>
+                                <w:szCs w:val="28"/>
+                              </w:rPr>
+                              <w:t xml:space="preserve"> and </w:t>
+                            </w:r>
+                            <w:r>
+                              <w:rPr>
+                                <w:rFonts w:asciiTheme="majorBidi" w:hAnsiTheme="majorBidi" w:cstheme="majorBidi"/>
+                                <w:sz w:val="28"/>
+                                <w:szCs w:val="28"/>
+                              </w:rPr>
+                              <w:t>Instance C</w:t>
+                            </w:r>
+                            <w:r>
+                              <w:rPr>
+                                <w:rFonts w:asciiTheme="majorBidi" w:hAnsiTheme="majorBidi" w:cstheme="majorBidi"/>
+                                <w:sz w:val="28"/>
+                                <w:szCs w:val="28"/>
+                              </w:rPr>
+                              <w:t xml:space="preserve"> still there. </w:t>
+                            </w:r>
+                            <w:proofErr w:type="gramStart"/>
+                            <w:r>
+                              <w:rPr>
+                                <w:rFonts w:asciiTheme="majorBidi" w:hAnsiTheme="majorBidi" w:cstheme="majorBidi"/>
+                                <w:sz w:val="28"/>
+                                <w:szCs w:val="28"/>
+                              </w:rPr>
+                              <w:t>So</w:t>
+                            </w:r>
+                            <w:proofErr w:type="gramEnd"/>
+                            <w:r>
+                              <w:rPr>
+                                <w:rFonts w:asciiTheme="majorBidi" w:hAnsiTheme="majorBidi" w:cstheme="majorBidi"/>
+                                <w:sz w:val="28"/>
+                                <w:szCs w:val="28"/>
+                              </w:rPr>
+                              <w:t xml:space="preserve"> t</w:t>
+                            </w:r>
+                            <w:r>
+                              <w:rPr>
+                                <w:rFonts w:asciiTheme="majorBidi" w:hAnsiTheme="majorBidi" w:cstheme="majorBidi"/>
+                                <w:sz w:val="28"/>
+                                <w:szCs w:val="28"/>
+                              </w:rPr>
+                              <w:t>he application remains available.</w:t>
+                            </w:r>
+                          </w:p>
+                          <w:p>
+                            <w:pPr>
+                              <w:spacing w:after="0"/>
+                              <w:jc w:val="both"/>
+                              <w:rPr>
+                                <w:rFonts w:asciiTheme="majorBidi" w:hAnsiTheme="majorBidi" w:cstheme="majorBidi"/>
+                                <w:sz w:val="28"/>
+                                <w:szCs w:val="28"/>
+                              </w:rPr>
+                            </w:pPr>
+                            <w:r>
+                              <w:rPr>
+                                <w:rFonts w:asciiTheme="majorBidi" w:hAnsiTheme="majorBidi" w:cstheme="majorBidi"/>
+                                <w:sz w:val="28"/>
+                                <w:szCs w:val="28"/>
+                              </w:rPr>
+                              <w:t>With only one instance:</w:t>
+                            </w:r>
+                          </w:p>
+                          <w:p>
+                            <w:pPr>
+                              <w:spacing w:after="40"/>
+                              <w:jc w:val="both"/>
+                              <w:rPr>
+                                <w:rFonts w:asciiTheme="majorBidi" w:hAnsiTheme="majorBidi" w:cstheme="majorBidi"/>
+                                <w:sz w:val="28"/>
+                                <w:szCs w:val="28"/>
+                              </w:rPr>
+                            </w:pPr>
+                            <w:r>
+                              <w:rPr>
+                                <w:rFonts w:asciiTheme="majorBidi" w:hAnsiTheme="majorBidi" w:cstheme="majorBidi"/>
+                                <w:sz w:val="28"/>
+                                <w:szCs w:val="28"/>
+                              </w:rPr>
+                              <w:t>Instance A crashes → service unavailable</w:t>
+                            </w:r>
+                          </w:p>
+                          <w:p>
+                            <w:pPr>
+                              <w:spacing w:after="60"/>
+                              <w:jc w:val="both"/>
+                              <w:rPr>
+                                <w:rFonts w:asciiTheme="majorBidi" w:hAnsiTheme="majorBidi" w:cstheme="majorBidi"/>
+                                <w:sz w:val="28"/>
+                                <w:szCs w:val="28"/>
+                              </w:rPr>
+                            </w:pPr>
+                            <w:r>
+                              <w:rPr>
+                                <w:rFonts w:asciiTheme="majorBidi" w:hAnsiTheme="majorBidi" w:cstheme="majorBidi"/>
+                                <w:sz w:val="28"/>
+                                <w:szCs w:val="28"/>
+                              </w:rPr>
+                              <w:t>This is one of the biggest reasons Kubernetes runs multiple Pods.</w:t>
+                            </w:r>
+                          </w:p>
+                          <w:p>
+                            <w:pPr>
+                              <w:spacing w:after="60"/>
+                              <w:jc w:val="both"/>
+                              <w:rPr>
+                                <w:rFonts w:asciiTheme="majorBidi" w:hAnsiTheme="majorBidi" w:cstheme="majorBidi"/>
+                                <w:b/>
+                                <w:bCs/>
+                                <w:sz w:val="32"/>
+                                <w:szCs w:val="32"/>
+                              </w:rPr>
+                            </w:pPr>
+                            <w:r>
+                              <w:rPr>
+                                <w:rFonts w:asciiTheme="majorBidi" w:hAnsiTheme="majorBidi" w:cstheme="majorBidi"/>
+                                <w:b/>
+                                <w:bCs/>
+                                <w:sz w:val="32"/>
+                                <w:szCs w:val="32"/>
+                              </w:rPr>
+                              <w:t>Summery:</w:t>
+                            </w:r>
+                          </w:p>
+                          <w:p>
+                            <w:pPr>
+                              <w:spacing w:after="0"/>
+                              <w:jc w:val="both"/>
+                              <w:rPr>
+                                <w:rFonts w:asciiTheme="majorBidi" w:hAnsiTheme="majorBidi" w:cstheme="majorBidi"/>
+                                <w:b/>
+                                <w:bCs/>
+                                <w:sz w:val="28"/>
+                                <w:szCs w:val="28"/>
+                              </w:rPr>
+                            </w:pPr>
+                            <w:r>
+                              <w:rPr>
+                                <w:rFonts w:asciiTheme="majorBidi" w:hAnsiTheme="majorBidi" w:cstheme="majorBidi"/>
+                                <w:b/>
+                                <w:bCs/>
+                                <w:sz w:val="28"/>
+                                <w:szCs w:val="28"/>
+                              </w:rPr>
+                              <w:t>Why increase instances if hardware resources are limited?</w:t>
+                            </w:r>
+                          </w:p>
+                          <w:p>
+                            <w:pPr>
+                              <w:pStyle w:val="ListParagraph"/>
+                              <w:numPr>
+                                <w:ilvl w:val="0"/>
+                                <w:numId w:val="11"/>
+                              </w:numPr>
+                              <w:ind w:left="360"/>
+                              <w:jc w:val="both"/>
+                              <w:rPr>
+                                <w:rFonts w:asciiTheme="majorBidi" w:hAnsiTheme="majorBidi" w:cstheme="majorBidi"/>
+                                <w:sz w:val="28"/>
+                                <w:szCs w:val="28"/>
+                              </w:rPr>
+                            </w:pPr>
+                            <w:r>
+                              <w:rPr>
+                                <w:rFonts w:asciiTheme="majorBidi" w:hAnsiTheme="majorBidi" w:cstheme="majorBidi"/>
+                                <w:sz w:val="28"/>
+                                <w:szCs w:val="28"/>
+                              </w:rPr>
+                              <w:t>If the same hardware is already fully utilized, adding instances usually does not increase capacity.</w:t>
+                            </w:r>
+                          </w:p>
+                          <w:p>
+                            <w:pPr>
+                              <w:pStyle w:val="ListParagraph"/>
+                              <w:numPr>
+                                <w:ilvl w:val="0"/>
+                                <w:numId w:val="11"/>
+                              </w:numPr>
+                              <w:ind w:left="360"/>
+                              <w:jc w:val="both"/>
+                              <w:rPr>
+                                <w:rFonts w:asciiTheme="majorBidi" w:hAnsiTheme="majorBidi" w:cstheme="majorBidi"/>
+                                <w:sz w:val="28"/>
+                                <w:szCs w:val="28"/>
+                              </w:rPr>
+                            </w:pPr>
+                            <w:r>
+                              <w:rPr>
+                                <w:rFonts w:asciiTheme="majorBidi" w:hAnsiTheme="majorBidi" w:cstheme="majorBidi"/>
+                                <w:sz w:val="28"/>
+                                <w:szCs w:val="28"/>
+                              </w:rPr>
+                              <w:t>Horizontal scaling becomes useful when workload can be distributed across multiple CPU cores or multiple machines.</w:t>
+                            </w:r>
+                          </w:p>
+                          <w:p>
+                            <w:pPr>
+                              <w:pStyle w:val="ListParagraph"/>
+                              <w:numPr>
+                                <w:ilvl w:val="0"/>
+                                <w:numId w:val="11"/>
+                              </w:numPr>
+                              <w:ind w:left="360"/>
+                              <w:jc w:val="both"/>
+                              <w:rPr>
+                                <w:rFonts w:asciiTheme="majorBidi" w:hAnsiTheme="majorBidi" w:cstheme="majorBidi"/>
+                                <w:sz w:val="28"/>
+                                <w:szCs w:val="28"/>
+                              </w:rPr>
+                            </w:pPr>
+                            <w:r>
+                              <w:rPr>
+                                <w:rFonts w:asciiTheme="majorBidi" w:hAnsiTheme="majorBidi" w:cstheme="majorBidi"/>
+                                <w:sz w:val="28"/>
+                                <w:szCs w:val="28"/>
+                              </w:rPr>
+                              <w:t>Multiple instances also improve availability and fault tolerance because the application continues running even if some instances fail.</w:t>
+                            </w:r>
+                          </w:p>
+                          <w:p>
+                            <w:pPr>
+                              <w:pStyle w:val="ListParagraph"/>
+                              <w:numPr>
+                                <w:ilvl w:val="0"/>
+                                <w:numId w:val="11"/>
+                              </w:numPr>
+                              <w:spacing w:after="100"/>
+                              <w:ind w:left="360"/>
+                              <w:jc w:val="both"/>
+                              <w:rPr>
+                                <w:rFonts w:asciiTheme="majorBidi" w:hAnsiTheme="majorBidi" w:cstheme="majorBidi"/>
+                                <w:sz w:val="28"/>
+                                <w:szCs w:val="28"/>
+                              </w:rPr>
+                            </w:pPr>
+                            <w:r>
+                              <w:rPr>
+                                <w:rFonts w:asciiTheme="majorBidi" w:hAnsiTheme="majorBidi" w:cstheme="majorBidi"/>
+                                <w:sz w:val="28"/>
+                                <w:szCs w:val="28"/>
+                              </w:rPr>
+                              <w:t>In Kubernetes, scaling replicas is often used for both increased throughput and higher reliability.</w:t>
+                            </w:r>
+                          </w:p>
+                          <w:p>
+                            <w:pPr>
+                              <w:jc w:val="both"/>
+                              <w:rPr>
+                                <w:rFonts w:asciiTheme="majorBidi" w:hAnsiTheme="majorBidi" w:cstheme="majorBidi"/>
+                                <w:sz w:val="28"/>
+                                <w:szCs w:val="28"/>
+                              </w:rPr>
+                            </w:pPr>
+                            <w:r>
+                              <w:rPr>
+                                <w:rFonts w:asciiTheme="majorBidi" w:hAnsiTheme="majorBidi" w:cstheme="majorBidi"/>
+                                <w:sz w:val="28"/>
+                                <w:szCs w:val="28"/>
+                              </w:rPr>
+                              <w:t>The goal of multiple instances is usually not to increase the capacity of a single machine. Instead, it is to improve availability, fault tolerance, rolling updates, and the ability to distribute workload across multiple nodes. If the total hardware resources remain fixed and are already fully utilized, creating more instances does not increase the server's total computing power.</w:t>
+                            </w:r>
+                          </w:p>
+                        </w:txbxContent>
+                      </wps:txbx>
+                      <wps:bodyPr rot="0" spcFirstLastPara="0" vertOverflow="overflow" horzOverflow="overflow" vert="horz" wrap="square" lIns="91440" tIns="45720" rIns="91440" bIns="45720" numCol="1" spcCol="0" rtlCol="0" fromWordArt="0" anchor="ctr" anchorCtr="0" forceAA="0" compatLnSpc="1">
+                        <a:prstTxWarp prst="textNoShape">
+                          <a:avLst/>
+                        </a:prstTxWarp>
+                        <a:noAutofit/>
+                      </wps:bodyPr>
+                    </wps:wsp>
+                  </a:graphicData>
+                </a:graphic>
+                <wp14:sizeRelH relativeFrom="margin">
+                  <wp14:pctWidth>0</wp14:pctWidth>
+                </wp14:sizeRelH>
+                <wp14:sizeRelV relativeFrom="margin">
+                  <wp14:pctHeight>0</wp14:pctHeight>
+                </wp14:sizeRelV>
+              </wp:anchor>
+            </w:drawing>
+          </mc:Choice>
+          <mc:Fallback>
+            <w:pict>
+              <v:rect w14:anchorId="054CA31D" id="Rectangle 4" o:spid="_x0000_s1029" style="position:absolute;left:0;text-align:left;margin-left:487.6pt;margin-top:0;width:538.8pt;height:646.2pt;z-index:251663360;visibility:visible;mso-wrap-style:square;mso-width-percent:0;mso-height-percent:0;mso-wrap-distance-left:9pt;mso-wrap-distance-top:0;mso-wrap-distance-right:9pt;mso-wrap-distance-bottom:0;mso-position-horizontal:right;mso-position-horizontal-relative:margin;mso-position-vertical:absolute;mso-position-vertical-relative:text;mso-width-percent:0;mso-height-percent:0;mso-width-relative:margin;mso-height-relative:margin;v-text-anchor:middle" o:gfxdata="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" fillcolor="#555 [2160]" strokecolor="black [3200]" strokeweight=".5pt">
+                <v:fill color2="#313131 [2608]" rotate="t" colors="0 #9b9b9b;.5 #8e8e8e;1 #797979" focus="100%" type="gradient">
+                  <o:fill v:ext="view" type="gradientUnscaled"/>
+                </v:fill>
+                <v:textbox>
+                  <w:txbxContent>
+                    <w:p>
+                      <w:pPr>
+                        <w:pStyle w:val="ListParagraph"/>
+                        <w:numPr>
+                          <w:ilvl w:val="0"/>
+                          <w:numId w:val="10"/>
+                        </w:numPr>
+                        <w:spacing w:after="40"/>
+                        <w:ind w:left="360"/>
+                        <w:jc w:val="both"/>
+                        <w:rPr>
+                          <w:rFonts w:asciiTheme="majorBidi" w:hAnsiTheme="majorBidi" w:cstheme="majorBidi"/>
+                          <w:sz w:val="28"/>
+                          <w:szCs w:val="28"/>
+                        </w:rPr>
+                      </w:pPr>
+                      <w:r>
+                        <w:rPr>
+                          <w:rFonts w:asciiTheme="majorBidi" w:hAnsiTheme="majorBidi" w:cstheme="majorBidi"/>
+                          <w:sz w:val="28"/>
+                          <w:szCs w:val="28"/>
+                        </w:rPr>
+                        <w:t>16 GB RAM</w:t>
+                      </w:r>
+                    </w:p>
+                    <w:p>
+                      <w:pPr>
+                        <w:spacing w:after="60"/>
+                        <w:jc w:val="both"/>
+                        <w:rPr>
+                          <w:rFonts w:asciiTheme="majorBidi" w:hAnsiTheme="majorBidi" w:cstheme="majorBidi"/>
+                          <w:sz w:val="28"/>
+                          <w:szCs w:val="28"/>
+                        </w:rPr>
+                      </w:pPr>
+                      <w:r>
+                        <w:rPr>
+                          <w:rFonts w:asciiTheme="majorBidi" w:hAnsiTheme="majorBidi" w:cstheme="majorBidi"/>
+                          <w:sz w:val="28"/>
+                          <w:szCs w:val="28"/>
+                        </w:rPr>
+                        <w:t>One application instance can handle 1000 requests/second.</w:t>
+                      </w:r>
+                      <w:r>
+                        <w:rPr>
+                          <w:rFonts w:asciiTheme="majorBidi" w:hAnsiTheme="majorBidi" w:cstheme="majorBidi"/>
+                          <w:sz w:val="28"/>
+                          <w:szCs w:val="28"/>
+                        </w:rPr>
+                        <w:t xml:space="preserve"> </w:t>
+                      </w:r>
+                      <w:r>
+                        <w:rPr>
+                          <w:rFonts w:asciiTheme="majorBidi" w:hAnsiTheme="majorBidi" w:cstheme="majorBidi"/>
+                          <w:sz w:val="28"/>
+                          <w:szCs w:val="28"/>
+                        </w:rPr>
+                        <w:t>If that instance is already using all 8 cores, then</w:t>
+                      </w:r>
+                      <w:r>
+                        <w:rPr>
+                          <w:rFonts w:asciiTheme="majorBidi" w:hAnsiTheme="majorBidi" w:cstheme="majorBidi"/>
+                          <w:sz w:val="28"/>
+                          <w:szCs w:val="28"/>
+                        </w:rPr>
+                        <w:t xml:space="preserve"> </w:t>
+                      </w:r>
+                      <w:r>
+                        <w:rPr>
+                          <w:rFonts w:asciiTheme="majorBidi" w:hAnsiTheme="majorBidi" w:cstheme="majorBidi"/>
+                          <w:sz w:val="28"/>
+                          <w:szCs w:val="28"/>
+                        </w:rPr>
+                        <w:t>2 instances still around 1000 req/s</w:t>
+                      </w:r>
+                      <w:r>
+                        <w:rPr>
+                          <w:rFonts w:asciiTheme="majorBidi" w:hAnsiTheme="majorBidi" w:cstheme="majorBidi"/>
+                          <w:sz w:val="28"/>
+                          <w:szCs w:val="28"/>
+                        </w:rPr>
+                        <w:t xml:space="preserve"> </w:t>
+                      </w:r>
+                      <w:r>
+                        <w:rPr>
+                          <w:rFonts w:asciiTheme="majorBidi" w:hAnsiTheme="majorBidi" w:cstheme="majorBidi"/>
+                          <w:sz w:val="28"/>
+                          <w:szCs w:val="28"/>
+                        </w:rPr>
+                        <w:t>because the hardware is the bottleneck.</w:t>
+                      </w:r>
+                    </w:p>
+                    <w:p>
+                      <w:pPr>
+                        <w:spacing w:after="60"/>
+                        <w:jc w:val="both"/>
+                        <w:rPr>
+                          <w:rFonts w:asciiTheme="majorBidi" w:hAnsiTheme="majorBidi" w:cstheme="majorBidi"/>
+                          <w:sz w:val="28"/>
+                          <w:szCs w:val="28"/>
+                        </w:rPr>
+                      </w:pPr>
+                      <w:r>
+                        <w:rPr>
+                          <w:rFonts w:asciiTheme="majorBidi" w:hAnsiTheme="majorBidi" w:cstheme="majorBidi"/>
+                          <w:sz w:val="28"/>
+                          <w:szCs w:val="28"/>
+                        </w:rPr>
+                        <w:t>Now suppose Kubernetes runs your application on 4 nodes:</w:t>
+                      </w:r>
+                    </w:p>
+                    <w:p>
+                      <w:pPr>
+                        <w:pStyle w:val="ListParagraph"/>
+                        <w:numPr>
+                          <w:ilvl w:val="0"/>
+                          <w:numId w:val="10"/>
+                        </w:numPr>
+                        <w:ind w:left="360"/>
+                        <w:jc w:val="both"/>
+                        <w:rPr>
+                          <w:rFonts w:asciiTheme="majorBidi" w:hAnsiTheme="majorBidi" w:cstheme="majorBidi"/>
+                          <w:sz w:val="28"/>
+                          <w:szCs w:val="28"/>
+                        </w:rPr>
+                      </w:pPr>
+                      <w:r>
+                        <w:rPr>
+                          <w:rFonts w:asciiTheme="majorBidi" w:hAnsiTheme="majorBidi" w:cstheme="majorBidi"/>
+                          <w:sz w:val="28"/>
+                          <w:szCs w:val="28"/>
+                        </w:rPr>
+                        <w:t>Node 1 →</w:t>
+                      </w:r>
+                      <w:r>
+                        <w:rPr>
+                          <w:rFonts w:asciiTheme="majorBidi" w:hAnsiTheme="majorBidi" w:cstheme="majorBidi"/>
+                          <w:sz w:val="28"/>
+                          <w:szCs w:val="28"/>
+                        </w:rPr>
+                        <w:t xml:space="preserve"> </w:t>
+                      </w:r>
+                      <w:r>
+                        <w:rPr>
+                          <w:rFonts w:asciiTheme="majorBidi" w:hAnsiTheme="majorBidi" w:cstheme="majorBidi"/>
+                          <w:sz w:val="28"/>
+                          <w:szCs w:val="28"/>
+                        </w:rPr>
+                        <w:t>Instance A</w:t>
+                      </w:r>
+                    </w:p>
+                    <w:p>
+                      <w:pPr>
+                        <w:pStyle w:val="ListParagraph"/>
+                        <w:numPr>
+                          <w:ilvl w:val="0"/>
+                          <w:numId w:val="10"/>
+                        </w:numPr>
+                        <w:ind w:left="360"/>
+                        <w:jc w:val="both"/>
+                        <w:rPr>
+                          <w:rFonts w:asciiTheme="majorBidi" w:hAnsiTheme="majorBidi" w:cstheme="majorBidi"/>
+                          <w:sz w:val="28"/>
+                          <w:szCs w:val="28"/>
+                        </w:rPr>
+                      </w:pPr>
+                      <w:r>
+                        <w:rPr>
+                          <w:rFonts w:asciiTheme="majorBidi" w:hAnsiTheme="majorBidi" w:cstheme="majorBidi"/>
+                          <w:sz w:val="28"/>
+                          <w:szCs w:val="28"/>
+                        </w:rPr>
+                        <w:t>Node 2 → Instance B</w:t>
+                      </w:r>
+                    </w:p>
+                    <w:p>
+                      <w:pPr>
+                        <w:pStyle w:val="ListParagraph"/>
+                        <w:numPr>
+                          <w:ilvl w:val="0"/>
+                          <w:numId w:val="10"/>
+                        </w:numPr>
+                        <w:ind w:left="360"/>
+                        <w:jc w:val="both"/>
+                        <w:rPr>
+                          <w:rFonts w:asciiTheme="majorBidi" w:hAnsiTheme="majorBidi" w:cstheme="majorBidi"/>
+                          <w:sz w:val="28"/>
+                          <w:szCs w:val="28"/>
+                        </w:rPr>
+                      </w:pPr>
+                      <w:r>
+                        <w:rPr>
+                          <w:rFonts w:asciiTheme="majorBidi" w:hAnsiTheme="majorBidi" w:cstheme="majorBidi"/>
+                          <w:sz w:val="28"/>
+                          <w:szCs w:val="28"/>
+                        </w:rPr>
+                        <w:t>Node 3 → Instance C</w:t>
+                      </w:r>
+                    </w:p>
+                    <w:p>
+                      <w:pPr>
+                        <w:pStyle w:val="ListParagraph"/>
+                        <w:numPr>
+                          <w:ilvl w:val="0"/>
+                          <w:numId w:val="10"/>
+                        </w:numPr>
+                        <w:spacing w:after="60"/>
+                        <w:ind w:left="360"/>
+                        <w:jc w:val="both"/>
+                        <w:rPr>
+                          <w:rFonts w:asciiTheme="majorBidi" w:hAnsiTheme="majorBidi" w:cstheme="majorBidi"/>
+                          <w:sz w:val="28"/>
+                          <w:szCs w:val="28"/>
+                        </w:rPr>
+                      </w:pPr>
+                      <w:r>
+                        <w:rPr>
+                          <w:rFonts w:asciiTheme="majorBidi" w:hAnsiTheme="majorBidi" w:cstheme="majorBidi"/>
+                          <w:sz w:val="28"/>
+                          <w:szCs w:val="28"/>
+                        </w:rPr>
+                        <w:t>Node 4 → Instance D</w:t>
+                      </w:r>
+                    </w:p>
+                    <w:p>
+                      <w:pPr>
+                        <w:spacing w:after="0"/>
+                        <w:jc w:val="both"/>
+                        <w:rPr>
+                          <w:rFonts w:asciiTheme="majorBidi" w:hAnsiTheme="majorBidi" w:cstheme="majorBidi"/>
+                          <w:sz w:val="28"/>
+                          <w:szCs w:val="28"/>
+                        </w:rPr>
+                      </w:pPr>
+                      <w:r>
+                        <w:rPr>
+                          <w:rFonts w:asciiTheme="majorBidi" w:hAnsiTheme="majorBidi" w:cstheme="majorBidi"/>
+                          <w:sz w:val="28"/>
+                          <w:szCs w:val="28"/>
+                        </w:rPr>
+                        <w:t>Each node can handle 1000 requests/second.</w:t>
+                      </w:r>
+                      <w:r>
+                        <w:rPr>
+                          <w:rFonts w:asciiTheme="majorBidi" w:hAnsiTheme="majorBidi" w:cstheme="majorBidi"/>
+                          <w:sz w:val="28"/>
+                          <w:szCs w:val="28"/>
+                        </w:rPr>
+                        <w:t xml:space="preserve"> </w:t>
+                      </w:r>
+                      <w:r>
+                        <w:rPr>
+                          <w:rFonts w:asciiTheme="majorBidi" w:hAnsiTheme="majorBidi" w:cstheme="majorBidi"/>
+                          <w:sz w:val="28"/>
+                          <w:szCs w:val="28"/>
+                        </w:rPr>
+                        <w:t>No</w:t>
+                      </w:r>
+                      <w:r>
+                        <w:rPr>
+                          <w:rFonts w:asciiTheme="majorBidi" w:hAnsiTheme="majorBidi" w:cstheme="majorBidi"/>
+                          <w:sz w:val="28"/>
+                          <w:szCs w:val="28"/>
+                        </w:rPr>
+                        <w:t xml:space="preserve">w </w:t>
+                      </w:r>
+                      <w:r>
+                        <w:rPr>
+                          <w:rFonts w:asciiTheme="majorBidi" w:hAnsiTheme="majorBidi" w:cstheme="majorBidi"/>
+                          <w:sz w:val="28"/>
+                          <w:szCs w:val="28"/>
+                        </w:rPr>
+                        <w:t xml:space="preserve">4 instances </w:t>
+                      </w:r>
+                      <w:r>
+                        <w:rPr>
+                          <w:rFonts w:asciiTheme="majorBidi" w:hAnsiTheme="majorBidi" w:cstheme="majorBidi"/>
+                          <w:sz w:val="28"/>
+                          <w:szCs w:val="28"/>
+                        </w:rPr>
+                        <w:t xml:space="preserve">can handle </w:t>
+                      </w:r>
+                      <w:r>
+                        <w:rPr>
+                          <w:rFonts w:asciiTheme="majorBidi" w:hAnsiTheme="majorBidi" w:cstheme="majorBidi"/>
+                          <w:sz w:val="28"/>
+                          <w:szCs w:val="28"/>
+                        </w:rPr>
+                        <w:t>4000 req/s</w:t>
+                      </w:r>
+                      <w:r>
+                        <w:rPr>
+                          <w:rFonts w:asciiTheme="majorBidi" w:hAnsiTheme="majorBidi" w:cstheme="majorBidi"/>
+                          <w:sz w:val="28"/>
+                          <w:szCs w:val="28"/>
+                        </w:rPr>
+                        <w:t xml:space="preserve"> </w:t>
+                      </w:r>
+                      <w:r>
+                        <w:rPr>
+                          <w:rFonts w:asciiTheme="majorBidi" w:hAnsiTheme="majorBidi" w:cstheme="majorBidi"/>
+                          <w:sz w:val="28"/>
+                          <w:szCs w:val="28"/>
+                        </w:rPr>
+                        <w:t>because the workload is distributed across multiple machines.</w:t>
+                      </w:r>
+                    </w:p>
+                    <w:p>
+                      <w:pPr>
+                        <w:spacing w:after="60"/>
+                        <w:jc w:val="both"/>
+                        <w:rPr>
+                          <w:rFonts w:asciiTheme="majorBidi" w:hAnsiTheme="majorBidi" w:cstheme="majorBidi"/>
+                          <w:sz w:val="28"/>
+                          <w:szCs w:val="28"/>
+                        </w:rPr>
+                      </w:pPr>
+                      <w:r>
+                        <w:rPr>
+                          <w:rFonts w:asciiTheme="majorBidi" w:hAnsiTheme="majorBidi" w:cstheme="majorBidi"/>
+                          <w:sz w:val="28"/>
+                          <w:szCs w:val="28"/>
+                        </w:rPr>
+                        <w:t>This is the main purpose of horizontal scaling.</w:t>
+                      </w:r>
+                    </w:p>
+                    <w:p>
+                      <w:pPr>
+                        <w:spacing w:after="40"/>
+                        <w:jc w:val="both"/>
+                        <w:rPr>
+                          <w:rFonts w:asciiTheme="majorBidi" w:hAnsiTheme="majorBidi" w:cstheme="majorBidi"/>
+                          <w:b/>
+                          <w:bCs/>
+                          <w:sz w:val="28"/>
+                          <w:szCs w:val="28"/>
+                        </w:rPr>
+                      </w:pPr>
+                      <w:r>
+                        <w:rPr>
+                          <w:rFonts w:asciiTheme="majorBidi" w:hAnsiTheme="majorBidi" w:cstheme="majorBidi"/>
+                          <w:b/>
+                          <w:bCs/>
+                          <w:sz w:val="28"/>
+                          <w:szCs w:val="28"/>
+                        </w:rPr>
+                        <w:t>Another important reason: High Availability</w:t>
+                      </w:r>
+                    </w:p>
+                    <w:p>
+                      <w:pPr>
+                        <w:spacing w:after="0"/>
+                        <w:jc w:val="both"/>
+                        <w:rPr>
+                          <w:rFonts w:asciiTheme="majorBidi" w:hAnsiTheme="majorBidi" w:cstheme="majorBidi"/>
+                          <w:sz w:val="28"/>
+                          <w:szCs w:val="28"/>
+                        </w:rPr>
+                      </w:pPr>
+                      <w:r>
+                        <w:rPr>
+                          <w:rFonts w:asciiTheme="majorBidi" w:hAnsiTheme="majorBidi" w:cstheme="majorBidi"/>
+                          <w:sz w:val="28"/>
+                          <w:szCs w:val="28"/>
+                        </w:rPr>
+                        <w:t>Even if capacity does not increase much, multiple instances provide redundancy.</w:t>
+                      </w:r>
+                    </w:p>
+                    <w:p>
+                      <w:pPr>
+                        <w:spacing w:after="40"/>
+                        <w:jc w:val="both"/>
+                        <w:rPr>
+                          <w:rFonts w:asciiTheme="majorBidi" w:hAnsiTheme="majorBidi" w:cstheme="majorBidi"/>
+                          <w:sz w:val="28"/>
+                          <w:szCs w:val="28"/>
+                        </w:rPr>
+                      </w:pPr>
+                      <w:r>
+                        <w:rPr>
+                          <w:rFonts w:asciiTheme="majorBidi" w:hAnsiTheme="majorBidi" w:cstheme="majorBidi"/>
+                          <w:sz w:val="28"/>
+                          <w:szCs w:val="28"/>
+                        </w:rPr>
+                        <w:t xml:space="preserve">Suppose you have 3 instances, </w:t>
+                      </w:r>
+                      <w:r>
+                        <w:rPr>
+                          <w:rFonts w:asciiTheme="majorBidi" w:hAnsiTheme="majorBidi" w:cstheme="majorBidi"/>
+                          <w:sz w:val="28"/>
+                          <w:szCs w:val="28"/>
+                        </w:rPr>
+                        <w:t>Instance A</w:t>
+                      </w:r>
+                      <w:r>
+                        <w:rPr>
+                          <w:rFonts w:asciiTheme="majorBidi" w:hAnsiTheme="majorBidi" w:cstheme="majorBidi"/>
+                          <w:sz w:val="28"/>
+                          <w:szCs w:val="28"/>
+                        </w:rPr>
+                        <w:t xml:space="preserve">, </w:t>
+                      </w:r>
+                      <w:r>
+                        <w:rPr>
+                          <w:rFonts w:asciiTheme="majorBidi" w:hAnsiTheme="majorBidi" w:cstheme="majorBidi"/>
+                          <w:sz w:val="28"/>
+                          <w:szCs w:val="28"/>
+                        </w:rPr>
+                        <w:t>Instance B</w:t>
+                      </w:r>
+                      <w:r>
+                        <w:rPr>
+                          <w:rFonts w:asciiTheme="majorBidi" w:hAnsiTheme="majorBidi" w:cstheme="majorBidi"/>
+                          <w:sz w:val="28"/>
+                          <w:szCs w:val="28"/>
+                        </w:rPr>
+                        <w:t xml:space="preserve"> and </w:t>
+                      </w:r>
+                      <w:r>
+                        <w:rPr>
+                          <w:rFonts w:asciiTheme="majorBidi" w:hAnsiTheme="majorBidi" w:cstheme="majorBidi"/>
+                          <w:sz w:val="28"/>
+                          <w:szCs w:val="28"/>
+                        </w:rPr>
+                        <w:t>Instance C</w:t>
+                      </w:r>
+                      <w:r>
+                        <w:rPr>
+                          <w:rFonts w:asciiTheme="majorBidi" w:hAnsiTheme="majorBidi" w:cstheme="majorBidi"/>
+                          <w:sz w:val="28"/>
+                          <w:szCs w:val="28"/>
+                        </w:rPr>
+                        <w:t xml:space="preserve">. </w:t>
+                      </w:r>
+                      <w:r>
+                        <w:rPr>
+                          <w:rFonts w:asciiTheme="majorBidi" w:hAnsiTheme="majorBidi" w:cstheme="majorBidi"/>
+                          <w:sz w:val="28"/>
+                          <w:szCs w:val="28"/>
+                        </w:rPr>
+                        <w:t>If Instance B crashes</w:t>
+                      </w:r>
+                      <w:r>
+                        <w:rPr>
+                          <w:rFonts w:asciiTheme="majorBidi" w:hAnsiTheme="majorBidi" w:cstheme="majorBidi"/>
+                          <w:sz w:val="28"/>
+                          <w:szCs w:val="28"/>
+                        </w:rPr>
+                        <w:t xml:space="preserve">, </w:t>
+                      </w:r>
+                      <w:r>
+                        <w:rPr>
+                          <w:rFonts w:asciiTheme="majorBidi" w:hAnsiTheme="majorBidi" w:cstheme="majorBidi"/>
+                          <w:sz w:val="28"/>
+                          <w:szCs w:val="28"/>
+                        </w:rPr>
+                        <w:t>Instance A</w:t>
+                      </w:r>
+                      <w:r>
+                        <w:rPr>
+                          <w:rFonts w:asciiTheme="majorBidi" w:hAnsiTheme="majorBidi" w:cstheme="majorBidi"/>
+                          <w:sz w:val="28"/>
+                          <w:szCs w:val="28"/>
+                        </w:rPr>
+                        <w:t xml:space="preserve"> and </w:t>
+                      </w:r>
+                      <w:r>
+                        <w:rPr>
+                          <w:rFonts w:asciiTheme="majorBidi" w:hAnsiTheme="majorBidi" w:cstheme="majorBidi"/>
+                          <w:sz w:val="28"/>
+                          <w:szCs w:val="28"/>
+                        </w:rPr>
+                        <w:t>Instance C</w:t>
+                      </w:r>
+                      <w:r>
+                        <w:rPr>
+                          <w:rFonts w:asciiTheme="majorBidi" w:hAnsiTheme="majorBidi" w:cstheme="majorBidi"/>
+                          <w:sz w:val="28"/>
+                          <w:szCs w:val="28"/>
+                        </w:rPr>
+                        <w:t xml:space="preserve"> still there. </w:t>
+                      </w:r>
+                      <w:proofErr w:type="gramStart"/>
+                      <w:r>
+                        <w:rPr>
+                          <w:rFonts w:asciiTheme="majorBidi" w:hAnsiTheme="majorBidi" w:cstheme="majorBidi"/>
+                          <w:sz w:val="28"/>
+                          <w:szCs w:val="28"/>
+                        </w:rPr>
+                        <w:t>So</w:t>
+                      </w:r>
+                      <w:proofErr w:type="gramEnd"/>
+                      <w:r>
+                        <w:rPr>
+                          <w:rFonts w:asciiTheme="majorBidi" w:hAnsiTheme="majorBidi" w:cstheme="majorBidi"/>
+                          <w:sz w:val="28"/>
+                          <w:szCs w:val="28"/>
+                        </w:rPr>
+                        <w:t xml:space="preserve"> t</w:t>
+                      </w:r>
+                      <w:r>
+                        <w:rPr>
+                          <w:rFonts w:asciiTheme="majorBidi" w:hAnsiTheme="majorBidi" w:cstheme="majorBidi"/>
+                          <w:sz w:val="28"/>
+                          <w:szCs w:val="28"/>
+                        </w:rPr>
+                        <w:t>he application remains available.</w:t>
+                      </w:r>
+                    </w:p>
+                    <w:p>
+                      <w:pPr>
+                        <w:spacing w:after="0"/>
+                        <w:jc w:val="both"/>
+                        <w:rPr>
+                          <w:rFonts w:asciiTheme="majorBidi" w:hAnsiTheme="majorBidi" w:cstheme="majorBidi"/>
+                          <w:sz w:val="28"/>
+                          <w:szCs w:val="28"/>
+                        </w:rPr>
+                      </w:pPr>
+                      <w:r>
+                        <w:rPr>
+                          <w:rFonts w:asciiTheme="majorBidi" w:hAnsiTheme="majorBidi" w:cstheme="majorBidi"/>
+                          <w:sz w:val="28"/>
+                          <w:szCs w:val="28"/>
+                        </w:rPr>
+                        <w:t>With only one instance:</w:t>
+                      </w:r>
+                    </w:p>
+                    <w:p>
+                      <w:pPr>
+                        <w:spacing w:after="40"/>
+                        <w:jc w:val="both"/>
+                        <w:rPr>
+                          <w:rFonts w:asciiTheme="majorBidi" w:hAnsiTheme="majorBidi" w:cstheme="majorBidi"/>
+                          <w:sz w:val="28"/>
+                          <w:szCs w:val="28"/>
+                        </w:rPr>
+                      </w:pPr>
+                      <w:r>
+                        <w:rPr>
+                          <w:rFonts w:asciiTheme="majorBidi" w:hAnsiTheme="majorBidi" w:cstheme="majorBidi"/>
+                          <w:sz w:val="28"/>
+                          <w:szCs w:val="28"/>
+                        </w:rPr>
+                        <w:t>Instance A crashes → service unavailable</w:t>
+                      </w:r>
+                    </w:p>
+                    <w:p>
+                      <w:pPr>
+                        <w:spacing w:after="60"/>
+                        <w:jc w:val="both"/>
+                        <w:rPr>
+                          <w:rFonts w:asciiTheme="majorBidi" w:hAnsiTheme="majorBidi" w:cstheme="majorBidi"/>
+                          <w:sz w:val="28"/>
+                          <w:szCs w:val="28"/>
+                        </w:rPr>
+                      </w:pPr>
+                      <w:r>
+                        <w:rPr>
+                          <w:rFonts w:asciiTheme="majorBidi" w:hAnsiTheme="majorBidi" w:cstheme="majorBidi"/>
+                          <w:sz w:val="28"/>
+                          <w:szCs w:val="28"/>
+                        </w:rPr>
+                        <w:t>This is one of the biggest reasons Kubernetes runs multiple Pods.</w:t>
+                      </w:r>
+                    </w:p>
+                    <w:p>
+                      <w:pPr>
+                        <w:spacing w:after="60"/>
+                        <w:jc w:val="both"/>
+                        <w:rPr>
+                          <w:rFonts w:asciiTheme="majorBidi" w:hAnsiTheme="majorBidi" w:cstheme="majorBidi"/>
+                          <w:b/>
+                          <w:bCs/>
+                          <w:sz w:val="32"/>
+                          <w:szCs w:val="32"/>
+                        </w:rPr>
+                      </w:pPr>
+                      <w:r>
+                        <w:rPr>
+                          <w:rFonts w:asciiTheme="majorBidi" w:hAnsiTheme="majorBidi" w:cstheme="majorBidi"/>
+                          <w:b/>
+                          <w:bCs/>
+                          <w:sz w:val="32"/>
+                          <w:szCs w:val="32"/>
+                        </w:rPr>
+                        <w:t>Summery:</w:t>
+                      </w:r>
+                    </w:p>
+                    <w:p>
+                      <w:pPr>
+                        <w:spacing w:after="0"/>
+                        <w:jc w:val="both"/>
+                        <w:rPr>
+                          <w:rFonts w:asciiTheme="majorBidi" w:hAnsiTheme="majorBidi" w:cstheme="majorBidi"/>
+                          <w:b/>
+                          <w:bCs/>
+                          <w:sz w:val="28"/>
+                          <w:szCs w:val="28"/>
+                        </w:rPr>
+                      </w:pPr>
+                      <w:r>
+                        <w:rPr>
+                          <w:rFonts w:asciiTheme="majorBidi" w:hAnsiTheme="majorBidi" w:cstheme="majorBidi"/>
+                          <w:b/>
+                          <w:bCs/>
+                          <w:sz w:val="28"/>
+                          <w:szCs w:val="28"/>
+                        </w:rPr>
+                        <w:t>Why increase instances if hardware resources are limited?</w:t>
+                      </w:r>
+                    </w:p>
+                    <w:p>
+                      <w:pPr>
+                        <w:pStyle w:val="ListParagraph"/>
+                        <w:numPr>
+                          <w:ilvl w:val="0"/>
+                          <w:numId w:val="11"/>
+                        </w:numPr>
+                        <w:ind w:left="360"/>
+                        <w:jc w:val="both"/>
+                        <w:rPr>
+                          <w:rFonts w:asciiTheme="majorBidi" w:hAnsiTheme="majorBidi" w:cstheme="majorBidi"/>
+                          <w:sz w:val="28"/>
+                          <w:szCs w:val="28"/>
+                        </w:rPr>
+                      </w:pPr>
+                      <w:r>
+                        <w:rPr>
+                          <w:rFonts w:asciiTheme="majorBidi" w:hAnsiTheme="majorBidi" w:cstheme="majorBidi"/>
+                          <w:sz w:val="28"/>
+                          <w:szCs w:val="28"/>
+                        </w:rPr>
+                        <w:t>If the same hardware is already fully utilized, adding instances usually does not increase capacity.</w:t>
+                      </w:r>
+                    </w:p>
+                    <w:p>
+                      <w:pPr>
+                        <w:pStyle w:val="ListParagraph"/>
+                        <w:numPr>
+                          <w:ilvl w:val="0"/>
+                          <w:numId w:val="11"/>
+                        </w:numPr>
+                        <w:ind w:left="360"/>
+                        <w:jc w:val="both"/>
+                        <w:rPr>
+                          <w:rFonts w:asciiTheme="majorBidi" w:hAnsiTheme="majorBidi" w:cstheme="majorBidi"/>
+                          <w:sz w:val="28"/>
+                          <w:szCs w:val="28"/>
+                        </w:rPr>
+                      </w:pPr>
+                      <w:r>
+                        <w:rPr>
+                          <w:rFonts w:asciiTheme="majorBidi" w:hAnsiTheme="majorBidi" w:cstheme="majorBidi"/>
+                          <w:sz w:val="28"/>
+                          <w:szCs w:val="28"/>
+                        </w:rPr>
+                        <w:t>Horizontal scaling becomes useful when workload can be distributed across multiple CPU cores or multiple machines.</w:t>
+                      </w:r>
+                    </w:p>
+                    <w:p>
+                      <w:pPr>
+                        <w:pStyle w:val="ListParagraph"/>
+                        <w:numPr>
+                          <w:ilvl w:val="0"/>
+                          <w:numId w:val="11"/>
+                        </w:numPr>
+                        <w:ind w:left="360"/>
+                        <w:jc w:val="both"/>
+                        <w:rPr>
+                          <w:rFonts w:asciiTheme="majorBidi" w:hAnsiTheme="majorBidi" w:cstheme="majorBidi"/>
+                          <w:sz w:val="28"/>
+                          <w:szCs w:val="28"/>
+                        </w:rPr>
+                      </w:pPr>
+                      <w:r>
+                        <w:rPr>
+                          <w:rFonts w:asciiTheme="majorBidi" w:hAnsiTheme="majorBidi" w:cstheme="majorBidi"/>
+                          <w:sz w:val="28"/>
+                          <w:szCs w:val="28"/>
+                        </w:rPr>
+                        <w:t>Multiple instances also improve availability and fault tolerance because the application continues running even if some instances fail.</w:t>
+                      </w:r>
+                    </w:p>
+                    <w:p>
+                      <w:pPr>
+                        <w:pStyle w:val="ListParagraph"/>
+                        <w:numPr>
+                          <w:ilvl w:val="0"/>
+                          <w:numId w:val="11"/>
+                        </w:numPr>
+                        <w:spacing w:after="100"/>
+                        <w:ind w:left="360"/>
+                        <w:jc w:val="both"/>
+                        <w:rPr>
+                          <w:rFonts w:asciiTheme="majorBidi" w:hAnsiTheme="majorBidi" w:cstheme="majorBidi"/>
+                          <w:sz w:val="28"/>
+                          <w:szCs w:val="28"/>
+                        </w:rPr>
+                      </w:pPr>
+                      <w:r>
+                        <w:rPr>
+                          <w:rFonts w:asciiTheme="majorBidi" w:hAnsiTheme="majorBidi" w:cstheme="majorBidi"/>
+                          <w:sz w:val="28"/>
+                          <w:szCs w:val="28"/>
+                        </w:rPr>
+                        <w:t>In Kubernetes, scaling replicas is often used for both increased throughput and higher reliability.</w:t>
+                      </w:r>
+                    </w:p>
+                    <w:p>
+                      <w:pPr>
+                        <w:jc w:val="both"/>
+                        <w:rPr>
+                          <w:rFonts w:asciiTheme="majorBidi" w:hAnsiTheme="majorBidi" w:cstheme="majorBidi"/>
+                          <w:sz w:val="28"/>
+                          <w:szCs w:val="28"/>
+                        </w:rPr>
+                      </w:pPr>
+                      <w:r>
+                        <w:rPr>
+                          <w:rFonts w:asciiTheme="majorBidi" w:hAnsiTheme="majorBidi" w:cstheme="majorBidi"/>
+                          <w:sz w:val="28"/>
+                          <w:szCs w:val="28"/>
+                        </w:rPr>
+                        <w:t>The goal of multiple instances is usually not to increase the capacity of a single machine. Instead, it is to improve availability, fault tolerance, rolling updates, and the ability to distribute workload across multiple nodes. If the total hardware resources remain fixed and are already fully utilized, creating more instances does not increase the server's total computing power.</w:t>
+                      </w:r>
+                    </w:p>
+                  </w:txbxContent>
+                </v:textbox>
+                <w10:wrap anchorx="margin"/>
+              </v:rect>
+            </w:pict>
+          </mc:Fallback>
+        </mc:AlternateContent>
+      </w:r>
+    </w:p>
+    <w:p>
+      <w:pPr>
+        <w:spacing w:after="60"/>
+        <w:jc w:val="both"/>
+        <w:rPr>
+          <w:rFonts w:asciiTheme="majorBidi" w:hAnsiTheme="majorBidi" w:cstheme="majorBidi"/>
+          <w:sz w:val="28"/>
+          <w:szCs w:val="28"/>
+        </w:rPr>
+      </w:pPr>
+    </w:p>
+    <w:p>
+      <w:pPr>
+        <w:spacing w:after="60"/>
+        <w:jc w:val="both"/>
+        <w:rPr>
+          <w:rFonts w:asciiTheme="majorBidi" w:hAnsiTheme="majorBidi" w:cstheme="majorBidi"/>
+          <w:sz w:val="28"/>
+          <w:szCs w:val="28"/>
+        </w:rPr>
+      </w:pPr>
+    </w:p>
+    <w:p>
+      <w:pPr>
+        <w:spacing w:after="60"/>
+        <w:jc w:val="both"/>
+        <w:rPr>
+          <w:rFonts w:asciiTheme="majorBidi" w:hAnsiTheme="majorBidi" w:cstheme="majorBidi"/>
+          <w:sz w:val="28"/>
+          <w:szCs w:val="28"/>
+        </w:rPr>
+      </w:pPr>
+    </w:p>
+    <w:p>
+      <w:pPr>
+        <w:spacing w:after="60"/>
+        <w:jc w:val="both"/>
+        <w:rPr>
+          <w:rFonts w:asciiTheme="majorBidi" w:hAnsiTheme="majorBidi" w:cstheme="majorBidi"/>
+          <w:sz w:val="28"/>
+          <w:szCs w:val="28"/>
+        </w:rPr>
+      </w:pPr>
+    </w:p>
+    <w:p>
+      <w:pPr>
+        <w:spacing w:after="60"/>
+        <w:jc w:val="both"/>
+        <w:rPr>
+          <w:rFonts w:asciiTheme="majorBidi" w:hAnsiTheme="majorBidi" w:cstheme="majorBidi"/>
+          <w:sz w:val="28"/>
+          <w:szCs w:val="28"/>
+        </w:rPr>
+      </w:pPr>
+    </w:p>
+    <w:p>
+      <w:pPr>
+        <w:spacing w:after="60"/>
+        <w:jc w:val="both"/>
+        <w:rPr>
+          <w:rFonts w:asciiTheme="majorBidi" w:hAnsiTheme="majorBidi" w:cstheme="majorBidi"/>
+          <w:sz w:val="28"/>
+          <w:szCs w:val="28"/>
+        </w:rPr>
+      </w:pPr>
+    </w:p>
+    <w:p>
+      <w:pPr>
+        <w:spacing w:after="60"/>
+        <w:jc w:val="both"/>
+        <w:rPr>
+          <w:rFonts w:asciiTheme="majorBidi" w:hAnsiTheme="majorBidi" w:cstheme="majorBidi"/>
+          <w:sz w:val="28"/>
+          <w:szCs w:val="28"/>
+        </w:rPr>
+      </w:pPr>
+    </w:p>
+    <w:p>
+      <w:pPr>
+        <w:spacing w:after="60"/>
+        <w:jc w:val="both"/>
+        <w:rPr>
+          <w:rFonts w:asciiTheme="majorBidi" w:hAnsiTheme="majorBidi" w:cstheme="majorBidi"/>
+          <w:sz w:val="28"/>
+          <w:szCs w:val="28"/>
+        </w:rPr>
+      </w:pPr>
+    </w:p>
+    <w:p>
+      <w:pPr>
+        <w:spacing w:after="60"/>
+        <w:jc w:val="both"/>
+        <w:rPr>
+          <w:rFonts w:asciiTheme="majorBidi" w:hAnsiTheme="majorBidi" w:cstheme="majorBidi"/>
+          <w:sz w:val="28"/>
+          <w:szCs w:val="28"/>
+        </w:rPr>
+      </w:pPr>
+    </w:p>
+    <w:p>
+      <w:pPr>
+        <w:spacing w:after="60"/>
+        <w:jc w:val="both"/>
+        <w:rPr>
+          <w:rFonts w:asciiTheme="majorBidi" w:hAnsiTheme="majorBidi" w:cstheme="majorBidi"/>
+          <w:sz w:val="28"/>
+          <w:szCs w:val="28"/>
+        </w:rPr>
+      </w:pPr>
+    </w:p>
+    <w:p>
+      <w:pPr>
+        <w:spacing w:after="60"/>
+        <w:jc w:val="both"/>
+        <w:rPr>
+          <w:rFonts w:asciiTheme="majorBidi" w:hAnsiTheme="majorBidi" w:cstheme="majorBidi"/>
+          <w:sz w:val="28"/>
+          <w:szCs w:val="28"/>
+        </w:rPr>
+      </w:pPr>
+    </w:p>
+    <w:p>
+      <w:pPr>
+        <w:spacing w:after="60"/>
+        <w:jc w:val="both"/>
+        <w:rPr>
+          <w:rFonts w:asciiTheme="majorBidi" w:hAnsiTheme="majorBidi" w:cstheme="majorBidi"/>
+          <w:sz w:val="28"/>
+          <w:szCs w:val="28"/>
+        </w:rPr>
+      </w:pPr>
+    </w:p>
+    <w:p>
+      <w:pPr>
+        <w:spacing w:after="60"/>
+        <w:jc w:val="both"/>
+        <w:rPr>
+          <w:rFonts w:asciiTheme="majorBidi" w:hAnsiTheme="majorBidi" w:cstheme="majorBidi"/>
+          <w:sz w:val="28"/>
+          <w:szCs w:val="28"/>
+        </w:rPr>
+      </w:pPr>
+    </w:p>
+    <w:p>
+      <w:pPr>
+        <w:spacing w:after="60"/>
+        <w:jc w:val="both"/>
+        <w:rPr>
+          <w:rFonts w:asciiTheme="majorBidi" w:hAnsiTheme="majorBidi" w:cstheme="majorBidi"/>
+          <w:sz w:val="28"/>
+          <w:szCs w:val="28"/>
+        </w:rPr>
+      </w:pPr>
+    </w:p>
+    <w:p>
+      <w:pPr>
+        <w:spacing w:after="60"/>
+        <w:jc w:val="both"/>
+        <w:rPr>
+          <w:rFonts w:asciiTheme="majorBidi" w:hAnsiTheme="majorBidi" w:cstheme="majorBidi"/>
+          <w:sz w:val="28"/>
+          <w:szCs w:val="28"/>
+        </w:rPr>
+      </w:pPr>
+    </w:p>
+    <w:p>
+      <w:pPr>
+        <w:spacing w:after="60"/>
+        <w:jc w:val="both"/>
+        <w:rPr>
+          <w:rFonts w:asciiTheme="majorBidi" w:hAnsiTheme="majorBidi" w:cstheme="majorBidi"/>
+          <w:sz w:val="28"/>
+          <w:szCs w:val="28"/>
+        </w:rPr>
+      </w:pPr>
+    </w:p>
+    <w:p>
+      <w:pPr>
+        <w:spacing w:after="60"/>
+        <w:jc w:val="both"/>
+        <w:rPr>
+          <w:rFonts w:asciiTheme="majorBidi" w:hAnsiTheme="majorBidi" w:cstheme="majorBidi"/>
+          <w:sz w:val="28"/>
+          <w:szCs w:val="28"/>
+        </w:rPr>
+      </w:pPr>
+    </w:p>
+    <w:p>
+      <w:pPr>
+        <w:spacing w:after="60"/>
+        <w:jc w:val="both"/>
+        <w:rPr>
+          <w:rFonts w:asciiTheme="majorBidi" w:hAnsiTheme="majorBidi" w:cstheme="majorBidi"/>
+          <w:sz w:val="28"/>
+          <w:szCs w:val="28"/>
+        </w:rPr>
+      </w:pPr>
+    </w:p>
+    <w:p>
+      <w:pPr>
+        <w:spacing w:after="60"/>
+        <w:jc w:val="both"/>
+        <w:rPr>
+          <w:rFonts w:asciiTheme="majorBidi" w:hAnsiTheme="majorBidi" w:cstheme="majorBidi"/>
+          <w:sz w:val="28"/>
+          <w:szCs w:val="28"/>
+        </w:rPr>
+      </w:pPr>
+    </w:p>
+    <w:p>
+      <w:pPr>
+        <w:spacing w:after="60"/>
+        <w:jc w:val="both"/>
+        <w:rPr>
+          <w:rFonts w:asciiTheme="majorBidi" w:hAnsiTheme="majorBidi" w:cstheme="majorBidi"/>
+          <w:sz w:val="28"/>
+          <w:szCs w:val="28"/>
+        </w:rPr>
+      </w:pPr>
+    </w:p>
+    <w:p>
+      <w:pPr>
+        <w:spacing w:after="60"/>
+        <w:jc w:val="both"/>
+        <w:rPr>
+          <w:rFonts w:asciiTheme="majorBidi" w:hAnsiTheme="majorBidi" w:cstheme="majorBidi"/>
+          <w:sz w:val="28"/>
+          <w:szCs w:val="28"/>
+        </w:rPr>
+      </w:pPr>
+    </w:p>
+    <w:p>
+      <w:pPr>
+        <w:spacing w:after="60"/>
+        <w:jc w:val="both"/>
+        <w:rPr>
+          <w:rFonts w:asciiTheme="majorBidi" w:hAnsiTheme="majorBidi" w:cstheme="majorBidi"/>
+          <w:sz w:val="28"/>
+          <w:szCs w:val="28"/>
+        </w:rPr>
+      </w:pPr>
+    </w:p>
+    <w:p>
+      <w:pPr>
+        <w:spacing w:after="60"/>
+        <w:jc w:val="both"/>
+        <w:rPr>
+          <w:rFonts w:asciiTheme="majorBidi" w:hAnsiTheme="majorBidi" w:cstheme="majorBidi"/>
+          <w:sz w:val="28"/>
+          <w:szCs w:val="28"/>
+        </w:rPr>
+      </w:pPr>
+    </w:p>
+    <w:p>
+      <w:pPr>
+        <w:spacing w:after="60"/>
+        <w:jc w:val="both"/>
+        <w:rPr>
+          <w:rFonts w:asciiTheme="majorBidi" w:hAnsiTheme="majorBidi" w:cstheme="majorBidi"/>
+          <w:sz w:val="28"/>
+          <w:szCs w:val="28"/>
+        </w:rPr>
+      </w:pPr>
+    </w:p>
+    <w:p>
+      <w:pPr>
+        <w:spacing w:after="60"/>
+        <w:jc w:val="both"/>
+        <w:rPr>
+          <w:rFonts w:asciiTheme="majorBidi" w:hAnsiTheme="majorBidi" w:cstheme="majorBidi"/>
+          <w:sz w:val="28"/>
+          <w:szCs w:val="28"/>
+        </w:rPr>
+      </w:pPr>
+    </w:p>
+    <w:p>
+      <w:pPr>
+        <w:spacing w:after="60"/>
+        <w:jc w:val="both"/>
+        <w:rPr>
+          <w:rFonts w:asciiTheme="majorBidi" w:hAnsiTheme="majorBidi" w:cstheme="majorBidi"/>
+          <w:sz w:val="28"/>
+          <w:szCs w:val="28"/>
+        </w:rPr>
+      </w:pPr>
+    </w:p>
+    <w:p>
+      <w:pPr>
+        <w:spacing w:after="60"/>
+        <w:jc w:val="both"/>
+        <w:rPr>
+          <w:rFonts w:asciiTheme="majorBidi" w:hAnsiTheme="majorBidi" w:cstheme="majorBidi"/>
+          <w:sz w:val="28"/>
+          <w:szCs w:val="28"/>
+        </w:rPr>
+      </w:pPr>
+    </w:p>
+    <w:p>
+      <w:pPr>
+        <w:spacing w:after="60"/>
+        <w:jc w:val="both"/>
+        <w:rPr>
+          <w:rFonts w:asciiTheme="majorBidi" w:hAnsiTheme="majorBidi" w:cstheme="majorBidi"/>
+          <w:sz w:val="28"/>
+          <w:szCs w:val="28"/>
+        </w:rPr>
+      </w:pPr>
+    </w:p>
+    <w:p>
+      <w:pPr>
+        <w:spacing w:after="60"/>
+        <w:jc w:val="both"/>
+        <w:rPr>
+          <w:rFonts w:asciiTheme="majorBidi" w:hAnsiTheme="majorBidi" w:cstheme="majorBidi"/>
+          <w:sz w:val="36"/>
+          <w:szCs w:val="36"/>
+        </w:rPr>
+      </w:pPr>
+    </w:p>
+    <w:p>
+      <w:pPr>
+        <w:spacing w:after="60"/>
+        <w:jc w:val="both"/>
+        <w:rPr>
+          <w:rFonts w:asciiTheme="majorBidi" w:hAnsiTheme="majorBidi" w:cstheme="majorBidi"/>
+          <w:b/>
+          <w:bCs/>
+          <w:sz w:val="32"/>
+          <w:szCs w:val="32"/>
+        </w:rPr>
+      </w:pPr>
+      <w:r>
+        <w:rPr>
+          <w:rFonts w:asciiTheme="majorBidi" w:hAnsiTheme="majorBidi" w:cstheme="majorBidi"/>
+          <w:b/>
+          <w:bCs/>
+          <w:sz w:val="32"/>
+          <w:szCs w:val="32"/>
+        </w:rPr>
+        <w:t xml:space="preserve">Desired State - </w:t>
+      </w:r>
+      <w:r>
+        <w:rPr>
+          <w:rFonts w:asciiTheme="majorBidi" w:hAnsiTheme="majorBidi" w:cstheme="majorBidi"/>
+          <w:b/>
+          <w:bCs/>
+          <w:sz w:val="32"/>
+          <w:szCs w:val="32"/>
+        </w:rPr>
+        <w:t>Kubernetes Core Idea</w:t>
+      </w:r>
+      <w:r>
+        <w:rPr>
+          <w:rFonts w:asciiTheme="majorBidi" w:hAnsiTheme="majorBidi" w:cstheme="majorBidi"/>
+          <w:b/>
+          <w:bCs/>
+          <w:sz w:val="32"/>
+          <w:szCs w:val="32"/>
+        </w:rPr>
         <w:t>:</w:t>
       </w:r>
     </w:p>
@@ -2926,6 +5197,7 @@
           <w:sz w:val="28"/>
           <w:szCs w:val="28"/>
         </w:rPr>
+        <w:lastRenderedPageBreak/>
         <w:t>run 3 replicas of an API container</w:t>
       </w:r>
       <w:r>
@@ -3066,7 +5338,6 @@
           <w:sz w:val="28"/>
           <w:szCs w:val="28"/>
         </w:rPr>
-        <w:lastRenderedPageBreak/>
         <w:t>Pods</w:t>
       </w:r>
     </w:p>
@@ -3222,7 +5493,7 @@
 </file>
 
 <file path=word/numbering.xml><?xml version="1.0" encoding="utf-8"?>
-<w:numbering xmlns:wpc="http://schemas.microsoft.com/office/word/2010/wordprocessingCanvas" xmlns:cx="http://schemas.microsoft.com/office/drawing/2014/chartex" xmlns:cx1="http://schemas.microsoft.com/office/drawing/2015/9/8/chartex" xmlns:cx2="http://schemas.microsoft.com/office/drawing/2015/10/21/chartex" xmlns:cx3="http://schemas.microsoft.com/office/drawing/2016/5/9/chartex" xmlns:cx4="http://schemas.microsoft.com/office/drawing/2016/5/10/chartex" xmlns:cx5="http://schemas.microsoft.com/office/drawing/2016/5/11/chartex" xmlns:cx6="http://schemas.microsoft.com/office/drawing/2016/5/12/chartex" xmlns:cx7="http://schemas.microsoft.com/office/drawing/2016/5/13/chartex" xmlns:cx8="http://schemas.microsoft.com/office/drawing/2016/5/14/chartex" xmlns:mc="http://schemas.openxmlformats.org/markup-compatibility/2006" xmlns:aink="http://schemas.microsoft.com/office/drawing/2016/ink" xmlns:am3d="http://schemas.microsoft.com/office/drawing/2017/model3d" xmlns:o="urn:schemas-microsoft-com:office:office" xmlns:oel="http://schemas.microsoft.com/office/2019/extlst" xmlns:r="http://schemas.openxmlformats.org/officeDocument/2006/relationships" xmlns:m="http://schemas.openxmlformats.org/officeDocument/2006/math" xmlns:v="urn:schemas-microsoft-com:vml" xmlns:wp14="http://schemas.microsoft.com/office/word/2010/wordprocessingDrawing" xmlns:wp="http://schemas.openxmlformats.org/drawingml/2006/wordprocessingDrawing" xmlns:w10="urn:schemas-microsoft-com:office:word" xmlns:w="http://schemas.openxmlformats.org/wordprocessingml/2006/main" xmlns:w14="http://schemas.microsoft.com/office/word/2010/wordml" xmlns:w15="http://schemas.microsoft.com/office/word/2012/wordml" xmlns:w16cex="http://schemas.microsoft.com/office/word/2018/wordml/cex" xmlns:w16cid="http://schemas.microsoft.com/office/word/2016/wordml/cid" xmlns:w16="http://schemas.microsoft.com/office/word/2018/wordml" xmlns:w16sdtdh="http://schemas.microsoft.com/office/word/2020/wordml/sdtdatahash" xmlns:w16se="http://schemas.microsoft.com/office/word/2015/wordml/symex" xmlns:wpg="http://schemas.microsoft.com/office/word/2010/wordprocessingGroup" xmlns:wpi="http://schemas.microsoft.com/office/word/2010/wordprocessingInk" xmlns:wne="http://schemas.microsoft.com/office/word/2006/wordml" xmlns:wps="http://schemas.microsoft.com/office/word/2010/wordprocessingShape" mc:Ignorable="w14 w15 w16se w16cid w16 w16cex w16sdtdh wp14">
+<w:numbering xmlns:wpc="http://schemas.microsoft.com/office/word/2010/wordprocessingCanvas" xmlns:cx="http://schemas.microsoft.com/office/drawing/2014/chartex" xmlns:cx1="http://schemas.microsoft.com/office/drawing/2015/9/8/chartex" xmlns:cx2="http://schemas.microsoft.com/office/drawing/2015/10/21/chartex" xmlns:cx3="http://schemas.microsoft.com/office/drawing/2016/5/9/chartex" xmlns:cx4="http://schemas.microsoft.com/office/drawing/2016/5/10/chartex" xmlns:cx5="http://schemas.microsoft.com/office/drawing/2016/5/11/chartex" xmlns:cx6="http://schemas.microsoft.com/office/drawing/2016/5/12/chartex" xmlns:cx7="http://schemas.microsoft.com/office/drawing/2016/5/13/chartex" xmlns:cx8="http://schemas.microsoft.com/office/drawing/2016/5/14/chartex" xmlns:mc="http://schemas.openxmlformats.org/markup-compatibility/2006" xmlns:aink="http://schemas.microsoft.com/office/drawing/2016/ink" xmlns:am3d="http://schemas.microsoft.com/office/drawing/2017/model3d" xmlns:o="urn:schemas-microsoft-com:office:office" xmlns:oel="http://schemas.microsoft.com/office/2019/extlst" xmlns:r="http://schemas.openxmlformats.org/officeDocument/2006/relationships" xmlns:m="http://schemas.openxmlformats.org/officeDocument/2006/math" xmlns:v="urn:schemas-microsoft-com:vml" xmlns:wp14="http://schemas.microsoft.com/office/word/2010/wordprocessingDrawing" xmlns:wp="http://schemas.openxmlformats.org/drawingml/2006/wordprocessingDrawing" xmlns:w10="urn:schemas-microsoft-com:office:word" xmlns:w="http://schemas.openxmlformats.org/wordprocessingml/2006/main" xmlns:w14="http://schemas.microsoft.com/office/word/2010/wordml" xmlns:w15="http://schemas.microsoft.com/office/word/2012/wordml" xmlns:w16cex="http://schemas.microsoft.com/office/word/2018/wordml/cex" xmlns:w16cid="http://schemas.microsoft.com/office/word/2016/wordml/cid" xmlns:w16="http://schemas.microsoft.com/office/word/2018/wordml" xmlns:w16du="http://schemas.microsoft.com/office/word/2023/wordml/word16du" xmlns:w16sdtdh="http://schemas.microsoft.com/office/word/2020/wordml/sdtdatahash" xmlns:w16sdtfl="http://schemas.microsoft.com/office/word/2024/wordml/sdtformatlock" xmlns:w16se="http://schemas.microsoft.com/office/word/2015/wordml/symex" xmlns:wpg="http://schemas.microsoft.com/office/word/2010/wordprocessingGroup" xmlns:wpi="http://schemas.microsoft.com/office/word/2010/wordprocessingInk" xmlns:wne="http://schemas.microsoft.com/office/word/2006/wordml" xmlns:wps="http://schemas.microsoft.com/office/word/2010/wordprocessingShape" mc:Ignorable="w14 w15 w16se w16cid w16 w16cex w16sdtdh w16sdtfl w16du wp14">
   <w:abstractNum w:abstractNumId="0" w15:restartNumberingAfterBreak="0">
     <w:nsid w:val="0D7E4292"/>
     <w:multiLevelType w:val="hybridMultilevel"/>
@@ -3423,6 +5694,119 @@
     </w:lvl>
   </w:abstractNum>
   <w:abstractNum w:abstractNumId="2" w15:restartNumberingAfterBreak="0">
+    <w:nsid w:val="279D64C1"/>
+    <w:multiLevelType w:val="hybridMultilevel"/>
+    <w:tmpl w:val="E9FE7A88"/>
+    <w:lvl w:ilvl="0" w:tplc="04090001">
+      <w:start w:val="1"/>
+      <w:numFmt w:val="bullet"/>
+      <w:lvlText w:val=""/>
+      <w:lvlJc w:val="left"/>
+      <w:pPr>
+        <w:ind w:left="720" w:hanging="360"/>
+      </w:pPr>
+      <w:rPr>
+        <w:rFonts w:ascii="Symbol" w:hAnsi="Symbol" w:hint="default"/>
+      </w:rPr>
+    </w:lvl>
+    <w:lvl w:ilvl="1" w:tplc="04090003" w:tentative="1">
+      <w:start w:val="1"/>
+      <w:numFmt w:val="bullet"/>
+      <w:lvlText w:val="o"/>
+      <w:lvlJc w:val="left"/>
+      <w:pPr>
+        <w:ind w:left="1440" w:hanging="360"/>
+      </w:pPr>
+      <w:rPr>
+        <w:rFonts w:ascii="Courier New" w:hAnsi="Courier New" w:cs="Courier New" w:hint="default"/>
+      </w:rPr>
+    </w:lvl>
+    <w:lvl w:ilvl="2" w:tplc="04090005" w:tentative="1">
+      <w:start w:val="1"/>
+      <w:numFmt w:val="bullet"/>
+      <w:lvlText w:val=""/>
+      <w:lvlJc w:val="left"/>
+      <w:pPr>
+        <w:ind w:left="2160" w:hanging="360"/>
+      </w:pPr>
+      <w:rPr>
+        <w:rFonts w:ascii="Wingdings" w:hAnsi="Wingdings" w:hint="default"/>
+      </w:rPr>
+    </w:lvl>
+    <w:lvl w:ilvl="3" w:tplc="04090001" w:tentative="1">
+      <w:start w:val="1"/>
+      <w:numFmt w:val="bullet"/>
+      <w:lvlText w:val=""/>
+      <w:lvlJc w:val="left"/>
+      <w:pPr>
+        <w:ind w:left="2880" w:hanging="360"/>
+      </w:pPr>
+      <w:rPr>
+        <w:rFonts w:ascii="Symbol" w:hAnsi="Symbol" w:hint="default"/>
+      </w:rPr>
+    </w:lvl>
+    <w:lvl w:ilvl="4" w:tplc="04090003" w:tentative="1">
+      <w:start w:val="1"/>
+      <w:numFmt w:val="bullet"/>
+      <w:lvlText w:val="o"/>
+      <w:lvlJc w:val="left"/>
+      <w:pPr>
+        <w:ind w:left="3600" w:hanging="360"/>
+      </w:pPr>
+      <w:rPr>
+        <w:rFonts w:ascii="Courier New" w:hAnsi="Courier New" w:cs="Courier New" w:hint="default"/>
+      </w:rPr>
+    </w:lvl>
+    <w:lvl w:ilvl="5" w:tplc="04090005" w:tentative="1">
+      <w:start w:val="1"/>
+      <w:numFmt w:val="bullet"/>
+      <w:lvlText w:val=""/>
+      <w:lvlJc w:val="left"/>
+      <w:pPr>
+        <w:ind w:left="4320" w:hanging="360"/>
+      </w:pPr>
+      <w:rPr>
+        <w:rFonts w:ascii="Wingdings" w:hAnsi="Wingdings" w:hint="default"/>
+      </w:rPr>
+    </w:lvl>
+    <w:lvl w:ilvl="6" w:tplc="04090001" w:tentative="1">
+      <w:start w:val="1"/>
+      <w:numFmt w:val="bullet"/>
+      <w:lvlText w:val=""/>
+      <w:lvlJc w:val="left"/>
+      <w:pPr>
+        <w:ind w:left="5040" w:hanging="360"/>
+      </w:pPr>
+      <w:rPr>
+        <w:rFonts w:ascii="Symbol" w:hAnsi="Symbol" w:hint="default"/>
+      </w:rPr>
+    </w:lvl>
+    <w:lvl w:ilvl="7" w:tplc="04090003" w:tentative="1">
+      <w:start w:val="1"/>
+      <w:numFmt w:val="bullet"/>
+      <w:lvlText w:val="o"/>
+      <w:lvlJc w:val="left"/>
+      <w:pPr>
+        <w:ind w:left="5760" w:hanging="360"/>
+      </w:pPr>
+      <w:rPr>
+        <w:rFonts w:ascii="Courier New" w:hAnsi="Courier New" w:cs="Courier New" w:hint="default"/>
+      </w:rPr>
+    </w:lvl>
+    <w:lvl w:ilvl="8" w:tplc="04090005" w:tentative="1">
+      <w:start w:val="1"/>
+      <w:numFmt w:val="bullet"/>
+      <w:lvlText w:val=""/>
+      <w:lvlJc w:val="left"/>
+      <w:pPr>
+        <w:ind w:left="6480" w:hanging="360"/>
+      </w:pPr>
+      <w:rPr>
+        <w:rFonts w:ascii="Wingdings" w:hAnsi="Wingdings" w:hint="default"/>
+      </w:rPr>
+    </w:lvl>
+  </w:abstractNum>
+  <w:abstractNum w:abstractNumId="3" w15:restartNumberingAfterBreak="0">
     <w:nsid w:val="30736A46"/>
     <w:multiLevelType w:val="hybridMultilevel"/>
     <w:tmpl w:val="82D6D2BC"/>
@@ -3535,7 +5919,7 @@
       </w:rPr>
     </w:lvl>
   </w:abstractNum>
-  <w:abstractNum w:abstractNumId="3" w15:restartNumberingAfterBreak="0">
+  <w:abstractNum w:abstractNumId="4" w15:restartNumberingAfterBreak="0">
     <w:nsid w:val="375A2993"/>
     <w:multiLevelType w:val="hybridMultilevel"/>
     <w:tmpl w:val="E398E080"/>
@@ -3621,7 +6005,7 @@
       </w:pPr>
     </w:lvl>
   </w:abstractNum>
-  <w:abstractNum w:abstractNumId="4" w15:restartNumberingAfterBreak="0">
+  <w:abstractNum w:abstractNumId="5" w15:restartNumberingAfterBreak="0">
     <w:nsid w:val="4D71373A"/>
     <w:multiLevelType w:val="hybridMultilevel"/>
     <w:tmpl w:val="EEEC7D66"/>
@@ -3734,7 +6118,120 @@
       </w:rPr>
     </w:lvl>
   </w:abstractNum>
-  <w:abstractNum w:abstractNumId="5" w15:restartNumberingAfterBreak="0">
+  <w:abstractNum w:abstractNumId="6" w15:restartNumberingAfterBreak="0">
+    <w:nsid w:val="4DD40AA0"/>
+    <w:multiLevelType w:val="hybridMultilevel"/>
+    <w:tmpl w:val="94D07F6C"/>
+    <w:lvl w:ilvl="0" w:tplc="04090001">
+      <w:start w:val="1"/>
+      <w:numFmt w:val="bullet"/>
+      <w:lvlText w:val=""/>
+      <w:lvlJc w:val="left"/>
+      <w:pPr>
+        <w:ind w:left="720" w:hanging="360"/>
+      </w:pPr>
+      <w:rPr>
+        <w:rFonts w:ascii="Symbol" w:hAnsi="Symbol" w:hint="default"/>
+      </w:rPr>
+    </w:lvl>
+    <w:lvl w:ilvl="1" w:tplc="04090003" w:tentative="1">
+      <w:start w:val="1"/>
+      <w:numFmt w:val="bullet"/>
+      <w:lvlText w:val="o"/>
+      <w:lvlJc w:val="left"/>
+      <w:pPr>
+        <w:ind w:left="1440" w:hanging="360"/>
+      </w:pPr>
+      <w:rPr>
+        <w:rFonts w:ascii="Courier New" w:hAnsi="Courier New" w:cs="Courier New" w:hint="default"/>
+      </w:rPr>
+    </w:lvl>
+    <w:lvl w:ilvl="2" w:tplc="04090005" w:tentative="1">
+      <w:start w:val="1"/>
+      <w:numFmt w:val="bullet"/>
+      <w:lvlText w:val=""/>
+      <w:lvlJc w:val="left"/>
+      <w:pPr>
+        <w:ind w:left="2160" w:hanging="360"/>
+      </w:pPr>
+      <w:rPr>
+        <w:rFonts w:ascii="Wingdings" w:hAnsi="Wingdings" w:hint="default"/>
+      </w:rPr>
+    </w:lvl>
+    <w:lvl w:ilvl="3" w:tplc="04090001" w:tentative="1">
+      <w:start w:val="1"/>
+      <w:numFmt w:val="bullet"/>
+      <w:lvlText w:val=""/>
+      <w:lvlJc w:val="left"/>
+      <w:pPr>
+        <w:ind w:left="2880" w:hanging="360"/>
+      </w:pPr>
+      <w:rPr>
+        <w:rFonts w:ascii="Symbol" w:hAnsi="Symbol" w:hint="default"/>
+      </w:rPr>
+    </w:lvl>
+    <w:lvl w:ilvl="4" w:tplc="04090003" w:tentative="1">
+      <w:start w:val="1"/>
+      <w:numFmt w:val="bullet"/>
+      <w:lvlText w:val="o"/>
+      <w:lvlJc w:val="left"/>
+      <w:pPr>
+        <w:ind w:left="3600" w:hanging="360"/>
+      </w:pPr>
+      <w:rPr>
+        <w:rFonts w:ascii="Courier New" w:hAnsi="Courier New" w:cs="Courier New" w:hint="default"/>
+      </w:rPr>
+    </w:lvl>
+    <w:lvl w:ilvl="5" w:tplc="04090005" w:tentative="1">
+      <w:start w:val="1"/>
+      <w:numFmt w:val="bullet"/>
+      <w:lvlText w:val=""/>
+      <w:lvlJc w:val="left"/>
+      <w:pPr>
+        <w:ind w:left="4320" w:hanging="360"/>
+      </w:pPr>
+      <w:rPr>
+        <w:rFonts w:ascii="Wingdings" w:hAnsi="Wingdings" w:hint="default"/>
+      </w:rPr>
+    </w:lvl>
+    <w:lvl w:ilvl="6" w:tplc="04090001" w:tentative="1">
+      <w:start w:val="1"/>
+      <w:numFmt w:val="bullet"/>
+      <w:lvlText w:val=""/>
+      <w:lvlJc w:val="left"/>
+      <w:pPr>
+        <w:ind w:left="5040" w:hanging="360"/>
+      </w:pPr>
+      <w:rPr>
+        <w:rFonts w:ascii="Symbol" w:hAnsi="Symbol" w:hint="default"/>
+      </w:rPr>
+    </w:lvl>
+    <w:lvl w:ilvl="7" w:tplc="04090003" w:tentative="1">
+      <w:start w:val="1"/>
+      <w:numFmt w:val="bullet"/>
+      <w:lvlText w:val="o"/>
+      <w:lvlJc w:val="left"/>
+      <w:pPr>
+        <w:ind w:left="5760" w:hanging="360"/>
+      </w:pPr>
+      <w:rPr>
+        <w:rFonts w:ascii="Courier New" w:hAnsi="Courier New" w:cs="Courier New" w:hint="default"/>
+      </w:rPr>
+    </w:lvl>
+    <w:lvl w:ilvl="8" w:tplc="04090005" w:tentative="1">
+      <w:start w:val="1"/>
+      <w:numFmt w:val="bullet"/>
+      <w:lvlText w:val=""/>
+      <w:lvlJc w:val="left"/>
+      <w:pPr>
+        <w:ind w:left="6480" w:hanging="360"/>
+      </w:pPr>
+      <w:rPr>
+        <w:rFonts w:ascii="Wingdings" w:hAnsi="Wingdings" w:hint="default"/>
+      </w:rPr>
+    </w:lvl>
+  </w:abstractNum>
+  <w:abstractNum w:abstractNumId="7" w15:restartNumberingAfterBreak="0">
     <w:nsid w:val="50132684"/>
     <w:multiLevelType w:val="hybridMultilevel"/>
     <w:tmpl w:val="A92EF532"/>
@@ -3847,7 +6344,120 @@
       </w:rPr>
     </w:lvl>
   </w:abstractNum>
-  <w:abstractNum w:abstractNumId="6" w15:restartNumberingAfterBreak="0">
+  <w:abstractNum w:abstractNumId="8" w15:restartNumberingAfterBreak="0">
+    <w:nsid w:val="51920C40"/>
+    <w:multiLevelType w:val="hybridMultilevel"/>
+    <w:tmpl w:val="4F642B5A"/>
+    <w:lvl w:ilvl="0" w:tplc="04090001">
+      <w:start w:val="1"/>
+      <w:numFmt w:val="bullet"/>
+      <w:lvlText w:val=""/>
+      <w:lvlJc w:val="left"/>
+      <w:pPr>
+        <w:ind w:left="720" w:hanging="360"/>
+      </w:pPr>
+      <w:rPr>
+        <w:rFonts w:ascii="Symbol" w:hAnsi="Symbol" w:hint="default"/>
+      </w:rPr>
+    </w:lvl>
+    <w:lvl w:ilvl="1" w:tplc="04090003" w:tentative="1">
+      <w:start w:val="1"/>
+      <w:numFmt w:val="bullet"/>
+      <w:lvlText w:val="o"/>
+      <w:lvlJc w:val="left"/>
+      <w:pPr>
+        <w:ind w:left="1440" w:hanging="360"/>
+      </w:pPr>
+      <w:rPr>
+        <w:rFonts w:ascii="Courier New" w:hAnsi="Courier New" w:cs="Courier New" w:hint="default"/>
+      </w:rPr>
+    </w:lvl>
+    <w:lvl w:ilvl="2" w:tplc="04090005" w:tentative="1">
+      <w:start w:val="1"/>
+      <w:numFmt w:val="bullet"/>
+      <w:lvlText w:val=""/>
+      <w:lvlJc w:val="left"/>
+      <w:pPr>
+        <w:ind w:left="2160" w:hanging="360"/>
+      </w:pPr>
+      <w:rPr>
+        <w:rFonts w:ascii="Wingdings" w:hAnsi="Wingdings" w:hint="default"/>
+      </w:rPr>
+    </w:lvl>
+    <w:lvl w:ilvl="3" w:tplc="04090001" w:tentative="1">
+      <w:start w:val="1"/>
+      <w:numFmt w:val="bullet"/>
+      <w:lvlText w:val=""/>
+      <w:lvlJc w:val="left"/>
+      <w:pPr>
+        <w:ind w:left="2880" w:hanging="360"/>
+      </w:pPr>
+      <w:rPr>
+        <w:rFonts w:ascii="Symbol" w:hAnsi="Symbol" w:hint="default"/>
+      </w:rPr>
+    </w:lvl>
+    <w:lvl w:ilvl="4" w:tplc="04090003" w:tentative="1">
+      <w:start w:val="1"/>
+      <w:numFmt w:val="bullet"/>
+      <w:lvlText w:val="o"/>
+      <w:lvlJc w:val="left"/>
+      <w:pPr>
+        <w:ind w:left="3600" w:hanging="360"/>
+      </w:pPr>
+      <w:rPr>
+        <w:rFonts w:ascii="Courier New" w:hAnsi="Courier New" w:cs="Courier New" w:hint="default"/>
+      </w:rPr>
+    </w:lvl>
+    <w:lvl w:ilvl="5" w:tplc="04090005" w:tentative="1">
+      <w:start w:val="1"/>
+      <w:numFmt w:val="bullet"/>
+      <w:lvlText w:val=""/>
+      <w:lvlJc w:val="left"/>
+      <w:pPr>
+        <w:ind w:left="4320" w:hanging="360"/>
+      </w:pPr>
+      <w:rPr>
+        <w:rFonts w:ascii="Wingdings" w:hAnsi="Wingdings" w:hint="default"/>
+      </w:rPr>
+    </w:lvl>
+    <w:lvl w:ilvl="6" w:tplc="04090001" w:tentative="1">
+      <w:start w:val="1"/>
+      <w:numFmt w:val="bullet"/>
+      <w:lvlText w:val=""/>
+      <w:lvlJc w:val="left"/>
+      <w:pPr>
+        <w:ind w:left="5040" w:hanging="360"/>
+      </w:pPr>
+      <w:rPr>
+        <w:rFonts w:ascii="Symbol" w:hAnsi="Symbol" w:hint="default"/>
+      </w:rPr>
+    </w:lvl>
+    <w:lvl w:ilvl="7" w:tplc="04090003" w:tentative="1">
+      <w:start w:val="1"/>
+      <w:numFmt w:val="bullet"/>
+      <w:lvlText w:val="o"/>
+      <w:lvlJc w:val="left"/>
+      <w:pPr>
+        <w:ind w:left="5760" w:hanging="360"/>
+      </w:pPr>
+      <w:rPr>
+        <w:rFonts w:ascii="Courier New" w:hAnsi="Courier New" w:cs="Courier New" w:hint="default"/>
+      </w:rPr>
+    </w:lvl>
+    <w:lvl w:ilvl="8" w:tplc="04090005" w:tentative="1">
+      <w:start w:val="1"/>
+      <w:numFmt w:val="bullet"/>
+      <w:lvlText w:val=""/>
+      <w:lvlJc w:val="left"/>
+      <w:pPr>
+        <w:ind w:left="6480" w:hanging="360"/>
+      </w:pPr>
+      <w:rPr>
+        <w:rFonts w:ascii="Wingdings" w:hAnsi="Wingdings" w:hint="default"/>
+      </w:rPr>
+    </w:lvl>
+  </w:abstractNum>
+  <w:abstractNum w:abstractNumId="9" w15:restartNumberingAfterBreak="0">
     <w:nsid w:val="5FA16A4F"/>
     <w:multiLevelType w:val="hybridMultilevel"/>
     <w:tmpl w:val="3CA02610"/>
@@ -3960,7 +6570,7 @@
       </w:rPr>
     </w:lvl>
   </w:abstractNum>
-  <w:abstractNum w:abstractNumId="7" w15:restartNumberingAfterBreak="0">
+  <w:abstractNum w:abstractNumId="10" w15:restartNumberingAfterBreak="0">
     <w:nsid w:val="6EC549CB"/>
     <w:multiLevelType w:val="hybridMultilevel"/>
     <w:tmpl w:val="86E47FB4"/>
@@ -4074,34 +6684,43 @@
     </w:lvl>
   </w:abstractNum>
   <w:num w:numId="1" w16cid:durableId="96566128">
-    <w:abstractNumId w:val="4"/>
+    <w:abstractNumId w:val="5"/>
   </w:num>
   <w:num w:numId="2" w16cid:durableId="1593388682">
-    <w:abstractNumId w:val="2"/>
+    <w:abstractNumId w:val="3"/>
   </w:num>
   <w:num w:numId="3" w16cid:durableId="441650434">
-    <w:abstractNumId w:val="3"/>
+    <w:abstractNumId w:val="4"/>
   </w:num>
   <w:num w:numId="4" w16cid:durableId="1737700922">
     <w:abstractNumId w:val="0"/>
   </w:num>
   <w:num w:numId="5" w16cid:durableId="1029067819">
-    <w:abstractNumId w:val="5"/>
+    <w:abstractNumId w:val="7"/>
   </w:num>
   <w:num w:numId="6" w16cid:durableId="1602684571">
     <w:abstractNumId w:val="1"/>
   </w:num>
   <w:num w:numId="7" w16cid:durableId="1633245902">
-    <w:abstractNumId w:val="6"/>
+    <w:abstractNumId w:val="9"/>
   </w:num>
   <w:num w:numId="8" w16cid:durableId="953946689">
-    <w:abstractNumId w:val="7"/>
+    <w:abstractNumId w:val="10"/>
+  </w:num>
+  <w:num w:numId="9" w16cid:durableId="1996034767">
+    <w:abstractNumId w:val="8"/>
+  </w:num>
+  <w:num w:numId="10" w16cid:durableId="1418286409">
+    <w:abstractNumId w:val="2"/>
+  </w:num>
+  <w:num w:numId="11" w16cid:durableId="90592897">
+    <w:abstractNumId w:val="6"/>
   </w:num>
 </w:numbering>
 </file>
 
 <file path=word/styles.xml><?xml version="1.0" encoding="utf-8"?>
-<w:styles xmlns:mc="http://schemas.openxmlformats.org/markup-compatibility/2006" xmlns:r="http://schemas.openxmlformats.org/officeDocument/2006/relationships" xmlns:w="http://schemas.openxmlformats.org/wordprocessingml/2006/main" xmlns:w14="http://schemas.microsoft.com/office/word/2010/wordml" xmlns:w15="http://schemas.microsoft.com/office/word/2012/wordml" xmlns:w16cex="http://schemas.microsoft.com/office/word/2018/wordml/cex" xmlns:w16cid="http://schemas.microsoft.com/office/word/2016/wordml/cid" xmlns:w16="http://schemas.microsoft.com/office/word/2018/wordml" xmlns:w16sdtdh="http://schemas.microsoft.com/office/word/2020/wordml/sdtdatahash" xmlns:w16se="http://schemas.microsoft.com/office/word/2015/wordml/symex" mc:Ignorable="w14 w15 w16se w16cid w16 w16cex w16sdtdh">
+<w:styles xmlns:mc="http://schemas.openxmlformats.org/markup-compatibility/2006" xmlns:r="http://schemas.openxmlformats.org/officeDocument/2006/relationships" xmlns:w="http://schemas.openxmlformats.org/wordprocessingml/2006/main" xmlns:w14="http://schemas.microsoft.com/office/word/2010/wordml" xmlns:w15="http://schemas.microsoft.com/office/word/2012/wordml" xmlns:w16cex="http://schemas.microsoft.com/office/word/2018/wordml/cex" xmlns:w16cid="http://schemas.microsoft.com/office/word/2016/wordml/cid" xmlns:w16="http://schemas.microsoft.com/office/word/2018/wordml" xmlns:w16du="http://schemas.microsoft.com/office/word/2023/wordml/word16du" xmlns:w16sdtdh="http://schemas.microsoft.com/office/word/2020/wordml/sdtdatahash" xmlns:w16sdtfl="http://schemas.microsoft.com/office/word/2024/wordml/sdtformatlock" xmlns:w16se="http://schemas.microsoft.com/office/word/2015/wordml/symex" mc:Ignorable="w14 w15 w16se w16cid w16 w16cex w16sdtdh w16sdtfl w16du">
   <w:docDefaults>
     <w:rPrDefault>
       <w:rPr>

</xml_diff>

<commit_message>
kubernetes - instro updated
</commit_message>
<xml_diff>
--- a/Kubernetes/1-intro.docx
+++ b/Kubernetes/1-intro.docx
@@ -2892,7 +2892,7 @@
                           </w:p>
                           <w:p>
                             <w:pPr>
-                              <w:spacing w:after="60"/>
+                              <w:spacing w:after="40"/>
                               <w:jc w:val="both"/>
                               <w:rPr>
                                 <w:rFonts w:asciiTheme="majorBidi" w:hAnsiTheme="majorBidi" w:cstheme="majorBidi"/>
@@ -3036,7 +3036,7 @@
                     </w:p>
                     <w:p>
                       <w:pPr>
-                        <w:spacing w:after="60"/>
+                        <w:spacing w:after="40"/>
                         <w:jc w:val="both"/>
                         <w:rPr>
                           <w:rFonts w:asciiTheme="majorBidi" w:hAnsiTheme="majorBidi" w:cstheme="majorBidi"/>
@@ -3409,23 +3409,7 @@
                                 <w:sz w:val="28"/>
                                 <w:szCs w:val="28"/>
                               </w:rPr>
-                              <w:t>Node 1 →</w:t>
-                            </w:r>
-                            <w:r>
-                              <w:rPr>
-                                <w:rFonts w:asciiTheme="majorBidi" w:hAnsiTheme="majorBidi" w:cstheme="majorBidi"/>
-                                <w:sz w:val="28"/>
-                                <w:szCs w:val="28"/>
-                              </w:rPr>
-                              <w:t xml:space="preserve"> </w:t>
-                            </w:r>
-                            <w:r>
-                              <w:rPr>
-                                <w:rFonts w:asciiTheme="majorBidi" w:hAnsiTheme="majorBidi" w:cstheme="majorBidi"/>
-                                <w:sz w:val="28"/>
-                                <w:szCs w:val="28"/>
-                              </w:rPr>
-                              <w:t>Instance A</w:t>
+                              <w:t>Node 1 → Instance A</w:t>
                             </w:r>
                           </w:p>
                           <w:p>

</xml_diff>